<commit_message>
Addressed the suggested review concerns
</commit_message>
<xml_diff>
--- a/Evidence/69135_TempData_Streaming_SessionStorage_Validation_Test_Report.docx
+++ b/Evidence/69135_TempData_Streaming_SessionStorage_Validation_Test_Report.docx
@@ -212,21 +212,7 @@
             <w:rStyle w:val="Hyperlink"/>
             <w:rFonts w:ascii="Arial" w:hAnsi="Arial" w:cs="Arial"/>
           </w:rPr>
-          <w:t>https://github.com/vendasankarsf3945/69135-TempData-Streaming-Valid</w:t>
-        </w:r>
-        <w:r>
-          <w:rPr>
-            <w:rStyle w:val="Hyperlink"/>
-            <w:rFonts w:ascii="Arial" w:hAnsi="Arial" w:cs="Arial"/>
-          </w:rPr>
-          <w:t>a</w:t>
-        </w:r>
-        <w:r>
-          <w:rPr>
-            <w:rStyle w:val="Hyperlink"/>
-            <w:rFonts w:ascii="Arial" w:hAnsi="Arial" w:cs="Arial"/>
-          </w:rPr>
-          <w:t>tion</w:t>
+          <w:t>https://github.com/vendasankarsf3945/69135-TempData-Streaming-Validation</w:t>
         </w:r>
       </w:hyperlink>
     </w:p>
@@ -269,6 +255,2478 @@
           <w:szCs w:val="28"/>
         </w:rPr>
         <w:t>Checks</w:t>
+      </w:r>
+    </w:p>
+    <w:tbl>
+      <w:tblPr>
+        <w:tblW w:w="9700" w:type="dxa"/>
+        <w:tblBorders>
+          <w:top w:val="single" w:sz="8" w:space="0" w:color="A3A3A3"/>
+          <w:left w:val="single" w:sz="8" w:space="0" w:color="A3A3A3"/>
+          <w:bottom w:val="single" w:sz="8" w:space="0" w:color="A3A3A3"/>
+          <w:right w:val="single" w:sz="8" w:space="0" w:color="A3A3A3"/>
+        </w:tblBorders>
+        <w:tblLayout w:type="fixed"/>
+        <w:tblCellMar>
+          <w:left w:w="0" w:type="dxa"/>
+          <w:right w:w="0" w:type="dxa"/>
+        </w:tblCellMar>
+        <w:tblLook w:val="04A0" w:firstRow="1" w:lastRow="0" w:firstColumn="1" w:lastColumn="0" w:noHBand="0" w:noVBand="1"/>
+        <w:tblCaption w:val=""/>
+        <w:tblDescription w:val=""/>
+      </w:tblPr>
+      <w:tblGrid>
+        <w:gridCol w:w="686"/>
+        <w:gridCol w:w="3894"/>
+        <w:gridCol w:w="990"/>
+        <w:gridCol w:w="4130"/>
+      </w:tblGrid>
+      <w:tr>
+        <w:tc>
+          <w:tcPr>
+            <w:tcW w:w="686" w:type="dxa"/>
+            <w:tcBorders>
+              <w:top w:val="single" w:sz="8" w:space="0" w:color="A3A3A3"/>
+              <w:left w:val="single" w:sz="8" w:space="0" w:color="A3A3A3"/>
+              <w:bottom w:val="single" w:sz="8" w:space="0" w:color="A3A3A3"/>
+              <w:right w:val="single" w:sz="8" w:space="0" w:color="A3A3A3"/>
+            </w:tcBorders>
+            <w:shd w:val="clear" w:color="auto" w:fill="F5F5F5"/>
+            <w:tcMar>
+              <w:top w:w="80" w:type="dxa"/>
+              <w:left w:w="80" w:type="dxa"/>
+              <w:bottom w:w="80" w:type="dxa"/>
+              <w:right w:w="80" w:type="dxa"/>
+            </w:tcMar>
+            <w:hideMark/>
+          </w:tcPr>
+          <w:p>
+            <w:proofErr w:type="spellStart"/>
+            <w:proofErr w:type="gramStart"/>
+            <w:r>
+              <w:rPr>
+                <w:b/>
+                <w:bCs/>
+              </w:rPr>
+              <w:t>S.No</w:t>
+            </w:r>
+            <w:proofErr w:type="spellEnd"/>
+            <w:proofErr w:type="gramEnd"/>
+          </w:p>
+        </w:tc>
+        <w:tc>
+          <w:tcPr>
+            <w:tcW w:w="3894" w:type="dxa"/>
+            <w:tcBorders>
+              <w:top w:val="single" w:sz="8" w:space="0" w:color="A3A3A3"/>
+              <w:left w:val="single" w:sz="8" w:space="0" w:color="A3A3A3"/>
+              <w:bottom w:val="single" w:sz="8" w:space="0" w:color="A3A3A3"/>
+              <w:right w:val="single" w:sz="8" w:space="0" w:color="A3A3A3"/>
+            </w:tcBorders>
+            <w:shd w:val="clear" w:color="auto" w:fill="F5F5F5"/>
+            <w:tcMar>
+              <w:top w:w="80" w:type="dxa"/>
+              <w:left w:w="80" w:type="dxa"/>
+              <w:bottom w:w="80" w:type="dxa"/>
+              <w:right w:w="80" w:type="dxa"/>
+            </w:tcMar>
+            <w:hideMark/>
+          </w:tcPr>
+          <w:p>
+            <w:r>
+              <w:rPr>
+                <w:b/>
+                <w:bCs/>
+              </w:rPr>
+              <w:t>Scenario</w:t>
+            </w:r>
+          </w:p>
+        </w:tc>
+        <w:tc>
+          <w:tcPr>
+            <w:tcW w:w="990" w:type="dxa"/>
+            <w:tcBorders>
+              <w:top w:val="single" w:sz="8" w:space="0" w:color="A3A3A3"/>
+              <w:left w:val="single" w:sz="8" w:space="0" w:color="A3A3A3"/>
+              <w:bottom w:val="single" w:sz="8" w:space="0" w:color="A3A3A3"/>
+              <w:right w:val="single" w:sz="8" w:space="0" w:color="A3A3A3"/>
+            </w:tcBorders>
+            <w:shd w:val="clear" w:color="auto" w:fill="F5F5F5"/>
+            <w:tcMar>
+              <w:top w:w="80" w:type="dxa"/>
+              <w:left w:w="80" w:type="dxa"/>
+              <w:bottom w:w="80" w:type="dxa"/>
+              <w:right w:w="80" w:type="dxa"/>
+            </w:tcMar>
+            <w:hideMark/>
+          </w:tcPr>
+          <w:p>
+            <w:r>
+              <w:rPr>
+                <w:b/>
+                <w:bCs/>
+              </w:rPr>
+              <w:t>Result</w:t>
+            </w:r>
+          </w:p>
+        </w:tc>
+        <w:tc>
+          <w:tcPr>
+            <w:tcW w:w="4130" w:type="dxa"/>
+            <w:tcBorders>
+              <w:top w:val="single" w:sz="8" w:space="0" w:color="A3A3A3"/>
+              <w:left w:val="single" w:sz="8" w:space="0" w:color="A3A3A3"/>
+              <w:bottom w:val="single" w:sz="8" w:space="0" w:color="A3A3A3"/>
+              <w:right w:val="single" w:sz="8" w:space="0" w:color="A3A3A3"/>
+            </w:tcBorders>
+            <w:shd w:val="clear" w:color="auto" w:fill="F5F5F5"/>
+            <w:tcMar>
+              <w:top w:w="80" w:type="dxa"/>
+              <w:left w:w="80" w:type="dxa"/>
+              <w:bottom w:w="80" w:type="dxa"/>
+              <w:right w:w="80" w:type="dxa"/>
+            </w:tcMar>
+            <w:hideMark/>
+          </w:tcPr>
+          <w:p>
+            <w:r>
+              <w:rPr>
+                <w:b/>
+                <w:bCs/>
+              </w:rPr>
+              <w:t>Evidence</w:t>
+            </w:r>
+          </w:p>
+        </w:tc>
+      </w:tr>
+      <w:tr>
+        <w:tc>
+          <w:tcPr>
+            <w:tcW w:w="686" w:type="dxa"/>
+            <w:tcBorders>
+              <w:top w:val="single" w:sz="8" w:space="0" w:color="A3A3A3"/>
+              <w:left w:val="single" w:sz="8" w:space="0" w:color="A3A3A3"/>
+              <w:bottom w:val="single" w:sz="8" w:space="0" w:color="A3A3A3"/>
+              <w:right w:val="single" w:sz="8" w:space="0" w:color="A3A3A3"/>
+            </w:tcBorders>
+            <w:tcMar>
+              <w:top w:w="80" w:type="dxa"/>
+              <w:left w:w="80" w:type="dxa"/>
+              <w:bottom w:w="80" w:type="dxa"/>
+              <w:right w:w="80" w:type="dxa"/>
+            </w:tcMar>
+            <w:hideMark/>
+          </w:tcPr>
+          <w:p>
+            <w:r>
+              <w:t>01</w:t>
+            </w:r>
+          </w:p>
+        </w:tc>
+        <w:tc>
+          <w:tcPr>
+            <w:tcW w:w="3894" w:type="dxa"/>
+            <w:tcBorders>
+              <w:top w:val="single" w:sz="8" w:space="0" w:color="A3A3A3"/>
+              <w:left w:val="single" w:sz="8" w:space="0" w:color="A3A3A3"/>
+              <w:bottom w:val="single" w:sz="8" w:space="0" w:color="A3A3A3"/>
+              <w:right w:val="single" w:sz="8" w:space="0" w:color="A3A3A3"/>
+            </w:tcBorders>
+            <w:tcMar>
+              <w:top w:w="80" w:type="dxa"/>
+              <w:left w:w="80" w:type="dxa"/>
+              <w:bottom w:w="80" w:type="dxa"/>
+              <w:right w:w="80" w:type="dxa"/>
+            </w:tcMar>
+            <w:hideMark/>
+          </w:tcPr>
+          <w:p>
+            <w:r>
+              <w:t xml:space="preserve">Cookie-backed </w:t>
+            </w:r>
+            <w:proofErr w:type="spellStart"/>
+            <w:r>
+              <w:t>TempData</w:t>
+            </w:r>
+            <w:proofErr w:type="spellEnd"/>
+            <w:r>
+              <w:t xml:space="preserve"> written after streaming response starts </w:t>
+            </w:r>
+            <w:proofErr w:type="gramStart"/>
+            <w:r>
+              <w:t>isn't persisted</w:t>
+            </w:r>
+            <w:proofErr w:type="gramEnd"/>
+            <w:r>
+              <w:t>, and the runtime warning recommends session storage</w:t>
+            </w:r>
+          </w:p>
+        </w:tc>
+        <w:tc>
+          <w:tcPr>
+            <w:tcW w:w="990" w:type="dxa"/>
+            <w:tcBorders>
+              <w:top w:val="single" w:sz="8" w:space="0" w:color="A3A3A3"/>
+              <w:left w:val="single" w:sz="8" w:space="0" w:color="A3A3A3"/>
+              <w:bottom w:val="single" w:sz="8" w:space="0" w:color="A3A3A3"/>
+              <w:right w:val="single" w:sz="8" w:space="0" w:color="A3A3A3"/>
+            </w:tcBorders>
+            <w:tcMar>
+              <w:top w:w="80" w:type="dxa"/>
+              <w:left w:w="80" w:type="dxa"/>
+              <w:bottom w:w="80" w:type="dxa"/>
+              <w:right w:w="80" w:type="dxa"/>
+            </w:tcMar>
+            <w:hideMark/>
+          </w:tcPr>
+          <w:p>
+            <w:r>
+              <w:t>Pass</w:t>
+            </w:r>
+          </w:p>
+        </w:tc>
+        <w:tc>
+          <w:tcPr>
+            <w:tcW w:w="4130" w:type="dxa"/>
+            <w:tcBorders>
+              <w:top w:val="single" w:sz="8" w:space="0" w:color="A3A3A3"/>
+              <w:left w:val="single" w:sz="8" w:space="0" w:color="A3A3A3"/>
+              <w:bottom w:val="single" w:sz="8" w:space="0" w:color="A3A3A3"/>
+              <w:right w:val="single" w:sz="8" w:space="0" w:color="A3A3A3"/>
+            </w:tcBorders>
+            <w:tcMar>
+              <w:top w:w="80" w:type="dxa"/>
+              <w:left w:w="80" w:type="dxa"/>
+              <w:bottom w:w="80" w:type="dxa"/>
+              <w:right w:w="80" w:type="dxa"/>
+            </w:tcMar>
+            <w:hideMark/>
+          </w:tcPr>
+          <w:p>
+            <w:hyperlink r:id="rId8" w:history="1">
+              <w:r>
+                <w:rPr>
+                  <w:rStyle w:val="Hyperlink"/>
+                </w:rPr>
+                <w:t>reader no message</w:t>
+              </w:r>
+            </w:hyperlink>
+            <w:r>
+              <w:t xml:space="preserve">, </w:t>
+            </w:r>
+            <w:hyperlink r:id="rId9" w:history="1">
+              <w:r>
+                <w:rPr>
+                  <w:rStyle w:val="Hyperlink"/>
+                </w:rPr>
+                <w:t>console w</w:t>
+              </w:r>
+              <w:r>
+                <w:rPr>
+                  <w:rStyle w:val="Hyperlink"/>
+                </w:rPr>
+                <w:t>a</w:t>
+              </w:r>
+              <w:r>
+                <w:rPr>
+                  <w:rStyle w:val="Hyperlink"/>
+                </w:rPr>
+                <w:t>rning</w:t>
+              </w:r>
+            </w:hyperlink>
+            <w:r>
+              <w:t xml:space="preserve">, </w:t>
+            </w:r>
+            <w:hyperlink r:id="rId10" w:history="1">
+              <w:r>
+                <w:rPr>
+                  <w:rStyle w:val="Hyperlink"/>
+                </w:rPr>
+                <w:t>post-await w</w:t>
+              </w:r>
+              <w:r>
+                <w:rPr>
+                  <w:rStyle w:val="Hyperlink"/>
+                </w:rPr>
+                <w:t>a</w:t>
+              </w:r>
+              <w:r>
+                <w:rPr>
+                  <w:rStyle w:val="Hyperlink"/>
+                </w:rPr>
+                <w:t>rning</w:t>
+              </w:r>
+            </w:hyperlink>
+          </w:p>
+        </w:tc>
+      </w:tr>
+      <w:tr>
+        <w:tc>
+          <w:tcPr>
+            <w:tcW w:w="686" w:type="dxa"/>
+            <w:tcBorders>
+              <w:top w:val="single" w:sz="8" w:space="0" w:color="A3A3A3"/>
+              <w:left w:val="single" w:sz="8" w:space="0" w:color="A3A3A3"/>
+              <w:bottom w:val="single" w:sz="8" w:space="0" w:color="A3A3A3"/>
+              <w:right w:val="single" w:sz="8" w:space="0" w:color="A3A3A3"/>
+            </w:tcBorders>
+            <w:tcMar>
+              <w:top w:w="80" w:type="dxa"/>
+              <w:left w:w="80" w:type="dxa"/>
+              <w:bottom w:w="80" w:type="dxa"/>
+              <w:right w:w="80" w:type="dxa"/>
+            </w:tcMar>
+            <w:hideMark/>
+          </w:tcPr>
+          <w:p>
+            <w:r>
+              <w:t>02</w:t>
+            </w:r>
+          </w:p>
+        </w:tc>
+        <w:tc>
+          <w:tcPr>
+            <w:tcW w:w="3894" w:type="dxa"/>
+            <w:tcBorders>
+              <w:top w:val="single" w:sz="8" w:space="0" w:color="A3A3A3"/>
+              <w:left w:val="single" w:sz="8" w:space="0" w:color="A3A3A3"/>
+              <w:bottom w:val="single" w:sz="8" w:space="0" w:color="A3A3A3"/>
+              <w:right w:val="single" w:sz="8" w:space="0" w:color="A3A3A3"/>
+            </w:tcBorders>
+            <w:tcMar>
+              <w:top w:w="80" w:type="dxa"/>
+              <w:left w:w="80" w:type="dxa"/>
+              <w:bottom w:w="80" w:type="dxa"/>
+              <w:right w:w="80" w:type="dxa"/>
+            </w:tcMar>
+            <w:hideMark/>
+          </w:tcPr>
+          <w:p>
+            <w:r>
+              <w:t xml:space="preserve">Cookie-backed </w:t>
+            </w:r>
+            <w:proofErr w:type="spellStart"/>
+            <w:r>
+              <w:t>TempData</w:t>
+            </w:r>
+            <w:proofErr w:type="spellEnd"/>
+            <w:r>
+              <w:t xml:space="preserve"> assigned before the artificial delay still </w:t>
+            </w:r>
+            <w:proofErr w:type="gramStart"/>
+            <w:r>
+              <w:t>isn't persisted</w:t>
+            </w:r>
+            <w:proofErr w:type="gramEnd"/>
+            <w:r>
+              <w:t xml:space="preserve"> when the response has already starte</w:t>
+            </w:r>
+            <w:r>
+              <w:t>d</w:t>
+            </w:r>
+          </w:p>
+        </w:tc>
+        <w:tc>
+          <w:tcPr>
+            <w:tcW w:w="990" w:type="dxa"/>
+            <w:tcBorders>
+              <w:top w:val="single" w:sz="8" w:space="0" w:color="A3A3A3"/>
+              <w:left w:val="single" w:sz="8" w:space="0" w:color="A3A3A3"/>
+              <w:bottom w:val="single" w:sz="8" w:space="0" w:color="A3A3A3"/>
+              <w:right w:val="single" w:sz="8" w:space="0" w:color="A3A3A3"/>
+            </w:tcBorders>
+            <w:tcMar>
+              <w:top w:w="80" w:type="dxa"/>
+              <w:left w:w="80" w:type="dxa"/>
+              <w:bottom w:w="80" w:type="dxa"/>
+              <w:right w:w="80" w:type="dxa"/>
+            </w:tcMar>
+            <w:hideMark/>
+          </w:tcPr>
+          <w:p>
+            <w:r>
+              <w:t>Pass</w:t>
+            </w:r>
+          </w:p>
+        </w:tc>
+        <w:tc>
+          <w:tcPr>
+            <w:tcW w:w="4130" w:type="dxa"/>
+            <w:tcBorders>
+              <w:top w:val="single" w:sz="8" w:space="0" w:color="A3A3A3"/>
+              <w:left w:val="single" w:sz="8" w:space="0" w:color="A3A3A3"/>
+              <w:bottom w:val="single" w:sz="8" w:space="0" w:color="A3A3A3"/>
+              <w:right w:val="single" w:sz="8" w:space="0" w:color="A3A3A3"/>
+            </w:tcBorders>
+            <w:tcMar>
+              <w:top w:w="80" w:type="dxa"/>
+              <w:left w:w="80" w:type="dxa"/>
+              <w:bottom w:w="80" w:type="dxa"/>
+              <w:right w:w="80" w:type="dxa"/>
+            </w:tcMar>
+            <w:hideMark/>
+          </w:tcPr>
+          <w:p>
+            <w:hyperlink r:id="rId11" w:history="1">
+              <w:r>
+                <w:rPr>
+                  <w:rStyle w:val="Hyperlink"/>
+                </w:rPr>
+                <w:t>pre-await input</w:t>
+              </w:r>
+            </w:hyperlink>
+            <w:r>
+              <w:t xml:space="preserve">, </w:t>
+            </w:r>
+            <w:hyperlink r:id="rId12" w:history="1">
+              <w:r>
+                <w:rPr>
+                  <w:rStyle w:val="Hyperlink"/>
+                </w:rPr>
+                <w:t>reader first load</w:t>
+              </w:r>
+            </w:hyperlink>
+            <w:r>
+              <w:t xml:space="preserve">, </w:t>
+            </w:r>
+            <w:hyperlink r:id="rId13" w:history="1">
+              <w:r>
+                <w:rPr>
+                  <w:rStyle w:val="Hyperlink"/>
+                </w:rPr>
+                <w:t>reader refresh</w:t>
+              </w:r>
+            </w:hyperlink>
+            <w:r>
+              <w:t xml:space="preserve">, </w:t>
+            </w:r>
+            <w:hyperlink r:id="rId14" w:history="1">
+              <w:r>
+                <w:rPr>
+                  <w:rStyle w:val="Hyperlink"/>
+                </w:rPr>
+                <w:t>war</w:t>
+              </w:r>
+              <w:r>
+                <w:rPr>
+                  <w:rStyle w:val="Hyperlink"/>
+                </w:rPr>
+                <w:t>n</w:t>
+              </w:r>
+              <w:r>
+                <w:rPr>
+                  <w:rStyle w:val="Hyperlink"/>
+                </w:rPr>
+                <w:t>ing</w:t>
+              </w:r>
+            </w:hyperlink>
+          </w:p>
+        </w:tc>
+      </w:tr>
+      <w:tr>
+        <w:tc>
+          <w:tcPr>
+            <w:tcW w:w="686" w:type="dxa"/>
+            <w:tcBorders>
+              <w:top w:val="single" w:sz="8" w:space="0" w:color="A3A3A3"/>
+              <w:left w:val="single" w:sz="8" w:space="0" w:color="A3A3A3"/>
+              <w:bottom w:val="single" w:sz="8" w:space="0" w:color="A3A3A3"/>
+              <w:right w:val="single" w:sz="8" w:space="0" w:color="A3A3A3"/>
+            </w:tcBorders>
+            <w:tcMar>
+              <w:top w:w="80" w:type="dxa"/>
+              <w:left w:w="80" w:type="dxa"/>
+              <w:bottom w:w="80" w:type="dxa"/>
+              <w:right w:w="80" w:type="dxa"/>
+            </w:tcMar>
+            <w:hideMark/>
+          </w:tcPr>
+          <w:p>
+            <w:r>
+              <w:t>03</w:t>
+            </w:r>
+          </w:p>
+        </w:tc>
+        <w:tc>
+          <w:tcPr>
+            <w:tcW w:w="3894" w:type="dxa"/>
+            <w:tcBorders>
+              <w:top w:val="single" w:sz="8" w:space="0" w:color="A3A3A3"/>
+              <w:left w:val="single" w:sz="8" w:space="0" w:color="A3A3A3"/>
+              <w:bottom w:val="single" w:sz="8" w:space="0" w:color="A3A3A3"/>
+              <w:right w:val="single" w:sz="8" w:space="0" w:color="A3A3A3"/>
+            </w:tcBorders>
+            <w:tcMar>
+              <w:top w:w="80" w:type="dxa"/>
+              <w:left w:w="80" w:type="dxa"/>
+              <w:bottom w:w="80" w:type="dxa"/>
+              <w:right w:w="80" w:type="dxa"/>
+            </w:tcMar>
+            <w:hideMark/>
+          </w:tcPr>
+          <w:p>
+            <w:r>
+              <w:t xml:space="preserve">Session-backed </w:t>
+            </w:r>
+            <w:proofErr w:type="spellStart"/>
+            <w:r>
+              <w:t>TempData</w:t>
+            </w:r>
+            <w:proofErr w:type="spellEnd"/>
+            <w:r>
+              <w:t xml:space="preserve"> with the session established before streaming persists a post-flush value to the next request and preserves one-time </w:t>
+            </w:r>
+            <w:proofErr w:type="spellStart"/>
+            <w:r>
+              <w:t>TempData</w:t>
+            </w:r>
+            <w:proofErr w:type="spellEnd"/>
+            <w:r>
+              <w:t xml:space="preserve"> behavior</w:t>
+            </w:r>
+          </w:p>
+          <w:p/>
+        </w:tc>
+        <w:tc>
+          <w:tcPr>
+            <w:tcW w:w="990" w:type="dxa"/>
+            <w:tcBorders>
+              <w:top w:val="single" w:sz="8" w:space="0" w:color="A3A3A3"/>
+              <w:left w:val="single" w:sz="8" w:space="0" w:color="A3A3A3"/>
+              <w:bottom w:val="single" w:sz="8" w:space="0" w:color="A3A3A3"/>
+              <w:right w:val="single" w:sz="8" w:space="0" w:color="A3A3A3"/>
+            </w:tcBorders>
+            <w:tcMar>
+              <w:top w:w="80" w:type="dxa"/>
+              <w:left w:w="80" w:type="dxa"/>
+              <w:bottom w:w="80" w:type="dxa"/>
+              <w:right w:w="80" w:type="dxa"/>
+            </w:tcMar>
+            <w:hideMark/>
+          </w:tcPr>
+          <w:p>
+            <w:r>
+              <w:t>Pass</w:t>
+            </w:r>
+          </w:p>
+        </w:tc>
+        <w:tc>
+          <w:tcPr>
+            <w:tcW w:w="4130" w:type="dxa"/>
+            <w:tcBorders>
+              <w:top w:val="single" w:sz="8" w:space="0" w:color="A3A3A3"/>
+              <w:left w:val="single" w:sz="8" w:space="0" w:color="A3A3A3"/>
+              <w:bottom w:val="single" w:sz="8" w:space="0" w:color="A3A3A3"/>
+              <w:right w:val="single" w:sz="8" w:space="0" w:color="A3A3A3"/>
+            </w:tcBorders>
+            <w:tcMar>
+              <w:top w:w="80" w:type="dxa"/>
+              <w:left w:w="80" w:type="dxa"/>
+              <w:bottom w:w="80" w:type="dxa"/>
+              <w:right w:w="80" w:type="dxa"/>
+            </w:tcMar>
+            <w:hideMark/>
+          </w:tcPr>
+          <w:p>
+            <w:hyperlink r:id="rId15" w:history="1">
+              <w:r>
+                <w:rPr>
+                  <w:rStyle w:val="Hyperlink"/>
+                </w:rPr>
+                <w:t>Session-config</w:t>
+              </w:r>
+            </w:hyperlink>
+            <w:r>
+              <w:t xml:space="preserve"> ,</w:t>
+            </w:r>
+            <w:r>
+              <w:t xml:space="preserve"> </w:t>
+            </w:r>
+            <w:hyperlink r:id="rId16" w:history="1">
+              <w:proofErr w:type="spellStart"/>
+              <w:r>
+                <w:rPr>
+                  <w:rStyle w:val="Hyperlink"/>
+                </w:rPr>
+                <w:t>session_initial_request</w:t>
+              </w:r>
+              <w:proofErr w:type="spellEnd"/>
+            </w:hyperlink>
+            <w:r>
+              <w:t xml:space="preserve">, </w:t>
+            </w:r>
+            <w:hyperlink r:id="rId17" w:history="1">
+              <w:proofErr w:type="spellStart"/>
+              <w:r>
+                <w:rPr>
+                  <w:rStyle w:val="Hyperlink"/>
+                </w:rPr>
+                <w:t>session_initial_response</w:t>
+              </w:r>
+              <w:proofErr w:type="spellEnd"/>
+            </w:hyperlink>
+            <w:r>
+              <w:t xml:space="preserve">, </w:t>
+            </w:r>
+            <w:hyperlink r:id="rId18" w:history="1">
+              <w:r>
+                <w:rPr>
+                  <w:rStyle w:val="Hyperlink"/>
+                </w:rPr>
+                <w:t>request tim</w:t>
+              </w:r>
+              <w:r>
+                <w:rPr>
+                  <w:rStyle w:val="Hyperlink"/>
+                </w:rPr>
+                <w:t>e</w:t>
+              </w:r>
+              <w:r>
+                <w:rPr>
+                  <w:rStyle w:val="Hyperlink"/>
+                </w:rPr>
+                <w:t>stamp</w:t>
+              </w:r>
+            </w:hyperlink>
+            <w:r>
+              <w:t xml:space="preserve">, </w:t>
+            </w:r>
+            <w:hyperlink r:id="rId19" w:history="1">
+              <w:r>
+                <w:rPr>
+                  <w:rStyle w:val="Hyperlink"/>
+                </w:rPr>
+                <w:t>reader fir</w:t>
+              </w:r>
+              <w:r>
+                <w:rPr>
+                  <w:rStyle w:val="Hyperlink"/>
+                </w:rPr>
+                <w:t>s</w:t>
+              </w:r>
+              <w:r>
+                <w:rPr>
+                  <w:rStyle w:val="Hyperlink"/>
+                </w:rPr>
+                <w:t>t load</w:t>
+              </w:r>
+            </w:hyperlink>
+            <w:r>
+              <w:t xml:space="preserve">, </w:t>
+            </w:r>
+            <w:hyperlink r:id="rId20" w:history="1">
+              <w:r>
+                <w:rPr>
+                  <w:rStyle w:val="Hyperlink"/>
+                </w:rPr>
+                <w:t>reader second load</w:t>
+              </w:r>
+            </w:hyperlink>
+          </w:p>
+        </w:tc>
+      </w:tr>
+      <w:tr>
+        <w:tc>
+          <w:tcPr>
+            <w:tcW w:w="686" w:type="dxa"/>
+            <w:tcBorders>
+              <w:top w:val="single" w:sz="8" w:space="0" w:color="A3A3A3"/>
+              <w:left w:val="single" w:sz="8" w:space="0" w:color="A3A3A3"/>
+              <w:bottom w:val="single" w:sz="8" w:space="0" w:color="A3A3A3"/>
+              <w:right w:val="single" w:sz="8" w:space="0" w:color="A3A3A3"/>
+            </w:tcBorders>
+            <w:tcMar>
+              <w:top w:w="80" w:type="dxa"/>
+              <w:left w:w="80" w:type="dxa"/>
+              <w:bottom w:w="80" w:type="dxa"/>
+              <w:right w:w="80" w:type="dxa"/>
+            </w:tcMar>
+            <w:hideMark/>
+          </w:tcPr>
+          <w:p>
+            <w:r>
+              <w:lastRenderedPageBreak/>
+              <w:t>04</w:t>
+            </w:r>
+          </w:p>
+        </w:tc>
+        <w:tc>
+          <w:tcPr>
+            <w:tcW w:w="3894" w:type="dxa"/>
+            <w:tcBorders>
+              <w:top w:val="single" w:sz="8" w:space="0" w:color="A3A3A3"/>
+              <w:left w:val="single" w:sz="8" w:space="0" w:color="A3A3A3"/>
+              <w:bottom w:val="single" w:sz="8" w:space="0" w:color="A3A3A3"/>
+              <w:right w:val="single" w:sz="8" w:space="0" w:color="A3A3A3"/>
+            </w:tcBorders>
+            <w:tcMar>
+              <w:top w:w="80" w:type="dxa"/>
+              <w:left w:w="80" w:type="dxa"/>
+              <w:bottom w:w="80" w:type="dxa"/>
+              <w:right w:w="80" w:type="dxa"/>
+            </w:tcMar>
+            <w:hideMark/>
+          </w:tcPr>
+          <w:p>
+            <w:r>
+              <w:t xml:space="preserve">Early session subscription before response </w:t>
+            </w:r>
+            <w:proofErr w:type="gramStart"/>
+            <w:r>
+              <w:t>start</w:t>
+            </w:r>
+            <w:proofErr w:type="gramEnd"/>
+            <w:r>
+              <w:t xml:space="preserve"> allows a post-flush value update to persist to a subsequent request, while deferred first subscription after response </w:t>
+            </w:r>
+            <w:proofErr w:type="gramStart"/>
+            <w:r>
+              <w:t>start</w:t>
+            </w:r>
+            <w:proofErr w:type="gramEnd"/>
+            <w:r>
+              <w:t xml:space="preserve"> warns and doesn't persist.</w:t>
+            </w:r>
+          </w:p>
+        </w:tc>
+        <w:tc>
+          <w:tcPr>
+            <w:tcW w:w="990" w:type="dxa"/>
+            <w:tcBorders>
+              <w:top w:val="single" w:sz="8" w:space="0" w:color="A3A3A3"/>
+              <w:left w:val="single" w:sz="8" w:space="0" w:color="A3A3A3"/>
+              <w:bottom w:val="single" w:sz="8" w:space="0" w:color="A3A3A3"/>
+              <w:right w:val="single" w:sz="8" w:space="0" w:color="A3A3A3"/>
+            </w:tcBorders>
+            <w:tcMar>
+              <w:top w:w="80" w:type="dxa"/>
+              <w:left w:w="80" w:type="dxa"/>
+              <w:bottom w:w="80" w:type="dxa"/>
+              <w:right w:w="80" w:type="dxa"/>
+            </w:tcMar>
+            <w:hideMark/>
+          </w:tcPr>
+          <w:p>
+            <w:r>
+              <w:t>Pass</w:t>
+            </w:r>
+          </w:p>
+        </w:tc>
+        <w:tc>
+          <w:tcPr>
+            <w:tcW w:w="4130" w:type="dxa"/>
+            <w:tcBorders>
+              <w:top w:val="single" w:sz="8" w:space="0" w:color="A3A3A3"/>
+              <w:left w:val="single" w:sz="8" w:space="0" w:color="A3A3A3"/>
+              <w:bottom w:val="single" w:sz="8" w:space="0" w:color="A3A3A3"/>
+              <w:right w:val="single" w:sz="8" w:space="0" w:color="A3A3A3"/>
+            </w:tcBorders>
+            <w:tcMar>
+              <w:top w:w="80" w:type="dxa"/>
+              <w:left w:w="80" w:type="dxa"/>
+              <w:bottom w:w="80" w:type="dxa"/>
+              <w:right w:w="80" w:type="dxa"/>
+            </w:tcMar>
+            <w:hideMark/>
+          </w:tcPr>
+          <w:p>
+            <w:hyperlink r:id="rId21" w:history="1">
+              <w:r>
+                <w:rPr>
+                  <w:rStyle w:val="Hyperlink"/>
+                </w:rPr>
+                <w:t>primer submitted</w:t>
+              </w:r>
+            </w:hyperlink>
+            <w:r>
+              <w:t xml:space="preserve">, </w:t>
+            </w:r>
+            <w:hyperlink r:id="rId22" w:history="1">
+              <w:r>
+                <w:rPr>
+                  <w:rStyle w:val="Hyperlink"/>
+                </w:rPr>
+                <w:t>positive after submit</w:t>
+              </w:r>
+            </w:hyperlink>
+            <w:r>
+              <w:t xml:space="preserve">, </w:t>
+            </w:r>
+            <w:hyperlink r:id="rId23" w:history="1">
+              <w:r>
+                <w:rPr>
+                  <w:rStyle w:val="Hyperlink"/>
+                </w:rPr>
+                <w:t>late parent after moun</w:t>
+              </w:r>
+            </w:hyperlink>
+            <w:r>
+              <w:t>t</w:t>
+            </w:r>
+            <w:r>
+              <w:t xml:space="preserve">, </w:t>
+            </w:r>
+            <w:hyperlink r:id="rId24" w:history="1">
+              <w:r>
+                <w:rPr>
+                  <w:rStyle w:val="Hyperlink"/>
+                </w:rPr>
+                <w:t>late subscription warning</w:t>
+              </w:r>
+            </w:hyperlink>
+            <w:r>
+              <w:t xml:space="preserve">, </w:t>
+            </w:r>
+            <w:hyperlink r:id="rId25" w:history="1">
+              <w:r>
+                <w:rPr>
+                  <w:rStyle w:val="Hyperlink"/>
+                </w:rPr>
+                <w:t>next request non-persistence</w:t>
+              </w:r>
+            </w:hyperlink>
+            <w:r>
+              <w:t xml:space="preserve">, </w:t>
+            </w:r>
+            <w:hyperlink r:id="rId26" w:history="1">
+              <w:proofErr w:type="spellStart"/>
+              <w:r>
+                <w:rPr>
+                  <w:rStyle w:val="Hyperlink"/>
+                </w:rPr>
+                <w:t>updated_session_value_is_still_present_after_the_flush</w:t>
+              </w:r>
+              <w:proofErr w:type="spellEnd"/>
+            </w:hyperlink>
+          </w:p>
+        </w:tc>
+      </w:tr>
+      <w:tr>
+        <w:tc>
+          <w:tcPr>
+            <w:tcW w:w="686" w:type="dxa"/>
+            <w:tcBorders>
+              <w:top w:val="single" w:sz="8" w:space="0" w:color="A3A3A3"/>
+              <w:left w:val="single" w:sz="8" w:space="0" w:color="A3A3A3"/>
+              <w:bottom w:val="single" w:sz="8" w:space="0" w:color="A3A3A3"/>
+              <w:right w:val="single" w:sz="8" w:space="0" w:color="A3A3A3"/>
+            </w:tcBorders>
+            <w:tcMar>
+              <w:top w:w="80" w:type="dxa"/>
+              <w:left w:w="80" w:type="dxa"/>
+              <w:bottom w:w="80" w:type="dxa"/>
+              <w:right w:w="80" w:type="dxa"/>
+            </w:tcMar>
+            <w:hideMark/>
+          </w:tcPr>
+          <w:p>
+            <w:r>
+              <w:t>05</w:t>
+            </w:r>
+          </w:p>
+        </w:tc>
+        <w:tc>
+          <w:tcPr>
+            <w:tcW w:w="3894" w:type="dxa"/>
+            <w:tcBorders>
+              <w:top w:val="single" w:sz="8" w:space="0" w:color="A3A3A3"/>
+              <w:left w:val="single" w:sz="8" w:space="0" w:color="A3A3A3"/>
+              <w:bottom w:val="single" w:sz="8" w:space="0" w:color="A3A3A3"/>
+              <w:right w:val="single" w:sz="8" w:space="0" w:color="A3A3A3"/>
+            </w:tcBorders>
+            <w:tcMar>
+              <w:top w:w="80" w:type="dxa"/>
+              <w:left w:w="80" w:type="dxa"/>
+              <w:bottom w:w="80" w:type="dxa"/>
+              <w:right w:w="80" w:type="dxa"/>
+            </w:tcMar>
+            <w:hideMark/>
+          </w:tcPr>
+          <w:p>
+            <w:r>
+              <w:t>Streaming off allows cookie storage to carry value across redirect</w:t>
+            </w:r>
+          </w:p>
+        </w:tc>
+        <w:tc>
+          <w:tcPr>
+            <w:tcW w:w="990" w:type="dxa"/>
+            <w:tcBorders>
+              <w:top w:val="single" w:sz="8" w:space="0" w:color="A3A3A3"/>
+              <w:left w:val="single" w:sz="8" w:space="0" w:color="A3A3A3"/>
+              <w:bottom w:val="single" w:sz="8" w:space="0" w:color="A3A3A3"/>
+              <w:right w:val="single" w:sz="8" w:space="0" w:color="A3A3A3"/>
+            </w:tcBorders>
+            <w:tcMar>
+              <w:top w:w="80" w:type="dxa"/>
+              <w:left w:w="80" w:type="dxa"/>
+              <w:bottom w:w="80" w:type="dxa"/>
+              <w:right w:w="80" w:type="dxa"/>
+            </w:tcMar>
+            <w:hideMark/>
+          </w:tcPr>
+          <w:p>
+            <w:r>
+              <w:t>Pass</w:t>
+            </w:r>
+          </w:p>
+        </w:tc>
+        <w:tc>
+          <w:tcPr>
+            <w:tcW w:w="4130" w:type="dxa"/>
+            <w:tcBorders>
+              <w:top w:val="single" w:sz="8" w:space="0" w:color="A3A3A3"/>
+              <w:left w:val="single" w:sz="8" w:space="0" w:color="A3A3A3"/>
+              <w:bottom w:val="single" w:sz="8" w:space="0" w:color="A3A3A3"/>
+              <w:right w:val="single" w:sz="8" w:space="0" w:color="A3A3A3"/>
+            </w:tcBorders>
+            <w:tcMar>
+              <w:top w:w="80" w:type="dxa"/>
+              <w:left w:w="80" w:type="dxa"/>
+              <w:bottom w:w="80" w:type="dxa"/>
+              <w:right w:w="80" w:type="dxa"/>
+            </w:tcMar>
+            <w:hideMark/>
+          </w:tcPr>
+          <w:p>
+            <w:hyperlink r:id="rId27" w:history="1">
+              <w:r>
+                <w:rPr>
+                  <w:rStyle w:val="Hyperlink"/>
+                </w:rPr>
+                <w:t>cookie mode config</w:t>
+              </w:r>
+            </w:hyperlink>
+            <w:r>
+              <w:t xml:space="preserve">, </w:t>
+            </w:r>
+            <w:hyperlink r:id="rId28" w:history="1">
+              <w:r>
+                <w:rPr>
+                  <w:rStyle w:val="Hyperlink"/>
+                </w:rPr>
+                <w:t>non-streaming input</w:t>
+              </w:r>
+            </w:hyperlink>
+            <w:r>
+              <w:t xml:space="preserve">, </w:t>
+            </w:r>
+            <w:hyperlink r:id="rId29" w:history="1">
+              <w:r>
+                <w:rPr>
+                  <w:rStyle w:val="Hyperlink"/>
+                </w:rPr>
+                <w:t>non-streaming reader first load</w:t>
+              </w:r>
+            </w:hyperlink>
+          </w:p>
+        </w:tc>
+      </w:tr>
+      <w:tr>
+        <w:tc>
+          <w:tcPr>
+            <w:tcW w:w="686" w:type="dxa"/>
+            <w:tcBorders>
+              <w:top w:val="single" w:sz="8" w:space="0" w:color="A3A3A3"/>
+              <w:left w:val="single" w:sz="8" w:space="0" w:color="A3A3A3"/>
+              <w:bottom w:val="single" w:sz="8" w:space="0" w:color="A3A3A3"/>
+              <w:right w:val="single" w:sz="8" w:space="0" w:color="A3A3A3"/>
+            </w:tcBorders>
+            <w:tcMar>
+              <w:top w:w="80" w:type="dxa"/>
+              <w:left w:w="80" w:type="dxa"/>
+              <w:bottom w:w="80" w:type="dxa"/>
+              <w:right w:w="80" w:type="dxa"/>
+            </w:tcMar>
+            <w:hideMark/>
+          </w:tcPr>
+          <w:p>
+            <w:r>
+              <w:t>06</w:t>
+            </w:r>
+          </w:p>
+        </w:tc>
+        <w:tc>
+          <w:tcPr>
+            <w:tcW w:w="3894" w:type="dxa"/>
+            <w:tcBorders>
+              <w:top w:val="single" w:sz="8" w:space="0" w:color="A3A3A3"/>
+              <w:left w:val="single" w:sz="8" w:space="0" w:color="A3A3A3"/>
+              <w:bottom w:val="single" w:sz="8" w:space="0" w:color="A3A3A3"/>
+              <w:right w:val="single" w:sz="8" w:space="0" w:color="A3A3A3"/>
+            </w:tcBorders>
+            <w:tcMar>
+              <w:top w:w="80" w:type="dxa"/>
+              <w:left w:w="80" w:type="dxa"/>
+              <w:bottom w:w="80" w:type="dxa"/>
+              <w:right w:w="80" w:type="dxa"/>
+            </w:tcMar>
+            <w:hideMark/>
+          </w:tcPr>
+          <w:p>
+            <w:r>
+              <w:t>Run streaming page under default cookie storage and inspect reader + console</w:t>
+            </w:r>
+          </w:p>
+        </w:tc>
+        <w:tc>
+          <w:tcPr>
+            <w:tcW w:w="990" w:type="dxa"/>
+            <w:tcBorders>
+              <w:top w:val="single" w:sz="8" w:space="0" w:color="A3A3A3"/>
+              <w:left w:val="single" w:sz="8" w:space="0" w:color="A3A3A3"/>
+              <w:bottom w:val="single" w:sz="8" w:space="0" w:color="A3A3A3"/>
+              <w:right w:val="single" w:sz="8" w:space="0" w:color="A3A3A3"/>
+            </w:tcBorders>
+            <w:tcMar>
+              <w:top w:w="80" w:type="dxa"/>
+              <w:left w:w="80" w:type="dxa"/>
+              <w:bottom w:w="80" w:type="dxa"/>
+              <w:right w:w="80" w:type="dxa"/>
+            </w:tcMar>
+            <w:hideMark/>
+          </w:tcPr>
+          <w:p>
+            <w:r>
+              <w:t>Pass</w:t>
+            </w:r>
+          </w:p>
+        </w:tc>
+        <w:tc>
+          <w:tcPr>
+            <w:tcW w:w="4130" w:type="dxa"/>
+            <w:tcBorders>
+              <w:top w:val="single" w:sz="8" w:space="0" w:color="A3A3A3"/>
+              <w:left w:val="single" w:sz="8" w:space="0" w:color="A3A3A3"/>
+              <w:bottom w:val="single" w:sz="8" w:space="0" w:color="A3A3A3"/>
+              <w:right w:val="single" w:sz="8" w:space="0" w:color="A3A3A3"/>
+            </w:tcBorders>
+            <w:tcMar>
+              <w:top w:w="80" w:type="dxa"/>
+              <w:left w:w="80" w:type="dxa"/>
+              <w:bottom w:w="80" w:type="dxa"/>
+              <w:right w:w="80" w:type="dxa"/>
+            </w:tcMar>
+            <w:hideMark/>
+          </w:tcPr>
+          <w:p>
+            <w:hyperlink r:id="rId30" w:history="1">
+              <w:r>
+                <w:rPr>
+                  <w:rStyle w:val="Hyperlink"/>
+                </w:rPr>
+                <w:t>streaming page loaded</w:t>
+              </w:r>
+            </w:hyperlink>
+            <w:r>
+              <w:t xml:space="preserve">, </w:t>
+            </w:r>
+            <w:hyperlink r:id="rId31" w:history="1">
+              <w:r>
+                <w:rPr>
+                  <w:rStyle w:val="Hyperlink"/>
+                </w:rPr>
+                <w:t>redirect to reader</w:t>
+              </w:r>
+            </w:hyperlink>
+            <w:r>
+              <w:t xml:space="preserve">, </w:t>
+            </w:r>
+            <w:hyperlink r:id="rId32" w:history="1">
+              <w:r>
+                <w:rPr>
+                  <w:rStyle w:val="Hyperlink"/>
+                </w:rPr>
+                <w:t>runtime warning</w:t>
+              </w:r>
+            </w:hyperlink>
+          </w:p>
+        </w:tc>
+      </w:tr>
+      <w:tr>
+        <w:tc>
+          <w:tcPr>
+            <w:tcW w:w="686" w:type="dxa"/>
+            <w:tcBorders>
+              <w:top w:val="single" w:sz="8" w:space="0" w:color="A3A3A3"/>
+              <w:left w:val="single" w:sz="8" w:space="0" w:color="A3A3A3"/>
+              <w:bottom w:val="single" w:sz="8" w:space="0" w:color="A3A3A3"/>
+              <w:right w:val="single" w:sz="8" w:space="0" w:color="A3A3A3"/>
+            </w:tcBorders>
+            <w:tcMar>
+              <w:top w:w="80" w:type="dxa"/>
+              <w:left w:w="80" w:type="dxa"/>
+              <w:bottom w:w="80" w:type="dxa"/>
+              <w:right w:w="80" w:type="dxa"/>
+            </w:tcMar>
+            <w:hideMark/>
+          </w:tcPr>
+          <w:p>
+            <w:r>
+              <w:t>07</w:t>
+            </w:r>
+          </w:p>
+        </w:tc>
+        <w:tc>
+          <w:tcPr>
+            <w:tcW w:w="3894" w:type="dxa"/>
+            <w:tcBorders>
+              <w:top w:val="single" w:sz="8" w:space="0" w:color="A3A3A3"/>
+              <w:left w:val="single" w:sz="8" w:space="0" w:color="A3A3A3"/>
+              <w:bottom w:val="single" w:sz="8" w:space="0" w:color="A3A3A3"/>
+              <w:right w:val="single" w:sz="8" w:space="0" w:color="A3A3A3"/>
+            </w:tcBorders>
+            <w:tcMar>
+              <w:top w:w="80" w:type="dxa"/>
+              <w:left w:w="80" w:type="dxa"/>
+              <w:bottom w:w="80" w:type="dxa"/>
+              <w:right w:w="80" w:type="dxa"/>
+            </w:tcMar>
+            <w:hideMark/>
+          </w:tcPr>
+          <w:p>
+            <w:r>
+              <w:t xml:space="preserve">Follow the runtime warning guidance alone to switch from cookie-backed </w:t>
+            </w:r>
+            <w:proofErr w:type="spellStart"/>
+            <w:r>
+              <w:t>TempData</w:t>
+            </w:r>
+            <w:proofErr w:type="spellEnd"/>
+            <w:r>
+              <w:t xml:space="preserve"> to session-backed </w:t>
+            </w:r>
+            <w:proofErr w:type="spellStart"/>
+            <w:r>
+              <w:t>TempData</w:t>
+            </w:r>
+            <w:proofErr w:type="spellEnd"/>
+            <w:r>
+              <w:t xml:space="preserve"> and verify the remediation.</w:t>
+            </w:r>
+          </w:p>
+        </w:tc>
+        <w:tc>
+          <w:tcPr>
+            <w:tcW w:w="990" w:type="dxa"/>
+            <w:tcBorders>
+              <w:top w:val="single" w:sz="8" w:space="0" w:color="A3A3A3"/>
+              <w:left w:val="single" w:sz="8" w:space="0" w:color="A3A3A3"/>
+              <w:bottom w:val="single" w:sz="8" w:space="0" w:color="A3A3A3"/>
+              <w:right w:val="single" w:sz="8" w:space="0" w:color="A3A3A3"/>
+            </w:tcBorders>
+            <w:tcMar>
+              <w:top w:w="80" w:type="dxa"/>
+              <w:left w:w="80" w:type="dxa"/>
+              <w:bottom w:w="80" w:type="dxa"/>
+              <w:right w:w="80" w:type="dxa"/>
+            </w:tcMar>
+            <w:hideMark/>
+          </w:tcPr>
+          <w:p>
+            <w:r>
+              <w:t>Pass</w:t>
+            </w:r>
+          </w:p>
+        </w:tc>
+        <w:tc>
+          <w:tcPr>
+            <w:tcW w:w="4130" w:type="dxa"/>
+            <w:tcBorders>
+              <w:top w:val="single" w:sz="8" w:space="0" w:color="A3A3A3"/>
+              <w:left w:val="single" w:sz="8" w:space="0" w:color="A3A3A3"/>
+              <w:bottom w:val="single" w:sz="8" w:space="0" w:color="A3A3A3"/>
+              <w:right w:val="single" w:sz="8" w:space="0" w:color="A3A3A3"/>
+            </w:tcBorders>
+            <w:tcMar>
+              <w:top w:w="80" w:type="dxa"/>
+              <w:left w:w="80" w:type="dxa"/>
+              <w:bottom w:w="80" w:type="dxa"/>
+              <w:right w:w="80" w:type="dxa"/>
+            </w:tcMar>
+            <w:hideMark/>
+          </w:tcPr>
+          <w:p>
+            <w:hyperlink r:id="rId33" w:history="1">
+              <w:r>
+                <w:rPr>
+                  <w:rStyle w:val="Hyperlink"/>
+                </w:rPr>
+                <w:t>Session-config</w:t>
+              </w:r>
+            </w:hyperlink>
+            <w:r>
+              <w:t xml:space="preserve">, </w:t>
+            </w:r>
+            <w:hyperlink r:id="rId34" w:history="1">
+              <w:r>
+                <w:rPr>
+                  <w:rStyle w:val="Hyperlink"/>
+                </w:rPr>
+                <w:t>session m</w:t>
+              </w:r>
+              <w:r>
+                <w:rPr>
+                  <w:rStyle w:val="Hyperlink"/>
+                </w:rPr>
+                <w:t>o</w:t>
+              </w:r>
+              <w:r>
+                <w:rPr>
+                  <w:rStyle w:val="Hyperlink"/>
+                </w:rPr>
+                <w:t>de request</w:t>
+              </w:r>
+            </w:hyperlink>
+            <w:r>
+              <w:t xml:space="preserve">, </w:t>
+            </w:r>
+            <w:hyperlink r:id="rId35" w:history="1">
+              <w:r>
+                <w:rPr>
+                  <w:rStyle w:val="Hyperlink"/>
+                </w:rPr>
+                <w:t>reade</w:t>
+              </w:r>
+              <w:r>
+                <w:rPr>
+                  <w:rStyle w:val="Hyperlink"/>
+                </w:rPr>
+                <w:t>r</w:t>
+              </w:r>
+              <w:r>
+                <w:rPr>
+                  <w:rStyle w:val="Hyperlink"/>
+                </w:rPr>
+                <w:t xml:space="preserve"> first load</w:t>
+              </w:r>
+            </w:hyperlink>
+            <w:r>
+              <w:t xml:space="preserve">, </w:t>
+            </w:r>
+            <w:hyperlink r:id="rId36" w:history="1">
+              <w:r>
+                <w:rPr>
+                  <w:rStyle w:val="Hyperlink"/>
+                </w:rPr>
+                <w:t>console warning</w:t>
+              </w:r>
+            </w:hyperlink>
+          </w:p>
+        </w:tc>
+      </w:tr>
+      <w:tr>
+        <w:tc>
+          <w:tcPr>
+            <w:tcW w:w="686" w:type="dxa"/>
+            <w:tcBorders>
+              <w:top w:val="single" w:sz="8" w:space="0" w:color="A3A3A3"/>
+              <w:left w:val="single" w:sz="8" w:space="0" w:color="A3A3A3"/>
+              <w:bottom w:val="single" w:sz="8" w:space="0" w:color="A3A3A3"/>
+              <w:right w:val="single" w:sz="8" w:space="0" w:color="A3A3A3"/>
+            </w:tcBorders>
+            <w:tcMar>
+              <w:top w:w="80" w:type="dxa"/>
+              <w:left w:w="80" w:type="dxa"/>
+              <w:bottom w:w="80" w:type="dxa"/>
+              <w:right w:w="80" w:type="dxa"/>
+            </w:tcMar>
+            <w:hideMark/>
+          </w:tcPr>
+          <w:p>
+            <w:r>
+              <w:t>08</w:t>
+            </w:r>
+          </w:p>
+        </w:tc>
+        <w:tc>
+          <w:tcPr>
+            <w:tcW w:w="3894" w:type="dxa"/>
+            <w:tcBorders>
+              <w:top w:val="single" w:sz="8" w:space="0" w:color="A3A3A3"/>
+              <w:left w:val="single" w:sz="8" w:space="0" w:color="A3A3A3"/>
+              <w:bottom w:val="single" w:sz="8" w:space="0" w:color="A3A3A3"/>
+              <w:right w:val="single" w:sz="8" w:space="0" w:color="A3A3A3"/>
+            </w:tcBorders>
+            <w:tcMar>
+              <w:top w:w="80" w:type="dxa"/>
+              <w:left w:w="80" w:type="dxa"/>
+              <w:bottom w:w="80" w:type="dxa"/>
+              <w:right w:w="80" w:type="dxa"/>
+            </w:tcMar>
+            <w:hideMark/>
+          </w:tcPr>
+          <w:p>
+            <w:r>
+              <w:t>Verify session cookie issued in initial response headers for session-backed flow</w:t>
+            </w:r>
+          </w:p>
+        </w:tc>
+        <w:tc>
+          <w:tcPr>
+            <w:tcW w:w="990" w:type="dxa"/>
+            <w:tcBorders>
+              <w:top w:val="single" w:sz="8" w:space="0" w:color="A3A3A3"/>
+              <w:left w:val="single" w:sz="8" w:space="0" w:color="A3A3A3"/>
+              <w:bottom w:val="single" w:sz="8" w:space="0" w:color="A3A3A3"/>
+              <w:right w:val="single" w:sz="8" w:space="0" w:color="A3A3A3"/>
+            </w:tcBorders>
+            <w:tcMar>
+              <w:top w:w="80" w:type="dxa"/>
+              <w:left w:w="80" w:type="dxa"/>
+              <w:bottom w:w="80" w:type="dxa"/>
+              <w:right w:w="80" w:type="dxa"/>
+            </w:tcMar>
+            <w:hideMark/>
+          </w:tcPr>
+          <w:p>
+            <w:r>
+              <w:t>Pass</w:t>
+            </w:r>
+          </w:p>
+        </w:tc>
+        <w:tc>
+          <w:tcPr>
+            <w:tcW w:w="4130" w:type="dxa"/>
+            <w:tcBorders>
+              <w:top w:val="single" w:sz="8" w:space="0" w:color="A3A3A3"/>
+              <w:left w:val="single" w:sz="8" w:space="0" w:color="A3A3A3"/>
+              <w:bottom w:val="single" w:sz="8" w:space="0" w:color="A3A3A3"/>
+              <w:right w:val="single" w:sz="8" w:space="0" w:color="A3A3A3"/>
+            </w:tcBorders>
+            <w:tcMar>
+              <w:top w:w="80" w:type="dxa"/>
+              <w:left w:w="80" w:type="dxa"/>
+              <w:bottom w:w="80" w:type="dxa"/>
+              <w:right w:w="80" w:type="dxa"/>
+            </w:tcMar>
+            <w:hideMark/>
+          </w:tcPr>
+          <w:p>
+            <w:hyperlink r:id="rId37" w:history="1">
+              <w:proofErr w:type="spellStart"/>
+              <w:r>
+                <w:rPr>
+                  <w:rStyle w:val="Hyperlink"/>
+                </w:rPr>
+                <w:t>session_initial_request</w:t>
+              </w:r>
+              <w:proofErr w:type="spellEnd"/>
+            </w:hyperlink>
+            <w:r>
+              <w:t xml:space="preserve">, </w:t>
+            </w:r>
+            <w:hyperlink r:id="rId38" w:history="1">
+              <w:proofErr w:type="spellStart"/>
+              <w:r>
+                <w:rPr>
+                  <w:rStyle w:val="Hyperlink"/>
+                </w:rPr>
+                <w:t>session_initial_response</w:t>
+              </w:r>
+              <w:proofErr w:type="spellEnd"/>
+            </w:hyperlink>
+          </w:p>
+        </w:tc>
+      </w:tr>
+      <w:tr>
+        <w:tc>
+          <w:tcPr>
+            <w:tcW w:w="686" w:type="dxa"/>
+            <w:tcBorders>
+              <w:top w:val="single" w:sz="8" w:space="0" w:color="A3A3A3"/>
+              <w:left w:val="single" w:sz="8" w:space="0" w:color="A3A3A3"/>
+              <w:bottom w:val="single" w:sz="8" w:space="0" w:color="A3A3A3"/>
+              <w:right w:val="single" w:sz="8" w:space="0" w:color="A3A3A3"/>
+            </w:tcBorders>
+            <w:tcMar>
+              <w:top w:w="80" w:type="dxa"/>
+              <w:left w:w="80" w:type="dxa"/>
+              <w:bottom w:w="80" w:type="dxa"/>
+              <w:right w:w="80" w:type="dxa"/>
+            </w:tcMar>
+            <w:hideMark/>
+          </w:tcPr>
+          <w:p>
+            <w:r>
+              <w:t>09</w:t>
+            </w:r>
+          </w:p>
+        </w:tc>
+        <w:tc>
+          <w:tcPr>
+            <w:tcW w:w="3894" w:type="dxa"/>
+            <w:tcBorders>
+              <w:top w:val="single" w:sz="8" w:space="0" w:color="A3A3A3"/>
+              <w:left w:val="single" w:sz="8" w:space="0" w:color="A3A3A3"/>
+              <w:bottom w:val="single" w:sz="8" w:space="0" w:color="A3A3A3"/>
+              <w:right w:val="single" w:sz="8" w:space="0" w:color="A3A3A3"/>
+            </w:tcBorders>
+            <w:tcMar>
+              <w:top w:w="80" w:type="dxa"/>
+              <w:left w:w="80" w:type="dxa"/>
+              <w:bottom w:w="80" w:type="dxa"/>
+              <w:right w:w="80" w:type="dxa"/>
+            </w:tcMar>
+            <w:hideMark/>
+          </w:tcPr>
+          <w:p>
+            <w:r>
+              <w:t>Compare pre-await write vs post-await write under cookie storage</w:t>
+            </w:r>
+          </w:p>
+        </w:tc>
+        <w:tc>
+          <w:tcPr>
+            <w:tcW w:w="990" w:type="dxa"/>
+            <w:tcBorders>
+              <w:top w:val="single" w:sz="8" w:space="0" w:color="A3A3A3"/>
+              <w:left w:val="single" w:sz="8" w:space="0" w:color="A3A3A3"/>
+              <w:bottom w:val="single" w:sz="8" w:space="0" w:color="A3A3A3"/>
+              <w:right w:val="single" w:sz="8" w:space="0" w:color="A3A3A3"/>
+            </w:tcBorders>
+            <w:tcMar>
+              <w:top w:w="80" w:type="dxa"/>
+              <w:left w:w="80" w:type="dxa"/>
+              <w:bottom w:w="80" w:type="dxa"/>
+              <w:right w:w="80" w:type="dxa"/>
+            </w:tcMar>
+            <w:hideMark/>
+          </w:tcPr>
+          <w:p>
+            <w:r>
+              <w:t>Pass</w:t>
+            </w:r>
+          </w:p>
+        </w:tc>
+        <w:tc>
+          <w:tcPr>
+            <w:tcW w:w="4130" w:type="dxa"/>
+            <w:tcBorders>
+              <w:top w:val="single" w:sz="8" w:space="0" w:color="A3A3A3"/>
+              <w:left w:val="single" w:sz="8" w:space="0" w:color="A3A3A3"/>
+              <w:bottom w:val="single" w:sz="8" w:space="0" w:color="A3A3A3"/>
+              <w:right w:val="single" w:sz="8" w:space="0" w:color="A3A3A3"/>
+            </w:tcBorders>
+            <w:tcMar>
+              <w:top w:w="80" w:type="dxa"/>
+              <w:left w:w="80" w:type="dxa"/>
+              <w:bottom w:w="80" w:type="dxa"/>
+              <w:right w:w="80" w:type="dxa"/>
+            </w:tcMar>
+            <w:hideMark/>
+          </w:tcPr>
+          <w:p>
+            <w:hyperlink r:id="rId39" w:history="1">
+              <w:r>
+                <w:rPr>
+                  <w:rStyle w:val="Hyperlink"/>
+                </w:rPr>
+                <w:t>post-await request</w:t>
+              </w:r>
+            </w:hyperlink>
+            <w:r>
+              <w:t xml:space="preserve">, </w:t>
+            </w:r>
+            <w:hyperlink r:id="rId40" w:history="1">
+              <w:r>
+                <w:rPr>
+                  <w:rStyle w:val="Hyperlink"/>
+                </w:rPr>
+                <w:t>post-await reader</w:t>
+              </w:r>
+            </w:hyperlink>
+            <w:r>
+              <w:t xml:space="preserve">, </w:t>
+            </w:r>
+            <w:hyperlink r:id="rId41" w:history="1">
+              <w:r>
+                <w:rPr>
+                  <w:rStyle w:val="Hyperlink"/>
+                </w:rPr>
+                <w:t>pre-await request</w:t>
+              </w:r>
+            </w:hyperlink>
+            <w:r>
+              <w:t xml:space="preserve">, </w:t>
+            </w:r>
+            <w:hyperlink r:id="rId42" w:history="1">
+              <w:r>
+                <w:rPr>
+                  <w:rStyle w:val="Hyperlink"/>
+                </w:rPr>
+                <w:t>pre-await reader</w:t>
+              </w:r>
+            </w:hyperlink>
+          </w:p>
+        </w:tc>
+      </w:tr>
+      <w:tr>
+        <w:tc>
+          <w:tcPr>
+            <w:tcW w:w="686" w:type="dxa"/>
+            <w:tcBorders>
+              <w:top w:val="single" w:sz="8" w:space="0" w:color="A3A3A3"/>
+              <w:left w:val="single" w:sz="8" w:space="0" w:color="A3A3A3"/>
+              <w:bottom w:val="single" w:sz="8" w:space="0" w:color="A3A3A3"/>
+              <w:right w:val="single" w:sz="8" w:space="0" w:color="A3A3A3"/>
+            </w:tcBorders>
+            <w:tcMar>
+              <w:top w:w="80" w:type="dxa"/>
+              <w:left w:w="80" w:type="dxa"/>
+              <w:bottom w:w="80" w:type="dxa"/>
+              <w:right w:w="80" w:type="dxa"/>
+            </w:tcMar>
+            <w:hideMark/>
+          </w:tcPr>
+          <w:p>
+            <w:r>
+              <w:t>10</w:t>
+            </w:r>
+          </w:p>
+        </w:tc>
+        <w:tc>
+          <w:tcPr>
+            <w:tcW w:w="3894" w:type="dxa"/>
+            <w:tcBorders>
+              <w:top w:val="single" w:sz="8" w:space="0" w:color="A3A3A3"/>
+              <w:left w:val="single" w:sz="8" w:space="0" w:color="A3A3A3"/>
+              <w:bottom w:val="single" w:sz="8" w:space="0" w:color="A3A3A3"/>
+              <w:right w:val="single" w:sz="8" w:space="0" w:color="A3A3A3"/>
+            </w:tcBorders>
+            <w:tcMar>
+              <w:top w:w="80" w:type="dxa"/>
+              <w:left w:w="80" w:type="dxa"/>
+              <w:bottom w:w="80" w:type="dxa"/>
+              <w:right w:w="80" w:type="dxa"/>
+            </w:tcMar>
+            <w:hideMark/>
+          </w:tcPr>
+          <w:p>
+            <w:r>
+              <w:t xml:space="preserve">Compare </w:t>
+            </w:r>
+            <w:r>
+              <w:t>early subscribed</w:t>
+            </w:r>
+            <w:r>
+              <w:t xml:space="preserve"> session property vs deferred child subscription</w:t>
+            </w:r>
+          </w:p>
+        </w:tc>
+        <w:tc>
+          <w:tcPr>
+            <w:tcW w:w="990" w:type="dxa"/>
+            <w:tcBorders>
+              <w:top w:val="single" w:sz="8" w:space="0" w:color="A3A3A3"/>
+              <w:left w:val="single" w:sz="8" w:space="0" w:color="A3A3A3"/>
+              <w:bottom w:val="single" w:sz="8" w:space="0" w:color="A3A3A3"/>
+              <w:right w:val="single" w:sz="8" w:space="0" w:color="A3A3A3"/>
+            </w:tcBorders>
+            <w:tcMar>
+              <w:top w:w="80" w:type="dxa"/>
+              <w:left w:w="80" w:type="dxa"/>
+              <w:bottom w:w="80" w:type="dxa"/>
+              <w:right w:w="80" w:type="dxa"/>
+            </w:tcMar>
+            <w:hideMark/>
+          </w:tcPr>
+          <w:p>
+            <w:r>
+              <w:t>Pass</w:t>
+            </w:r>
+          </w:p>
+        </w:tc>
+        <w:tc>
+          <w:tcPr>
+            <w:tcW w:w="4130" w:type="dxa"/>
+            <w:tcBorders>
+              <w:top w:val="single" w:sz="8" w:space="0" w:color="A3A3A3"/>
+              <w:left w:val="single" w:sz="8" w:space="0" w:color="A3A3A3"/>
+              <w:bottom w:val="single" w:sz="8" w:space="0" w:color="A3A3A3"/>
+              <w:right w:val="single" w:sz="8" w:space="0" w:color="A3A3A3"/>
+            </w:tcBorders>
+            <w:tcMar>
+              <w:top w:w="80" w:type="dxa"/>
+              <w:left w:w="80" w:type="dxa"/>
+              <w:bottom w:w="80" w:type="dxa"/>
+              <w:right w:w="80" w:type="dxa"/>
+            </w:tcMar>
+            <w:hideMark/>
+          </w:tcPr>
+          <w:p>
+            <w:hyperlink r:id="rId43" w:history="1">
+              <w:r>
+                <w:rPr>
+                  <w:rStyle w:val="Hyperlink"/>
+                </w:rPr>
+                <w:t>early-subscribed before submit</w:t>
+              </w:r>
+            </w:hyperlink>
+            <w:r>
+              <w:t xml:space="preserve">, </w:t>
+            </w:r>
+            <w:hyperlink r:id="rId44" w:history="1">
+              <w:r>
+                <w:rPr>
+                  <w:rStyle w:val="Hyperlink"/>
+                </w:rPr>
+                <w:t>deferred child before mount</w:t>
+              </w:r>
+            </w:hyperlink>
+            <w:r>
+              <w:t xml:space="preserve">, </w:t>
+            </w:r>
+            <w:hyperlink r:id="rId45" w:history="1">
+              <w:r>
+                <w:rPr>
+                  <w:rStyle w:val="Hyperlink"/>
+                </w:rPr>
+                <w:t>deferred child after mount</w:t>
+              </w:r>
+            </w:hyperlink>
+            <w:r>
+              <w:t xml:space="preserve">, </w:t>
+            </w:r>
+            <w:hyperlink r:id="rId46" w:history="1">
+              <w:r>
+                <w:rPr>
+                  <w:rStyle w:val="Hyperlink"/>
+                </w:rPr>
+                <w:t>next request non-persistence</w:t>
+              </w:r>
+            </w:hyperlink>
+            <w:r>
+              <w:t xml:space="preserve">, </w:t>
+            </w:r>
+            <w:hyperlink r:id="rId47" w:history="1">
+              <w:proofErr w:type="spellStart"/>
+              <w:r>
+                <w:rPr>
+                  <w:rStyle w:val="Hyperlink"/>
+                </w:rPr>
+                <w:t>updated_session_value_is_still_present_after_the_flush</w:t>
+              </w:r>
+              <w:proofErr w:type="spellEnd"/>
+            </w:hyperlink>
+          </w:p>
+        </w:tc>
+      </w:tr>
+      <w:tr>
+        <w:tc>
+          <w:tcPr>
+            <w:tcW w:w="686" w:type="dxa"/>
+            <w:tcBorders>
+              <w:top w:val="single" w:sz="8" w:space="0" w:color="A3A3A3"/>
+              <w:left w:val="single" w:sz="8" w:space="0" w:color="A3A3A3"/>
+              <w:bottom w:val="single" w:sz="8" w:space="0" w:color="A3A3A3"/>
+              <w:right w:val="single" w:sz="8" w:space="0" w:color="A3A3A3"/>
+            </w:tcBorders>
+            <w:tcMar>
+              <w:top w:w="80" w:type="dxa"/>
+              <w:left w:w="80" w:type="dxa"/>
+              <w:bottom w:w="80" w:type="dxa"/>
+              <w:right w:w="80" w:type="dxa"/>
+            </w:tcMar>
+            <w:hideMark/>
+          </w:tcPr>
+          <w:p>
+            <w:r>
+              <w:t>11</w:t>
+            </w:r>
+          </w:p>
+        </w:tc>
+        <w:tc>
+          <w:tcPr>
+            <w:tcW w:w="3894" w:type="dxa"/>
+            <w:tcBorders>
+              <w:top w:val="single" w:sz="8" w:space="0" w:color="A3A3A3"/>
+              <w:left w:val="single" w:sz="8" w:space="0" w:color="A3A3A3"/>
+              <w:bottom w:val="single" w:sz="8" w:space="0" w:color="A3A3A3"/>
+              <w:right w:val="single" w:sz="8" w:space="0" w:color="A3A3A3"/>
+            </w:tcBorders>
+            <w:tcMar>
+              <w:top w:w="80" w:type="dxa"/>
+              <w:left w:w="80" w:type="dxa"/>
+              <w:bottom w:w="80" w:type="dxa"/>
+              <w:right w:w="80" w:type="dxa"/>
+            </w:tcMar>
+            <w:hideMark/>
+          </w:tcPr>
+          <w:p>
+            <w:r>
+              <w:t>Turn streaming off and compare both storage options</w:t>
+            </w:r>
+          </w:p>
+        </w:tc>
+        <w:tc>
+          <w:tcPr>
+            <w:tcW w:w="990" w:type="dxa"/>
+            <w:tcBorders>
+              <w:top w:val="single" w:sz="8" w:space="0" w:color="A3A3A3"/>
+              <w:left w:val="single" w:sz="8" w:space="0" w:color="A3A3A3"/>
+              <w:bottom w:val="single" w:sz="8" w:space="0" w:color="A3A3A3"/>
+              <w:right w:val="single" w:sz="8" w:space="0" w:color="A3A3A3"/>
+            </w:tcBorders>
+            <w:tcMar>
+              <w:top w:w="80" w:type="dxa"/>
+              <w:left w:w="80" w:type="dxa"/>
+              <w:bottom w:w="80" w:type="dxa"/>
+              <w:right w:w="80" w:type="dxa"/>
+            </w:tcMar>
+            <w:hideMark/>
+          </w:tcPr>
+          <w:p>
+            <w:r>
+              <w:t>Pass</w:t>
+            </w:r>
+          </w:p>
+        </w:tc>
+        <w:tc>
+          <w:tcPr>
+            <w:tcW w:w="4130" w:type="dxa"/>
+            <w:tcBorders>
+              <w:top w:val="single" w:sz="8" w:space="0" w:color="A3A3A3"/>
+              <w:left w:val="single" w:sz="8" w:space="0" w:color="A3A3A3"/>
+              <w:bottom w:val="single" w:sz="8" w:space="0" w:color="A3A3A3"/>
+              <w:right w:val="single" w:sz="8" w:space="0" w:color="A3A3A3"/>
+            </w:tcBorders>
+            <w:tcMar>
+              <w:top w:w="80" w:type="dxa"/>
+              <w:left w:w="80" w:type="dxa"/>
+              <w:bottom w:w="80" w:type="dxa"/>
+              <w:right w:w="80" w:type="dxa"/>
+            </w:tcMar>
+            <w:hideMark/>
+          </w:tcPr>
+          <w:p>
+            <w:hyperlink r:id="rId48" w:history="1">
+              <w:r>
+                <w:rPr>
+                  <w:rStyle w:val="Hyperlink"/>
+                </w:rPr>
+                <w:t>cookie non-streaming reader</w:t>
+              </w:r>
+            </w:hyperlink>
+            <w:r>
+              <w:t xml:space="preserve">, </w:t>
+            </w:r>
+            <w:hyperlink r:id="rId49" w:history="1">
+              <w:r>
+                <w:rPr>
+                  <w:rStyle w:val="Hyperlink"/>
+                </w:rPr>
+                <w:t>cookie second load</w:t>
+              </w:r>
+            </w:hyperlink>
+            <w:r>
+              <w:t xml:space="preserve">, </w:t>
+            </w:r>
+            <w:hyperlink r:id="rId50" w:history="1">
+              <w:r>
+                <w:rPr>
+                  <w:rStyle w:val="Hyperlink"/>
+                </w:rPr>
+                <w:t>session non-streaming reader</w:t>
+              </w:r>
+            </w:hyperlink>
+            <w:r>
+              <w:t xml:space="preserve">, </w:t>
+            </w:r>
+            <w:hyperlink r:id="rId51" w:history="1">
+              <w:r>
+                <w:rPr>
+                  <w:rStyle w:val="Hyperlink"/>
+                </w:rPr>
+                <w:t>session second load</w:t>
+              </w:r>
+            </w:hyperlink>
+          </w:p>
+        </w:tc>
+      </w:tr>
+      <w:tr>
+        <w:tc>
+          <w:tcPr>
+            <w:tcW w:w="686" w:type="dxa"/>
+            <w:tcBorders>
+              <w:top w:val="single" w:sz="8" w:space="0" w:color="A3A3A3"/>
+              <w:left w:val="single" w:sz="8" w:space="0" w:color="A3A3A3"/>
+              <w:bottom w:val="single" w:sz="8" w:space="0" w:color="A3A3A3"/>
+              <w:right w:val="single" w:sz="8" w:space="0" w:color="A3A3A3"/>
+            </w:tcBorders>
+            <w:tcMar>
+              <w:top w:w="80" w:type="dxa"/>
+              <w:left w:w="80" w:type="dxa"/>
+              <w:bottom w:w="80" w:type="dxa"/>
+              <w:right w:w="80" w:type="dxa"/>
+            </w:tcMar>
+            <w:hideMark/>
+          </w:tcPr>
+          <w:p>
+            <w:r>
+              <w:lastRenderedPageBreak/>
+              <w:t>12</w:t>
+            </w:r>
+          </w:p>
+        </w:tc>
+        <w:tc>
+          <w:tcPr>
+            <w:tcW w:w="3894" w:type="dxa"/>
+            <w:tcBorders>
+              <w:top w:val="single" w:sz="8" w:space="0" w:color="A3A3A3"/>
+              <w:left w:val="single" w:sz="8" w:space="0" w:color="A3A3A3"/>
+              <w:bottom w:val="single" w:sz="8" w:space="0" w:color="A3A3A3"/>
+              <w:right w:val="single" w:sz="8" w:space="0" w:color="A3A3A3"/>
+            </w:tcBorders>
+            <w:tcMar>
+              <w:top w:w="80" w:type="dxa"/>
+              <w:left w:w="80" w:type="dxa"/>
+              <w:bottom w:w="80" w:type="dxa"/>
+              <w:right w:w="80" w:type="dxa"/>
+            </w:tcMar>
+            <w:hideMark/>
+          </w:tcPr>
+          <w:p>
+            <w:r>
+              <w:t xml:space="preserve">Record response </w:t>
+            </w:r>
+            <w:r>
+              <w:t>starts</w:t>
+            </w:r>
+            <w:r>
+              <w:t xml:space="preserve"> time, subscription time, and assignment time per variant</w:t>
+            </w:r>
+          </w:p>
+        </w:tc>
+        <w:tc>
+          <w:tcPr>
+            <w:tcW w:w="990" w:type="dxa"/>
+            <w:tcBorders>
+              <w:top w:val="single" w:sz="8" w:space="0" w:color="A3A3A3"/>
+              <w:left w:val="single" w:sz="8" w:space="0" w:color="A3A3A3"/>
+              <w:bottom w:val="single" w:sz="8" w:space="0" w:color="A3A3A3"/>
+              <w:right w:val="single" w:sz="8" w:space="0" w:color="A3A3A3"/>
+            </w:tcBorders>
+            <w:tcMar>
+              <w:top w:w="80" w:type="dxa"/>
+              <w:left w:w="80" w:type="dxa"/>
+              <w:bottom w:w="80" w:type="dxa"/>
+              <w:right w:w="80" w:type="dxa"/>
+            </w:tcMar>
+            <w:hideMark/>
+          </w:tcPr>
+          <w:p>
+            <w:r>
+              <w:t>Pass</w:t>
+            </w:r>
+          </w:p>
+        </w:tc>
+        <w:tc>
+          <w:tcPr>
+            <w:tcW w:w="4130" w:type="dxa"/>
+            <w:tcBorders>
+              <w:top w:val="single" w:sz="8" w:space="0" w:color="A3A3A3"/>
+              <w:left w:val="single" w:sz="8" w:space="0" w:color="A3A3A3"/>
+              <w:bottom w:val="single" w:sz="8" w:space="0" w:color="A3A3A3"/>
+              <w:right w:val="single" w:sz="8" w:space="0" w:color="A3A3A3"/>
+            </w:tcBorders>
+            <w:tcMar>
+              <w:top w:w="80" w:type="dxa"/>
+              <w:left w:w="80" w:type="dxa"/>
+              <w:bottom w:w="80" w:type="dxa"/>
+              <w:right w:w="80" w:type="dxa"/>
+            </w:tcMar>
+            <w:hideMark/>
+          </w:tcPr>
+          <w:p>
+            <w:hyperlink r:id="rId52" w:history="1">
+              <w:r>
+                <w:rPr>
+                  <w:rStyle w:val="Hyperlink"/>
+                </w:rPr>
+                <w:t>cookie post-await request timing</w:t>
+              </w:r>
+            </w:hyperlink>
+            <w:r>
+              <w:t xml:space="preserve">, </w:t>
+            </w:r>
+            <w:hyperlink r:id="rId53" w:history="1">
+              <w:r>
+                <w:rPr>
+                  <w:rStyle w:val="Hyperlink"/>
+                </w:rPr>
+                <w:t>cookie pre-await request timin</w:t>
+              </w:r>
+            </w:hyperlink>
+            <w:r>
+              <w:t xml:space="preserve">g, </w:t>
+            </w:r>
+            <w:hyperlink r:id="rId54" w:history="1">
+              <w:r>
+                <w:rPr>
+                  <w:rStyle w:val="Hyperlink"/>
+                </w:rPr>
+                <w:t>session request timing</w:t>
+              </w:r>
+            </w:hyperlink>
+            <w:r>
+              <w:t xml:space="preserve">, </w:t>
+            </w:r>
+            <w:hyperlink r:id="rId55" w:history="1">
+              <w:r>
+                <w:rPr>
+                  <w:rStyle w:val="Hyperlink"/>
+                </w:rPr>
+                <w:t>late-subscription wa</w:t>
+              </w:r>
+              <w:r>
+                <w:rPr>
+                  <w:rStyle w:val="Hyperlink"/>
+                </w:rPr>
+                <w:t>r</w:t>
+              </w:r>
+              <w:r>
+                <w:rPr>
+                  <w:rStyle w:val="Hyperlink"/>
+                </w:rPr>
+                <w:t>ning timing</w:t>
+              </w:r>
+            </w:hyperlink>
+            <w:r>
+              <w:t xml:space="preserve">, </w:t>
+            </w:r>
+            <w:hyperlink r:id="rId56" w:history="1">
+              <w:r>
+                <w:rPr>
+                  <w:rStyle w:val="Hyperlink"/>
+                </w:rPr>
+                <w:t>positive after submit</w:t>
+              </w:r>
+            </w:hyperlink>
+            <w:r>
+              <w:t xml:space="preserve">, </w:t>
+            </w:r>
+            <w:hyperlink r:id="rId57" w:history="1">
+              <w:proofErr w:type="spellStart"/>
+              <w:r>
+                <w:rPr>
+                  <w:rStyle w:val="Hyperlink"/>
+                </w:rPr>
+                <w:t>positive_before_submit</w:t>
+              </w:r>
+              <w:proofErr w:type="spellEnd"/>
+            </w:hyperlink>
+            <w:r>
+              <w:t>,</w:t>
+            </w:r>
+          </w:p>
+          <w:p>
+            <w:hyperlink r:id="rId58" w:history="1">
+              <w:proofErr w:type="spellStart"/>
+              <w:r>
+                <w:rPr>
+                  <w:rStyle w:val="Hyperlink"/>
+                </w:rPr>
+                <w:t>updated_session_value_is_still_present_after_the_flush</w:t>
+              </w:r>
+              <w:proofErr w:type="spellEnd"/>
+            </w:hyperlink>
+            <w:r>
+              <w:t>,</w:t>
+            </w:r>
+          </w:p>
+          <w:p>
+            <w:hyperlink r:id="rId59" w:history="1">
+              <w:r>
+                <w:rPr>
+                  <w:rStyle w:val="Hyperlink"/>
+                </w:rPr>
+                <w:t>next request non-persistence</w:t>
+              </w:r>
+            </w:hyperlink>
+            <w:r>
+              <w:t>,</w:t>
+            </w:r>
+          </w:p>
+          <w:p/>
+        </w:tc>
+      </w:tr>
+    </w:tbl>
+    <w:p/>
+    <w:p>
+      <w:pPr>
+        <w:rPr>
+          <w:b/>
+          <w:bCs/>
+          <w:sz w:val="28"/>
+          <w:szCs w:val="28"/>
+        </w:rPr>
+      </w:pPr>
+      <w:r>
+        <w:rPr>
+          <w:b/>
+          <w:bCs/>
+          <w:sz w:val="28"/>
+          <w:szCs w:val="28"/>
+        </w:rPr>
+        <w:t>Runtime Warning Evidence</w:t>
+      </w:r>
+    </w:p>
+    <w:tbl>
+      <w:tblPr>
+        <w:tblStyle w:val="TableGrid"/>
+        <w:tblW w:w="0" w:type="auto"/>
+        <w:tblLayout w:type="fixed"/>
+        <w:tblLook w:val="04A0" w:firstRow="1" w:lastRow="0" w:firstColumn="1" w:lastColumn="0" w:noHBand="0" w:noVBand="1"/>
+      </w:tblPr>
+      <w:tblGrid>
+        <w:gridCol w:w="1185"/>
+        <w:gridCol w:w="648"/>
+        <w:gridCol w:w="3022"/>
+        <w:gridCol w:w="3531"/>
+        <w:gridCol w:w="964"/>
+      </w:tblGrid>
+      <w:tr>
+        <w:tc>
+          <w:tcPr>
+            <w:tcW w:w="1185" w:type="dxa"/>
+          </w:tcPr>
+          <w:p>
+            <w:r>
+              <w:rPr>
+                <w:b/>
+                <w:bCs/>
+              </w:rPr>
+              <w:t>Run</w:t>
+            </w:r>
+          </w:p>
+        </w:tc>
+        <w:tc>
+          <w:tcPr>
+            <w:tcW w:w="648" w:type="dxa"/>
+          </w:tcPr>
+          <w:p>
+            <w:r>
+              <w:rPr>
+                <w:b/>
+                <w:bCs/>
+              </w:rPr>
+              <w:t>Level</w:t>
+            </w:r>
+          </w:p>
+        </w:tc>
+        <w:tc>
+          <w:tcPr>
+            <w:tcW w:w="3022" w:type="dxa"/>
+          </w:tcPr>
+          <w:p>
+            <w:r>
+              <w:rPr>
+                <w:b/>
+                <w:bCs/>
+              </w:rPr>
+              <w:t>Category</w:t>
+            </w:r>
+          </w:p>
+        </w:tc>
+        <w:tc>
+          <w:tcPr>
+            <w:tcW w:w="3531" w:type="dxa"/>
+          </w:tcPr>
+          <w:p>
+            <w:pPr>
+              <w:rPr>
+                <w:b/>
+                <w:bCs/>
+              </w:rPr>
+            </w:pPr>
+            <w:r>
+              <w:rPr>
+                <w:b/>
+                <w:bCs/>
+              </w:rPr>
+              <w:t>Verbatim warning text</w:t>
+            </w:r>
+          </w:p>
+        </w:tc>
+        <w:tc>
+          <w:tcPr>
+            <w:tcW w:w="964" w:type="dxa"/>
+          </w:tcPr>
+          <w:p>
+            <w:r>
+              <w:rPr>
+                <w:b/>
+                <w:bCs/>
+              </w:rPr>
+              <w:t>Evidence</w:t>
+            </w:r>
+          </w:p>
+        </w:tc>
+      </w:tr>
+      <w:tr>
+        <w:tc>
+          <w:tcPr>
+            <w:tcW w:w="1185" w:type="dxa"/>
+          </w:tcPr>
+          <w:p>
+            <w:r>
+              <w:t xml:space="preserve">Cookie post-flush </w:t>
+            </w:r>
+            <w:proofErr w:type="spellStart"/>
+            <w:r>
+              <w:t>TempData</w:t>
+            </w:r>
+            <w:proofErr w:type="spellEnd"/>
+            <w:r>
+              <w:t xml:space="preserve"> failure</w:t>
+            </w:r>
+          </w:p>
+        </w:tc>
+        <w:tc>
+          <w:tcPr>
+            <w:tcW w:w="648" w:type="dxa"/>
+          </w:tcPr>
+          <w:p>
+            <w:r>
+              <w:t>warn</w:t>
+            </w:r>
+          </w:p>
+        </w:tc>
+        <w:tc>
+          <w:tcPr>
+            <w:tcW w:w="3022" w:type="dxa"/>
+          </w:tcPr>
+          <w:p>
+            <w:proofErr w:type="spellStart"/>
+            <w:proofErr w:type="gramStart"/>
+            <w:r>
+              <w:t>Microsoft.AspNetCore.Components.Endpoints</w:t>
+            </w:r>
+            <w:proofErr w:type="gramEnd"/>
+            <w:r>
+              <w:t>.</w:t>
+            </w:r>
+            <w:proofErr w:type="gramStart"/>
+            <w:r>
+              <w:t>TempDataService</w:t>
+            </w:r>
+            <w:proofErr w:type="spellEnd"/>
+            <w:r>
+              <w:t>[</w:t>
+            </w:r>
+            <w:proofErr w:type="gramEnd"/>
+            <w:r>
+              <w:t>1]</w:t>
+            </w:r>
+          </w:p>
+        </w:tc>
+        <w:tc>
+          <w:tcPr>
+            <w:tcW w:w="3531" w:type="dxa"/>
+          </w:tcPr>
+          <w:p>
+            <w:proofErr w:type="spellStart"/>
+            <w:r>
+              <w:t>TempData</w:t>
+            </w:r>
+            <w:proofErr w:type="spellEnd"/>
+            <w:r>
+              <w:t xml:space="preserve"> values written during or after streaming SSR cannot be persisted by the cookie </w:t>
+            </w:r>
+            <w:proofErr w:type="spellStart"/>
+            <w:r>
+              <w:t>TempData</w:t>
+            </w:r>
+            <w:proofErr w:type="spellEnd"/>
+            <w:r>
+              <w:t xml:space="preserve"> provider because the response has already started. Switch to the session-storage </w:t>
+            </w:r>
+            <w:proofErr w:type="spellStart"/>
+            <w:r>
+              <w:t>TempData</w:t>
+            </w:r>
+            <w:proofErr w:type="spellEnd"/>
+            <w:r>
+              <w:t xml:space="preserve"> provider (</w:t>
+            </w:r>
+            <w:proofErr w:type="spellStart"/>
+            <w:r>
+              <w:t>RazorComponentsServiceOptions.TempDataProviderType</w:t>
+            </w:r>
+            <w:proofErr w:type="spellEnd"/>
+            <w:r>
+              <w:t xml:space="preserve"> = </w:t>
+            </w:r>
+            <w:proofErr w:type="spellStart"/>
+            <w:r>
+              <w:t>TempDataProviderType.SessionStorage</w:t>
+            </w:r>
+            <w:proofErr w:type="spellEnd"/>
+            <w:r>
+              <w:t>) to enable persistence in streaming SSR scenarios.</w:t>
+            </w:r>
+          </w:p>
+        </w:tc>
+        <w:tc>
+          <w:tcPr>
+            <w:tcW w:w="964" w:type="dxa"/>
+          </w:tcPr>
+          <w:p>
+            <w:hyperlink r:id="rId60" w:history="1">
+              <w:r>
+                <w:rPr>
+                  <w:rStyle w:val="Hyperlink"/>
+                </w:rPr>
+                <w:t>console warning</w:t>
+              </w:r>
+            </w:hyperlink>
+          </w:p>
+        </w:tc>
+      </w:tr>
+      <w:tr>
+        <w:tc>
+          <w:tcPr>
+            <w:tcW w:w="1185" w:type="dxa"/>
+          </w:tcPr>
+          <w:p>
+            <w:r>
+              <w:t xml:space="preserve">Cookie pre-await </w:t>
+            </w:r>
+            <w:proofErr w:type="spellStart"/>
+            <w:r>
+              <w:t>TempData</w:t>
+            </w:r>
+            <w:proofErr w:type="spellEnd"/>
+            <w:r>
+              <w:t xml:space="preserve"> failure</w:t>
+            </w:r>
+          </w:p>
+        </w:tc>
+        <w:tc>
+          <w:tcPr>
+            <w:tcW w:w="648" w:type="dxa"/>
+          </w:tcPr>
+          <w:p>
+            <w:r>
+              <w:t>warn</w:t>
+            </w:r>
+          </w:p>
+        </w:tc>
+        <w:tc>
+          <w:tcPr>
+            <w:tcW w:w="3022" w:type="dxa"/>
+          </w:tcPr>
+          <w:p>
+            <w:proofErr w:type="spellStart"/>
+            <w:proofErr w:type="gramStart"/>
+            <w:r>
+              <w:t>Microsoft.AspNetCore.Components.Endpoints</w:t>
+            </w:r>
+            <w:proofErr w:type="gramEnd"/>
+            <w:r>
+              <w:t>.</w:t>
+            </w:r>
+            <w:proofErr w:type="gramStart"/>
+            <w:r>
+              <w:t>TempDataService</w:t>
+            </w:r>
+            <w:proofErr w:type="spellEnd"/>
+            <w:r>
+              <w:t>[</w:t>
+            </w:r>
+            <w:proofErr w:type="gramEnd"/>
+            <w:r>
+              <w:t>1]</w:t>
+            </w:r>
+          </w:p>
+        </w:tc>
+        <w:tc>
+          <w:tcPr>
+            <w:tcW w:w="3531" w:type="dxa"/>
+          </w:tcPr>
+          <w:p>
+            <w:proofErr w:type="spellStart"/>
+            <w:r>
+              <w:t>TempData</w:t>
+            </w:r>
+            <w:proofErr w:type="spellEnd"/>
+            <w:r>
+              <w:t xml:space="preserve"> values written during or after streaming SSR cannot be persisted by the cookie </w:t>
+            </w:r>
+            <w:proofErr w:type="spellStart"/>
+            <w:r>
+              <w:t>TempData</w:t>
+            </w:r>
+            <w:proofErr w:type="spellEnd"/>
+            <w:r>
+              <w:t xml:space="preserve"> provider because the response has already started. Switch to the session-storage </w:t>
+            </w:r>
+            <w:proofErr w:type="spellStart"/>
+            <w:r>
+              <w:t>TempData</w:t>
+            </w:r>
+            <w:proofErr w:type="spellEnd"/>
+            <w:r>
+              <w:t xml:space="preserve"> provider (</w:t>
+            </w:r>
+            <w:proofErr w:type="spellStart"/>
+            <w:r>
+              <w:t>RazorComponentsServiceOptions.TempDataProviderType</w:t>
+            </w:r>
+            <w:proofErr w:type="spellEnd"/>
+            <w:r>
+              <w:t xml:space="preserve"> = </w:t>
+            </w:r>
+            <w:proofErr w:type="spellStart"/>
+            <w:r>
+              <w:t>TempDataProviderType.SessionStorage</w:t>
+            </w:r>
+            <w:proofErr w:type="spellEnd"/>
+            <w:r>
+              <w:t>) to enable persistence in streaming SSR scenarios.</w:t>
+            </w:r>
+          </w:p>
+        </w:tc>
+        <w:tc>
+          <w:tcPr>
+            <w:tcW w:w="964" w:type="dxa"/>
+          </w:tcPr>
+          <w:p>
+            <w:hyperlink r:id="rId61" w:history="1">
+              <w:r>
+                <w:rPr>
+                  <w:rStyle w:val="Hyperlink"/>
+                </w:rPr>
+                <w:t>warning</w:t>
+              </w:r>
+            </w:hyperlink>
+          </w:p>
+        </w:tc>
+      </w:tr>
+      <w:tr>
+        <w:tc>
+          <w:tcPr>
+            <w:tcW w:w="1185" w:type="dxa"/>
+          </w:tcPr>
+          <w:p>
+            <w:r>
+              <w:lastRenderedPageBreak/>
+              <w:t>Late session subscription failure</w:t>
+            </w:r>
+          </w:p>
+        </w:tc>
+        <w:tc>
+          <w:tcPr>
+            <w:tcW w:w="648" w:type="dxa"/>
+          </w:tcPr>
+          <w:p>
+            <w:r>
+              <w:t>warn</w:t>
+            </w:r>
+          </w:p>
+        </w:tc>
+        <w:tc>
+          <w:tcPr>
+            <w:tcW w:w="3022" w:type="dxa"/>
+          </w:tcPr>
+          <w:p>
+            <w:proofErr w:type="gramStart"/>
+            <w:r>
+              <w:t>Microsoft.AspNetCore.Components.Endpoints</w:t>
+            </w:r>
+            <w:proofErr w:type="gramEnd"/>
+            <w:r>
+              <w:t>.</w:t>
+            </w:r>
+            <w:proofErr w:type="gramStart"/>
+            <w:r>
+              <w:t>SessionEstablishmentHelper[</w:t>
+            </w:r>
+            <w:proofErr w:type="gramEnd"/>
+            <w:r>
+              <w:t>1]</w:t>
+            </w:r>
+          </w:p>
+        </w:tc>
+        <w:tc>
+          <w:tcPr>
+            <w:tcW w:w="3531" w:type="dxa"/>
+          </w:tcPr>
+          <w:p>
+            <w:r>
+              <w:t xml:space="preserve">Session state </w:t>
+            </w:r>
+            <w:proofErr w:type="gramStart"/>
+            <w:r>
+              <w:t>was not persisted</w:t>
+            </w:r>
+            <w:proofErr w:type="gramEnd"/>
+            <w:r>
+              <w:t xml:space="preserve"> </w:t>
+            </w:r>
+            <w:proofErr w:type="gramStart"/>
+            <w:r>
+              <w:t>to</w:t>
+            </w:r>
+            <w:proofErr w:type="gramEnd"/>
+            <w:r>
+              <w:t xml:space="preserve"> the next request. The response has already started, so the session cookie can no longer be issued. To avoid this, place at least one [</w:t>
+            </w:r>
+            <w:proofErr w:type="spellStart"/>
+            <w:r>
+              <w:t>SupplyParameterFromSession</w:t>
+            </w:r>
+            <w:proofErr w:type="spellEnd"/>
+            <w:r>
+              <w:t xml:space="preserve">] (or use </w:t>
+            </w:r>
+            <w:proofErr w:type="spellStart"/>
+            <w:r>
+              <w:t>Session.Set</w:t>
+            </w:r>
+            <w:proofErr w:type="spellEnd"/>
+            <w:r>
+              <w:t xml:space="preserve"> directly) before any await that triggers the first response flush.</w:t>
+            </w:r>
+          </w:p>
+          <w:p/>
+        </w:tc>
+        <w:tc>
+          <w:tcPr>
+            <w:tcW w:w="964" w:type="dxa"/>
+          </w:tcPr>
+          <w:p>
+            <w:hyperlink r:id="rId62" w:history="1">
+              <w:r>
+                <w:rPr>
+                  <w:rStyle w:val="Hyperlink"/>
+                </w:rPr>
+                <w:t>late-subscription warning timing</w:t>
+              </w:r>
+            </w:hyperlink>
+          </w:p>
+        </w:tc>
+      </w:tr>
+    </w:tbl>
+    <w:p/>
+    <w:p>
+      <w:pPr>
+        <w:rPr>
+          <w:b/>
+          <w:bCs/>
+          <w:sz w:val="28"/>
+          <w:szCs w:val="28"/>
+        </w:rPr>
+      </w:pPr>
+      <w:r>
+        <w:rPr>
+          <w:b/>
+          <w:bCs/>
+          <w:sz w:val="28"/>
+          <w:szCs w:val="28"/>
+        </w:rPr>
+        <w:t>Timing and Order</w:t>
       </w:r>
     </w:p>
     <w:tbl>
@@ -289,15 +2747,15 @@
         <w:tblDescription w:val=""/>
       </w:tblPr>
       <w:tblGrid>
-        <w:gridCol w:w="885"/>
-        <w:gridCol w:w="3454"/>
-        <w:gridCol w:w="933"/>
-        <w:gridCol w:w="4068"/>
+        <w:gridCol w:w="796"/>
+        <w:gridCol w:w="1642"/>
+        <w:gridCol w:w="2156"/>
+        <w:gridCol w:w="4746"/>
       </w:tblGrid>
       <w:tr>
         <w:tc>
           <w:tcPr>
-            <w:tcW w:w="960" w:type="dxa"/>
+            <w:tcW w:w="1263" w:type="dxa"/>
             <w:tcBorders>
               <w:top w:val="single" w:sz="8" w:space="0" w:color="A3A3A3"/>
               <w:left w:val="single" w:sz="8" w:space="0" w:color="A3A3A3"/>
@@ -314,22 +2772,18 @@
             <w:hideMark/>
           </w:tcPr>
           <w:p>
-            <w:proofErr w:type="spellStart"/>
-            <w:proofErr w:type="gramStart"/>
             <w:r>
               <w:rPr>
                 <w:b/>
                 <w:bCs/>
               </w:rPr>
-              <w:t>S.No</w:t>
-            </w:r>
-            <w:proofErr w:type="spellEnd"/>
-            <w:proofErr w:type="gramEnd"/>
-          </w:p>
-        </w:tc>
-        <w:tc>
-          <w:tcPr>
-            <w:tcW w:w="4182" w:type="dxa"/>
+              <w:t>Variant</w:t>
+            </w:r>
+          </w:p>
+        </w:tc>
+        <w:tc>
+          <w:tcPr>
+            <w:tcW w:w="3078" w:type="dxa"/>
             <w:tcBorders>
               <w:top w:val="single" w:sz="8" w:space="0" w:color="A3A3A3"/>
               <w:left w:val="single" w:sz="8" w:space="0" w:color="A3A3A3"/>
@@ -351,13 +2805,13 @@
                 <w:b/>
                 <w:bCs/>
               </w:rPr>
-              <w:t>Scenario</w:t>
-            </w:r>
-          </w:p>
-        </w:tc>
-        <w:tc>
-          <w:tcPr>
-            <w:tcW w:w="960" w:type="dxa"/>
+              <w:t>Response start / subscription / write order</w:t>
+            </w:r>
+          </w:p>
+        </w:tc>
+        <w:tc>
+          <w:tcPr>
+            <w:tcW w:w="3623" w:type="dxa"/>
             <w:tcBorders>
               <w:top w:val="single" w:sz="8" w:space="0" w:color="A3A3A3"/>
               <w:left w:val="single" w:sz="8" w:space="0" w:color="A3A3A3"/>
@@ -379,13 +2833,13 @@
                 <w:b/>
                 <w:bCs/>
               </w:rPr>
-              <w:t>Result</w:t>
-            </w:r>
-          </w:p>
-        </w:tc>
-        <w:tc>
-          <w:tcPr>
-            <w:tcW w:w="4807" w:type="dxa"/>
+              <w:t>Observed result</w:t>
+            </w:r>
+          </w:p>
+        </w:tc>
+        <w:tc>
+          <w:tcPr>
+            <w:tcW w:w="1376" w:type="dxa"/>
             <w:tcBorders>
               <w:top w:val="single" w:sz="8" w:space="0" w:color="A3A3A3"/>
               <w:left w:val="single" w:sz="8" w:space="0" w:color="A3A3A3"/>
@@ -393,15 +2847,14 @@
               <w:right w:val="single" w:sz="8" w:space="0" w:color="A3A3A3"/>
             </w:tcBorders>
             <w:shd w:val="clear" w:color="auto" w:fill="F5F5F5"/>
-            <w:tcMar>
-              <w:top w:w="80" w:type="dxa"/>
-              <w:left w:w="80" w:type="dxa"/>
-              <w:bottom w:w="80" w:type="dxa"/>
-              <w:right w:w="80" w:type="dxa"/>
-            </w:tcMar>
-            <w:hideMark/>
-          </w:tcPr>
-          <w:p>
+          </w:tcPr>
+          <w:p>
+            <w:pPr>
+              <w:rPr>
+                <w:b/>
+                <w:bCs/>
+              </w:rPr>
+            </w:pPr>
             <w:r>
               <w:rPr>
                 <w:b/>
@@ -415,126 +2868,133 @@
       <w:tr>
         <w:tc>
           <w:tcPr>
-            <w:tcW w:w="960" w:type="dxa"/>
-            <w:tcBorders>
-              <w:top w:val="single" w:sz="8" w:space="0" w:color="A3A3A3"/>
-              <w:left w:val="single" w:sz="8" w:space="0" w:color="A3A3A3"/>
-              <w:bottom w:val="single" w:sz="8" w:space="0" w:color="A3A3A3"/>
-              <w:right w:val="single" w:sz="8" w:space="0" w:color="A3A3A3"/>
-            </w:tcBorders>
-            <w:tcMar>
-              <w:top w:w="80" w:type="dxa"/>
-              <w:left w:w="80" w:type="dxa"/>
-              <w:bottom w:w="80" w:type="dxa"/>
-              <w:right w:w="80" w:type="dxa"/>
-            </w:tcMar>
-            <w:hideMark/>
-          </w:tcPr>
-          <w:p>
-            <w:r>
-              <w:t>01</w:t>
-            </w:r>
-          </w:p>
-        </w:tc>
-        <w:tc>
-          <w:tcPr>
-            <w:tcW w:w="4182" w:type="dxa"/>
-            <w:tcBorders>
-              <w:top w:val="single" w:sz="8" w:space="0" w:color="A3A3A3"/>
-              <w:left w:val="single" w:sz="8" w:space="0" w:color="A3A3A3"/>
-              <w:bottom w:val="single" w:sz="8" w:space="0" w:color="A3A3A3"/>
-              <w:right w:val="single" w:sz="8" w:space="0" w:color="A3A3A3"/>
-            </w:tcBorders>
-            <w:tcMar>
-              <w:top w:w="80" w:type="dxa"/>
-              <w:left w:w="80" w:type="dxa"/>
-              <w:bottom w:w="80" w:type="dxa"/>
-              <w:right w:w="80" w:type="dxa"/>
-            </w:tcMar>
-            <w:hideMark/>
-          </w:tcPr>
-          <w:p>
-            <w:r>
-              <w:t xml:space="preserve">Cookie storage + write after first flush: reader empty and warning </w:t>
-            </w:r>
-            <w:r>
-              <w:t>recommend</w:t>
-            </w:r>
-            <w:r>
-              <w:t xml:space="preserve"> session storage</w:t>
-            </w:r>
-          </w:p>
-        </w:tc>
-        <w:tc>
-          <w:tcPr>
-            <w:tcW w:w="960" w:type="dxa"/>
-            <w:tcBorders>
-              <w:top w:val="single" w:sz="8" w:space="0" w:color="A3A3A3"/>
-              <w:left w:val="single" w:sz="8" w:space="0" w:color="A3A3A3"/>
-              <w:bottom w:val="single" w:sz="8" w:space="0" w:color="A3A3A3"/>
-              <w:right w:val="single" w:sz="8" w:space="0" w:color="A3A3A3"/>
-            </w:tcBorders>
-            <w:tcMar>
-              <w:top w:w="80" w:type="dxa"/>
-              <w:left w:w="80" w:type="dxa"/>
-              <w:bottom w:w="80" w:type="dxa"/>
-              <w:right w:w="80" w:type="dxa"/>
-            </w:tcMar>
-            <w:hideMark/>
-          </w:tcPr>
-          <w:p>
-            <w:r>
-              <w:t>Pass</w:t>
-            </w:r>
-          </w:p>
-        </w:tc>
-        <w:tc>
-          <w:tcPr>
-            <w:tcW w:w="4968" w:type="dxa"/>
-            <w:tcBorders>
-              <w:top w:val="single" w:sz="8" w:space="0" w:color="A3A3A3"/>
-              <w:left w:val="single" w:sz="8" w:space="0" w:color="A3A3A3"/>
-              <w:bottom w:val="single" w:sz="8" w:space="0" w:color="A3A3A3"/>
-              <w:right w:val="single" w:sz="8" w:space="0" w:color="A3A3A3"/>
-            </w:tcBorders>
-            <w:tcMar>
-              <w:top w:w="80" w:type="dxa"/>
-              <w:left w:w="80" w:type="dxa"/>
-              <w:bottom w:w="80" w:type="dxa"/>
-              <w:right w:w="80" w:type="dxa"/>
-            </w:tcMar>
-            <w:hideMark/>
-          </w:tcPr>
-          <w:p>
-            <w:hyperlink r:id="rId8" w:history="1">
-              <w:r>
-                <w:rPr>
-                  <w:rStyle w:val="Hyperlink"/>
-                </w:rPr>
-                <w:t>reader no message</w:t>
+            <w:tcW w:w="1263" w:type="dxa"/>
+            <w:tcBorders>
+              <w:top w:val="single" w:sz="8" w:space="0" w:color="A3A3A3"/>
+              <w:left w:val="single" w:sz="8" w:space="0" w:color="A3A3A3"/>
+              <w:bottom w:val="single" w:sz="8" w:space="0" w:color="A3A3A3"/>
+              <w:right w:val="single" w:sz="8" w:space="0" w:color="A3A3A3"/>
+            </w:tcBorders>
+            <w:shd w:val="clear" w:color="auto" w:fill="F5F5F5"/>
+            <w:tcMar>
+              <w:top w:w="80" w:type="dxa"/>
+              <w:left w:w="80" w:type="dxa"/>
+              <w:bottom w:w="80" w:type="dxa"/>
+              <w:right w:w="80" w:type="dxa"/>
+            </w:tcMar>
+            <w:hideMark/>
+          </w:tcPr>
+          <w:p>
+            <w:r>
+              <w:rPr>
+                <w:b/>
+                <w:bCs/>
+              </w:rPr>
+              <w:t>Cookie post-await</w:t>
+            </w:r>
+          </w:p>
+        </w:tc>
+        <w:tc>
+          <w:tcPr>
+            <w:tcW w:w="3078" w:type="dxa"/>
+            <w:tcBorders>
+              <w:top w:val="single" w:sz="8" w:space="0" w:color="A3A3A3"/>
+              <w:left w:val="single" w:sz="8" w:space="0" w:color="A3A3A3"/>
+              <w:bottom w:val="single" w:sz="8" w:space="0" w:color="A3A3A3"/>
+              <w:right w:val="single" w:sz="8" w:space="0" w:color="A3A3A3"/>
+            </w:tcBorders>
+            <w:tcMar>
+              <w:top w:w="80" w:type="dxa"/>
+              <w:left w:w="80" w:type="dxa"/>
+              <w:bottom w:w="80" w:type="dxa"/>
+              <w:right w:w="80" w:type="dxa"/>
+            </w:tcMar>
+            <w:hideMark/>
+          </w:tcPr>
+          <w:p>
+            <w:r>
+              <w:t xml:space="preserve">Streaming response starts → delay executes → </w:t>
+            </w:r>
+            <w:proofErr w:type="spellStart"/>
+            <w:r>
+              <w:t>TempData</w:t>
+            </w:r>
+            <w:proofErr w:type="spellEnd"/>
+            <w:r>
+              <w:t xml:space="preserve"> write occurs after the response has started</w:t>
+            </w:r>
+          </w:p>
+        </w:tc>
+        <w:tc>
+          <w:tcPr>
+            <w:tcW w:w="3623" w:type="dxa"/>
+            <w:tcBorders>
+              <w:top w:val="single" w:sz="8" w:space="0" w:color="A3A3A3"/>
+              <w:left w:val="single" w:sz="8" w:space="0" w:color="A3A3A3"/>
+              <w:bottom w:val="single" w:sz="8" w:space="0" w:color="A3A3A3"/>
+              <w:right w:val="single" w:sz="8" w:space="0" w:color="A3A3A3"/>
+            </w:tcBorders>
+            <w:tcMar>
+              <w:top w:w="80" w:type="dxa"/>
+              <w:left w:w="80" w:type="dxa"/>
+              <w:bottom w:w="80" w:type="dxa"/>
+              <w:right w:w="80" w:type="dxa"/>
+            </w:tcMar>
+            <w:hideMark/>
+          </w:tcPr>
+          <w:p>
+            <w:r>
+              <w:t xml:space="preserve">Cookie-backed </w:t>
+            </w:r>
+            <w:proofErr w:type="spellStart"/>
+            <w:r>
+              <w:t>TempData</w:t>
+            </w:r>
+            <w:proofErr w:type="spellEnd"/>
+            <w:r>
+              <w:t xml:space="preserve"> </w:t>
+            </w:r>
+            <w:proofErr w:type="gramStart"/>
+            <w:r>
+              <w:t>isn't persisted</w:t>
+            </w:r>
+            <w:proofErr w:type="gramEnd"/>
+            <w:r>
+              <w:t>; subsequent reader doesn't contain the value</w:t>
+            </w:r>
+          </w:p>
+        </w:tc>
+        <w:tc>
+          <w:tcPr>
+            <w:tcW w:w="1376" w:type="dxa"/>
+            <w:tcBorders>
+              <w:top w:val="single" w:sz="8" w:space="0" w:color="A3A3A3"/>
+              <w:left w:val="single" w:sz="8" w:space="0" w:color="A3A3A3"/>
+              <w:bottom w:val="single" w:sz="8" w:space="0" w:color="A3A3A3"/>
+              <w:right w:val="single" w:sz="8" w:space="0" w:color="A3A3A3"/>
+            </w:tcBorders>
+          </w:tcPr>
+          <w:p>
+            <w:hyperlink r:id="rId63" w:history="1">
+              <w:r>
+                <w:rPr>
+                  <w:rStyle w:val="Hyperlink"/>
+                </w:rPr>
+                <w:t>cookie post-await request timing</w:t>
               </w:r>
             </w:hyperlink>
             <w:r>
               <w:t xml:space="preserve">, </w:t>
             </w:r>
-            <w:hyperlink r:id="rId9" w:history="1">
-              <w:r>
-                <w:rPr>
-                  <w:rStyle w:val="Hyperlink"/>
-                </w:rPr>
-                <w:t>console warning</w:t>
-              </w:r>
-            </w:hyperlink>
-            <w:r>
-              <w:t xml:space="preserve">, </w:t>
-            </w:r>
-            <w:hyperlink r:id="rId10" w:history="1">
-              <w:r>
-                <w:rPr>
-                  <w:rStyle w:val="Hyperlink"/>
-                </w:rPr>
-                <w:t>post-await warning</w:t>
-              </w:r>
+            <w:hyperlink r:id="rId64" w:history="1">
+              <w:proofErr w:type="spellStart"/>
+              <w:r>
+                <w:rPr>
+                  <w:rStyle w:val="Hyperlink"/>
+                </w:rPr>
+                <w:t>cookie_post_await_reader_first_load</w:t>
+              </w:r>
+              <w:proofErr w:type="spellEnd"/>
             </w:hyperlink>
           </w:p>
         </w:tc>
@@ -542,131 +3002,156 @@
       <w:tr>
         <w:tc>
           <w:tcPr>
-            <w:tcW w:w="960" w:type="dxa"/>
-            <w:tcBorders>
-              <w:top w:val="single" w:sz="8" w:space="0" w:color="A3A3A3"/>
-              <w:left w:val="single" w:sz="8" w:space="0" w:color="A3A3A3"/>
-              <w:bottom w:val="single" w:sz="8" w:space="0" w:color="A3A3A3"/>
-              <w:right w:val="single" w:sz="8" w:space="0" w:color="A3A3A3"/>
-            </w:tcBorders>
-            <w:tcMar>
-              <w:top w:w="80" w:type="dxa"/>
-              <w:left w:w="80" w:type="dxa"/>
-              <w:bottom w:w="80" w:type="dxa"/>
-              <w:right w:w="80" w:type="dxa"/>
-            </w:tcMar>
-            <w:hideMark/>
-          </w:tcPr>
-          <w:p>
-            <w:r>
-              <w:t>02</w:t>
-            </w:r>
-          </w:p>
-        </w:tc>
-        <w:tc>
-          <w:tcPr>
-            <w:tcW w:w="4182" w:type="dxa"/>
-            <w:tcBorders>
-              <w:top w:val="single" w:sz="8" w:space="0" w:color="A3A3A3"/>
-              <w:left w:val="single" w:sz="8" w:space="0" w:color="A3A3A3"/>
-              <w:bottom w:val="single" w:sz="8" w:space="0" w:color="A3A3A3"/>
-              <w:right w:val="single" w:sz="8" w:space="0" w:color="A3A3A3"/>
-            </w:tcBorders>
-            <w:tcMar>
-              <w:top w:w="80" w:type="dxa"/>
-              <w:left w:w="80" w:type="dxa"/>
-              <w:bottom w:w="80" w:type="dxa"/>
-              <w:right w:w="80" w:type="dxa"/>
-            </w:tcMar>
-            <w:hideMark/>
-          </w:tcPr>
-          <w:p>
-            <w:r>
-              <w:t>Cookie storage + assignment before delay still fails if response started</w:t>
-            </w:r>
-          </w:p>
-        </w:tc>
-        <w:tc>
-          <w:tcPr>
-            <w:tcW w:w="960" w:type="dxa"/>
-            <w:tcBorders>
-              <w:top w:val="single" w:sz="8" w:space="0" w:color="A3A3A3"/>
-              <w:left w:val="single" w:sz="8" w:space="0" w:color="A3A3A3"/>
-              <w:bottom w:val="single" w:sz="8" w:space="0" w:color="A3A3A3"/>
-              <w:right w:val="single" w:sz="8" w:space="0" w:color="A3A3A3"/>
-            </w:tcBorders>
-            <w:tcMar>
-              <w:top w:w="80" w:type="dxa"/>
-              <w:left w:w="80" w:type="dxa"/>
-              <w:bottom w:w="80" w:type="dxa"/>
-              <w:right w:w="80" w:type="dxa"/>
-            </w:tcMar>
-            <w:hideMark/>
-          </w:tcPr>
-          <w:p>
-            <w:r>
-              <w:t>Pass</w:t>
-            </w:r>
-          </w:p>
-        </w:tc>
-        <w:tc>
-          <w:tcPr>
-            <w:tcW w:w="4968" w:type="dxa"/>
-            <w:tcBorders>
-              <w:top w:val="single" w:sz="8" w:space="0" w:color="A3A3A3"/>
-              <w:left w:val="single" w:sz="8" w:space="0" w:color="A3A3A3"/>
-              <w:bottom w:val="single" w:sz="8" w:space="0" w:color="A3A3A3"/>
-              <w:right w:val="single" w:sz="8" w:space="0" w:color="A3A3A3"/>
-            </w:tcBorders>
-            <w:tcMar>
-              <w:top w:w="80" w:type="dxa"/>
-              <w:left w:w="80" w:type="dxa"/>
-              <w:bottom w:w="80" w:type="dxa"/>
-              <w:right w:w="80" w:type="dxa"/>
-            </w:tcMar>
-            <w:hideMark/>
-          </w:tcPr>
-          <w:p>
-            <w:hyperlink r:id="rId11" w:history="1">
-              <w:r>
-                <w:rPr>
-                  <w:rStyle w:val="Hyperlink"/>
-                </w:rPr>
-                <w:t>pre-await input</w:t>
-              </w:r>
-            </w:hyperlink>
-            <w:r>
-              <w:t xml:space="preserve">, </w:t>
-            </w:r>
-            <w:hyperlink r:id="rId12" w:history="1">
-              <w:r>
-                <w:rPr>
-                  <w:rStyle w:val="Hyperlink"/>
-                </w:rPr>
-                <w:t>reader first load</w:t>
-              </w:r>
-            </w:hyperlink>
-            <w:r>
-              <w:t xml:space="preserve">, </w:t>
-            </w:r>
-            <w:hyperlink r:id="rId13" w:history="1">
-              <w:r>
-                <w:rPr>
-                  <w:rStyle w:val="Hyperlink"/>
-                </w:rPr>
-                <w:t>reader refresh</w:t>
-              </w:r>
-            </w:hyperlink>
-            <w:r>
-              <w:t xml:space="preserve">, </w:t>
-            </w:r>
-            <w:hyperlink r:id="rId14" w:history="1">
-              <w:r>
-                <w:rPr>
-                  <w:rStyle w:val="Hyperlink"/>
-                </w:rPr>
-                <w:t>warning</w:t>
-              </w:r>
+            <w:tcW w:w="1263" w:type="dxa"/>
+            <w:tcBorders>
+              <w:top w:val="single" w:sz="8" w:space="0" w:color="A3A3A3"/>
+              <w:left w:val="single" w:sz="8" w:space="0" w:color="A3A3A3"/>
+              <w:bottom w:val="single" w:sz="8" w:space="0" w:color="A3A3A3"/>
+              <w:right w:val="single" w:sz="8" w:space="0" w:color="A3A3A3"/>
+            </w:tcBorders>
+            <w:shd w:val="clear" w:color="auto" w:fill="F5F5F5"/>
+            <w:tcMar>
+              <w:top w:w="80" w:type="dxa"/>
+              <w:left w:w="80" w:type="dxa"/>
+              <w:bottom w:w="80" w:type="dxa"/>
+              <w:right w:w="80" w:type="dxa"/>
+            </w:tcMar>
+            <w:hideMark/>
+          </w:tcPr>
+          <w:p>
+            <w:r>
+              <w:rPr>
+                <w:b/>
+                <w:bCs/>
+              </w:rPr>
+              <w:t>Cookie pre-</w:t>
+            </w:r>
+            <w:proofErr w:type="gramStart"/>
+            <w:r>
+              <w:rPr>
+                <w:b/>
+                <w:bCs/>
+              </w:rPr>
+              <w:t>await</w:t>
+            </w:r>
+            <w:proofErr w:type="gramEnd"/>
+          </w:p>
+        </w:tc>
+        <w:tc>
+          <w:tcPr>
+            <w:tcW w:w="3078" w:type="dxa"/>
+            <w:tcBorders>
+              <w:top w:val="single" w:sz="8" w:space="0" w:color="A3A3A3"/>
+              <w:left w:val="single" w:sz="8" w:space="0" w:color="A3A3A3"/>
+              <w:bottom w:val="single" w:sz="8" w:space="0" w:color="A3A3A3"/>
+              <w:right w:val="single" w:sz="8" w:space="0" w:color="A3A3A3"/>
+            </w:tcBorders>
+            <w:tcMar>
+              <w:top w:w="80" w:type="dxa"/>
+              <w:left w:w="80" w:type="dxa"/>
+              <w:bottom w:w="80" w:type="dxa"/>
+              <w:right w:w="80" w:type="dxa"/>
+            </w:tcMar>
+            <w:hideMark/>
+          </w:tcPr>
+          <w:p>
+            <w:r>
+              <w:t xml:space="preserve">Streaming response has already started → </w:t>
+            </w:r>
+            <w:proofErr w:type="spellStart"/>
+            <w:r>
+              <w:t>TempData</w:t>
+            </w:r>
+            <w:proofErr w:type="spellEnd"/>
+            <w:r>
+              <w:t xml:space="preserve"> assignment occurs before the artificial delay → </w:t>
+            </w:r>
+            <w:r>
+              <w:lastRenderedPageBreak/>
+              <w:t>delayed work executes</w:t>
+            </w:r>
+          </w:p>
+        </w:tc>
+        <w:tc>
+          <w:tcPr>
+            <w:tcW w:w="3623" w:type="dxa"/>
+            <w:tcBorders>
+              <w:top w:val="single" w:sz="8" w:space="0" w:color="A3A3A3"/>
+              <w:left w:val="single" w:sz="8" w:space="0" w:color="A3A3A3"/>
+              <w:bottom w:val="single" w:sz="8" w:space="0" w:color="A3A3A3"/>
+              <w:right w:val="single" w:sz="8" w:space="0" w:color="A3A3A3"/>
+            </w:tcBorders>
+            <w:tcMar>
+              <w:top w:w="80" w:type="dxa"/>
+              <w:left w:w="80" w:type="dxa"/>
+              <w:bottom w:w="80" w:type="dxa"/>
+              <w:right w:w="80" w:type="dxa"/>
+            </w:tcMar>
+            <w:hideMark/>
+          </w:tcPr>
+          <w:p>
+            <w:r>
+              <w:lastRenderedPageBreak/>
+              <w:t xml:space="preserve">Cookie-backed </w:t>
+            </w:r>
+            <w:proofErr w:type="spellStart"/>
+            <w:r>
+              <w:t>TempData</w:t>
+            </w:r>
+            <w:proofErr w:type="spellEnd"/>
+            <w:r>
+              <w:t xml:space="preserve"> still </w:t>
+            </w:r>
+            <w:proofErr w:type="gramStart"/>
+            <w:r>
+              <w:t>isn't persisted</w:t>
+            </w:r>
+            <w:proofErr w:type="gramEnd"/>
+            <w:r>
+              <w:t xml:space="preserve"> because response start is the important boundary; subsequent reader doesn't contain the value</w:t>
+            </w:r>
+          </w:p>
+        </w:tc>
+        <w:tc>
+          <w:tcPr>
+            <w:tcW w:w="1376" w:type="dxa"/>
+            <w:tcBorders>
+              <w:top w:val="single" w:sz="8" w:space="0" w:color="A3A3A3"/>
+              <w:left w:val="single" w:sz="8" w:space="0" w:color="A3A3A3"/>
+              <w:bottom w:val="single" w:sz="8" w:space="0" w:color="A3A3A3"/>
+              <w:right w:val="single" w:sz="8" w:space="0" w:color="A3A3A3"/>
+            </w:tcBorders>
+          </w:tcPr>
+          <w:p>
+            <w:hyperlink r:id="rId65" w:history="1">
+              <w:r>
+                <w:rPr>
+                  <w:rStyle w:val="Hyperlink"/>
+                </w:rPr>
+                <w:t xml:space="preserve">cookie pre-await request </w:t>
+              </w:r>
+              <w:proofErr w:type="spellStart"/>
+              <w:r>
+                <w:rPr>
+                  <w:rStyle w:val="Hyperlink"/>
+                </w:rPr>
+                <w:t>timin</w:t>
+              </w:r>
+            </w:hyperlink>
+            <w:r>
+              <w:t>g</w:t>
+            </w:r>
+            <w:r>
+              <w:t>,</w:t>
+            </w:r>
+            <w:hyperlink r:id="rId66" w:history="1">
+              <w:r>
+                <w:rPr>
+                  <w:rStyle w:val="Hyperlink"/>
+                </w:rPr>
+                <w:t>cookie_pre_await_reader_first_load</w:t>
+              </w:r>
+              <w:proofErr w:type="spellEnd"/>
             </w:hyperlink>
           </w:p>
         </w:tc>
@@ -674,131 +3159,147 @@
       <w:tr>
         <w:tc>
           <w:tcPr>
-            <w:tcW w:w="960" w:type="dxa"/>
-            <w:tcBorders>
-              <w:top w:val="single" w:sz="8" w:space="0" w:color="A3A3A3"/>
-              <w:left w:val="single" w:sz="8" w:space="0" w:color="A3A3A3"/>
-              <w:bottom w:val="single" w:sz="8" w:space="0" w:color="A3A3A3"/>
-              <w:right w:val="single" w:sz="8" w:space="0" w:color="A3A3A3"/>
-            </w:tcBorders>
-            <w:tcMar>
-              <w:top w:w="80" w:type="dxa"/>
-              <w:left w:w="80" w:type="dxa"/>
-              <w:bottom w:w="80" w:type="dxa"/>
-              <w:right w:w="80" w:type="dxa"/>
-            </w:tcMar>
-            <w:hideMark/>
-          </w:tcPr>
-          <w:p>
-            <w:r>
-              <w:t>03</w:t>
-            </w:r>
-          </w:p>
-        </w:tc>
-        <w:tc>
-          <w:tcPr>
-            <w:tcW w:w="4209" w:type="dxa"/>
-            <w:tcBorders>
-              <w:top w:val="single" w:sz="8" w:space="0" w:color="A3A3A3"/>
-              <w:left w:val="single" w:sz="8" w:space="0" w:color="A3A3A3"/>
-              <w:bottom w:val="single" w:sz="8" w:space="0" w:color="A3A3A3"/>
-              <w:right w:val="single" w:sz="8" w:space="0" w:color="A3A3A3"/>
-            </w:tcBorders>
-            <w:tcMar>
-              <w:top w:w="80" w:type="dxa"/>
-              <w:left w:w="80" w:type="dxa"/>
-              <w:bottom w:w="80" w:type="dxa"/>
-              <w:right w:w="80" w:type="dxa"/>
-            </w:tcMar>
-            <w:hideMark/>
-          </w:tcPr>
-          <w:p>
-            <w:r>
-              <w:t>Session storage + write after flush succeeds exactly once</w:t>
-            </w:r>
-          </w:p>
-        </w:tc>
-        <w:tc>
-          <w:tcPr>
-            <w:tcW w:w="960" w:type="dxa"/>
-            <w:tcBorders>
-              <w:top w:val="single" w:sz="8" w:space="0" w:color="A3A3A3"/>
-              <w:left w:val="single" w:sz="8" w:space="0" w:color="A3A3A3"/>
-              <w:bottom w:val="single" w:sz="8" w:space="0" w:color="A3A3A3"/>
-              <w:right w:val="single" w:sz="8" w:space="0" w:color="A3A3A3"/>
-            </w:tcBorders>
-            <w:tcMar>
-              <w:top w:w="80" w:type="dxa"/>
-              <w:left w:w="80" w:type="dxa"/>
-              <w:bottom w:w="80" w:type="dxa"/>
-              <w:right w:w="80" w:type="dxa"/>
-            </w:tcMar>
-            <w:hideMark/>
-          </w:tcPr>
-          <w:p>
-            <w:r>
-              <w:t>Pass</w:t>
-            </w:r>
-          </w:p>
-        </w:tc>
-        <w:tc>
-          <w:tcPr>
-            <w:tcW w:w="5056" w:type="dxa"/>
-            <w:tcBorders>
-              <w:top w:val="single" w:sz="8" w:space="0" w:color="A3A3A3"/>
-              <w:left w:val="single" w:sz="8" w:space="0" w:color="A3A3A3"/>
-              <w:bottom w:val="single" w:sz="8" w:space="0" w:color="A3A3A3"/>
-              <w:right w:val="single" w:sz="8" w:space="0" w:color="A3A3A3"/>
-            </w:tcBorders>
-            <w:tcMar>
-              <w:top w:w="80" w:type="dxa"/>
-              <w:left w:w="80" w:type="dxa"/>
-              <w:bottom w:w="80" w:type="dxa"/>
-              <w:right w:w="80" w:type="dxa"/>
-            </w:tcMar>
-            <w:hideMark/>
-          </w:tcPr>
-          <w:p>
-            <w:hyperlink r:id="rId15" w:history="1">
-              <w:r>
-                <w:rPr>
-                  <w:rStyle w:val="Hyperlink"/>
-                </w:rPr>
-                <w:t>request timestamp</w:t>
+            <w:tcW w:w="1263" w:type="dxa"/>
+            <w:tcBorders>
+              <w:top w:val="single" w:sz="8" w:space="0" w:color="A3A3A3"/>
+              <w:left w:val="single" w:sz="8" w:space="0" w:color="A3A3A3"/>
+              <w:bottom w:val="single" w:sz="8" w:space="0" w:color="A3A3A3"/>
+              <w:right w:val="single" w:sz="8" w:space="0" w:color="A3A3A3"/>
+            </w:tcBorders>
+            <w:shd w:val="clear" w:color="auto" w:fill="F5F5F5"/>
+            <w:tcMar>
+              <w:top w:w="80" w:type="dxa"/>
+              <w:left w:w="80" w:type="dxa"/>
+              <w:bottom w:w="80" w:type="dxa"/>
+              <w:right w:w="80" w:type="dxa"/>
+            </w:tcMar>
+            <w:hideMark/>
+          </w:tcPr>
+          <w:p>
+            <w:r>
+              <w:rPr>
+                <w:b/>
+                <w:bCs/>
+              </w:rPr>
+              <w:t>Early-session positive</w:t>
+            </w:r>
+          </w:p>
+        </w:tc>
+        <w:tc>
+          <w:tcPr>
+            <w:tcW w:w="3078" w:type="dxa"/>
+            <w:tcBorders>
+              <w:top w:val="single" w:sz="8" w:space="0" w:color="A3A3A3"/>
+              <w:left w:val="single" w:sz="8" w:space="0" w:color="A3A3A3"/>
+              <w:bottom w:val="single" w:sz="8" w:space="0" w:color="A3A3A3"/>
+              <w:right w:val="single" w:sz="8" w:space="0" w:color="A3A3A3"/>
+            </w:tcBorders>
+            <w:tcMar>
+              <w:top w:w="80" w:type="dxa"/>
+              <w:left w:w="80" w:type="dxa"/>
+              <w:bottom w:w="80" w:type="dxa"/>
+              <w:right w:w="80" w:type="dxa"/>
+            </w:tcMar>
+            <w:hideMark/>
+          </w:tcPr>
+          <w:p>
+            <w:r>
+              <w:t xml:space="preserve">Session is established/subscribed before response </w:t>
+            </w:r>
+            <w:proofErr w:type="gramStart"/>
+            <w:r>
+              <w:t>start →</w:t>
+            </w:r>
+            <w:proofErr w:type="gramEnd"/>
+            <w:r>
+              <w:t xml:space="preserve"> streaming response starts → session-backed value is updated after the delay/flush → request completes</w:t>
+            </w:r>
+          </w:p>
+        </w:tc>
+        <w:tc>
+          <w:tcPr>
+            <w:tcW w:w="3623" w:type="dxa"/>
+            <w:tcBorders>
+              <w:top w:val="single" w:sz="8" w:space="0" w:color="A3A3A3"/>
+              <w:left w:val="single" w:sz="8" w:space="0" w:color="A3A3A3"/>
+              <w:bottom w:val="single" w:sz="8" w:space="0" w:color="A3A3A3"/>
+              <w:right w:val="single" w:sz="8" w:space="0" w:color="A3A3A3"/>
+            </w:tcBorders>
+            <w:tcMar>
+              <w:top w:w="80" w:type="dxa"/>
+              <w:left w:w="80" w:type="dxa"/>
+              <w:bottom w:w="80" w:type="dxa"/>
+              <w:right w:w="80" w:type="dxa"/>
+            </w:tcMar>
+            <w:hideMark/>
+          </w:tcPr>
+          <w:p>
+            <w:r>
+              <w:rPr>
+                <w:b/>
+                <w:bCs/>
+              </w:rPr>
+              <w:t>A subsequent HTTP request retrieves the updated session value, proving persistence beyond the original streaming request</w:t>
+            </w:r>
+          </w:p>
+        </w:tc>
+        <w:tc>
+          <w:tcPr>
+            <w:tcW w:w="1376" w:type="dxa"/>
+            <w:tcBorders>
+              <w:top w:val="single" w:sz="8" w:space="0" w:color="A3A3A3"/>
+              <w:left w:val="single" w:sz="8" w:space="0" w:color="A3A3A3"/>
+              <w:bottom w:val="single" w:sz="8" w:space="0" w:color="A3A3A3"/>
+              <w:right w:val="single" w:sz="8" w:space="0" w:color="A3A3A3"/>
+            </w:tcBorders>
+          </w:tcPr>
+          <w:p>
+            <w:hyperlink r:id="rId67" w:history="1">
+              <w:r>
+                <w:rPr>
+                  <w:rStyle w:val="Hyperlink"/>
+                </w:rPr>
+                <w:t>primer submitted</w:t>
               </w:r>
             </w:hyperlink>
             <w:r>
               <w:t xml:space="preserve">, </w:t>
             </w:r>
-            <w:hyperlink r:id="rId16" w:history="1">
-              <w:r>
-                <w:rPr>
-                  <w:rStyle w:val="Hyperlink"/>
-                </w:rPr>
-                <w:t>session Set-Cookie header</w:t>
+            <w:hyperlink r:id="rId68" w:history="1">
+              <w:r>
+                <w:rPr>
+                  <w:rStyle w:val="Hyperlink"/>
+                </w:rPr>
+                <w:t>positive after submit</w:t>
               </w:r>
             </w:hyperlink>
             <w:r>
               <w:t xml:space="preserve">, </w:t>
             </w:r>
-            <w:hyperlink r:id="rId17" w:history="1">
-              <w:r>
-                <w:rPr>
-                  <w:rStyle w:val="Hyperlink"/>
-                </w:rPr>
-                <w:t>reader first load</w:t>
-              </w:r>
-            </w:hyperlink>
-            <w:r>
-              <w:t xml:space="preserve">, </w:t>
-            </w:r>
-            <w:hyperlink r:id="rId18" w:history="1">
-              <w:r>
-                <w:rPr>
-                  <w:rStyle w:val="Hyperlink"/>
-                </w:rPr>
-                <w:t>reader second load</w:t>
-              </w:r>
+            <w:hyperlink r:id="rId69" w:history="1">
+              <w:proofErr w:type="spellStart"/>
+              <w:r>
+                <w:rPr>
+                  <w:rStyle w:val="Hyperlink"/>
+                </w:rPr>
+                <w:t>positive_before_submit</w:t>
+              </w:r>
+              <w:proofErr w:type="spellEnd"/>
+            </w:hyperlink>
+            <w:r>
+              <w:t>,</w:t>
+            </w:r>
+          </w:p>
+          <w:p>
+            <w:hyperlink r:id="rId70" w:history="1">
+              <w:proofErr w:type="spellStart"/>
+              <w:r>
+                <w:rPr>
+                  <w:rStyle w:val="Hyperlink"/>
+                </w:rPr>
+                <w:t>updated_session_value_is_still_present_after_the_flush</w:t>
+              </w:r>
+              <w:proofErr w:type="spellEnd"/>
             </w:hyperlink>
           </w:p>
         </w:tc>
@@ -806,146 +3307,122 @@
       <w:tr>
         <w:tc>
           <w:tcPr>
-            <w:tcW w:w="960" w:type="dxa"/>
-            <w:tcBorders>
-              <w:top w:val="single" w:sz="8" w:space="0" w:color="A3A3A3"/>
-              <w:left w:val="single" w:sz="8" w:space="0" w:color="A3A3A3"/>
-              <w:bottom w:val="single" w:sz="8" w:space="0" w:color="A3A3A3"/>
-              <w:right w:val="single" w:sz="8" w:space="0" w:color="A3A3A3"/>
-            </w:tcBorders>
-            <w:tcMar>
-              <w:top w:w="80" w:type="dxa"/>
-              <w:left w:w="80" w:type="dxa"/>
-              <w:bottom w:w="80" w:type="dxa"/>
-              <w:right w:w="80" w:type="dxa"/>
-            </w:tcMar>
-            <w:hideMark/>
-          </w:tcPr>
-          <w:p>
-            <w:r>
-              <w:t>04</w:t>
-            </w:r>
-          </w:p>
-        </w:tc>
-        <w:tc>
-          <w:tcPr>
-            <w:tcW w:w="4182" w:type="dxa"/>
-            <w:tcBorders>
-              <w:top w:val="single" w:sz="8" w:space="0" w:color="A3A3A3"/>
-              <w:left w:val="single" w:sz="8" w:space="0" w:color="A3A3A3"/>
-              <w:bottom w:val="single" w:sz="8" w:space="0" w:color="A3A3A3"/>
-              <w:right w:val="single" w:sz="8" w:space="0" w:color="A3A3A3"/>
-            </w:tcBorders>
-            <w:tcMar>
-              <w:top w:w="80" w:type="dxa"/>
-              <w:left w:w="80" w:type="dxa"/>
-              <w:bottom w:w="80" w:type="dxa"/>
-              <w:right w:w="80" w:type="dxa"/>
-            </w:tcMar>
-            <w:hideMark/>
-          </w:tcPr>
-          <w:p>
-            <w:r>
-              <w:t>Early session subscription succeeds, deferred first subscription after flush fails</w:t>
-            </w:r>
-          </w:p>
-        </w:tc>
-        <w:tc>
-          <w:tcPr>
-            <w:tcW w:w="960" w:type="dxa"/>
-            <w:tcBorders>
-              <w:top w:val="single" w:sz="8" w:space="0" w:color="A3A3A3"/>
-              <w:left w:val="single" w:sz="8" w:space="0" w:color="A3A3A3"/>
-              <w:bottom w:val="single" w:sz="8" w:space="0" w:color="A3A3A3"/>
-              <w:right w:val="single" w:sz="8" w:space="0" w:color="A3A3A3"/>
-            </w:tcBorders>
-            <w:tcMar>
-              <w:top w:w="80" w:type="dxa"/>
-              <w:left w:w="80" w:type="dxa"/>
-              <w:bottom w:w="80" w:type="dxa"/>
-              <w:right w:w="80" w:type="dxa"/>
-            </w:tcMar>
-            <w:hideMark/>
-          </w:tcPr>
-          <w:p>
-            <w:r>
-              <w:t>Pass</w:t>
-            </w:r>
-          </w:p>
-        </w:tc>
-        <w:tc>
-          <w:tcPr>
-            <w:tcW w:w="4968" w:type="dxa"/>
-            <w:tcBorders>
-              <w:top w:val="single" w:sz="8" w:space="0" w:color="A3A3A3"/>
-              <w:left w:val="single" w:sz="8" w:space="0" w:color="A3A3A3"/>
-              <w:bottom w:val="single" w:sz="8" w:space="0" w:color="A3A3A3"/>
-              <w:right w:val="single" w:sz="8" w:space="0" w:color="A3A3A3"/>
-            </w:tcBorders>
-            <w:tcMar>
-              <w:top w:w="80" w:type="dxa"/>
-              <w:left w:w="80" w:type="dxa"/>
-              <w:bottom w:w="80" w:type="dxa"/>
-              <w:right w:w="80" w:type="dxa"/>
-            </w:tcMar>
-            <w:hideMark/>
-          </w:tcPr>
-          <w:p>
-            <w:hyperlink r:id="rId19" w:history="1">
-              <w:r>
-                <w:rPr>
-                  <w:rStyle w:val="Hyperlink"/>
-                </w:rPr>
-                <w:t>primer submitted</w:t>
+            <w:tcW w:w="1263" w:type="dxa"/>
+            <w:tcBorders>
+              <w:top w:val="single" w:sz="8" w:space="0" w:color="A3A3A3"/>
+              <w:left w:val="single" w:sz="8" w:space="0" w:color="A3A3A3"/>
+              <w:bottom w:val="single" w:sz="8" w:space="0" w:color="A3A3A3"/>
+              <w:right w:val="single" w:sz="8" w:space="0" w:color="A3A3A3"/>
+            </w:tcBorders>
+            <w:shd w:val="clear" w:color="auto" w:fill="F5F5F5"/>
+            <w:tcMar>
+              <w:top w:w="80" w:type="dxa"/>
+              <w:left w:w="80" w:type="dxa"/>
+              <w:bottom w:w="80" w:type="dxa"/>
+              <w:right w:w="80" w:type="dxa"/>
+            </w:tcMar>
+            <w:hideMark/>
+          </w:tcPr>
+          <w:p>
+            <w:r>
+              <w:rPr>
+                <w:b/>
+                <w:bCs/>
+              </w:rPr>
+              <w:t>Deferred-session negative</w:t>
+            </w:r>
+          </w:p>
+        </w:tc>
+        <w:tc>
+          <w:tcPr>
+            <w:tcW w:w="3078" w:type="dxa"/>
+            <w:tcBorders>
+              <w:top w:val="single" w:sz="8" w:space="0" w:color="A3A3A3"/>
+              <w:left w:val="single" w:sz="8" w:space="0" w:color="A3A3A3"/>
+              <w:bottom w:val="single" w:sz="8" w:space="0" w:color="A3A3A3"/>
+              <w:right w:val="single" w:sz="8" w:space="0" w:color="A3A3A3"/>
+            </w:tcBorders>
+            <w:tcMar>
+              <w:top w:w="80" w:type="dxa"/>
+              <w:left w:w="80" w:type="dxa"/>
+              <w:bottom w:w="80" w:type="dxa"/>
+              <w:right w:w="80" w:type="dxa"/>
+            </w:tcMar>
+            <w:hideMark/>
+          </w:tcPr>
+          <w:p>
+            <w:r>
+              <w:t>Parent response starts streaming → delay executes → deferred child mounts → first session subscription occurs after response start</w:t>
+            </w:r>
+          </w:p>
+        </w:tc>
+        <w:tc>
+          <w:tcPr>
+            <w:tcW w:w="3623" w:type="dxa"/>
+            <w:tcBorders>
+              <w:top w:val="single" w:sz="8" w:space="0" w:color="A3A3A3"/>
+              <w:left w:val="single" w:sz="8" w:space="0" w:color="A3A3A3"/>
+              <w:bottom w:val="single" w:sz="8" w:space="0" w:color="A3A3A3"/>
+              <w:right w:val="single" w:sz="8" w:space="0" w:color="A3A3A3"/>
+            </w:tcBorders>
+            <w:tcMar>
+              <w:top w:w="80" w:type="dxa"/>
+              <w:left w:w="80" w:type="dxa"/>
+              <w:bottom w:w="80" w:type="dxa"/>
+              <w:right w:w="80" w:type="dxa"/>
+            </w:tcMar>
+            <w:hideMark/>
+          </w:tcPr>
+          <w:p>
+            <w:proofErr w:type="spellStart"/>
+            <w:proofErr w:type="gramStart"/>
+            <w:r>
+              <w:t>SessionEstablishmentHelper</w:t>
+            </w:r>
+            <w:proofErr w:type="spellEnd"/>
+            <w:r>
+              <w:t>[</w:t>
+            </w:r>
+            <w:proofErr w:type="gramEnd"/>
+            <w:r>
+              <w:t>1] warning is emitted; attempted value isn't available on the subsequent request</w:t>
+            </w:r>
+          </w:p>
+        </w:tc>
+        <w:tc>
+          <w:tcPr>
+            <w:tcW w:w="1376" w:type="dxa"/>
+            <w:tcBorders>
+              <w:top w:val="single" w:sz="8" w:space="0" w:color="A3A3A3"/>
+              <w:left w:val="single" w:sz="8" w:space="0" w:color="A3A3A3"/>
+              <w:bottom w:val="single" w:sz="8" w:space="0" w:color="A3A3A3"/>
+              <w:right w:val="single" w:sz="8" w:space="0" w:color="A3A3A3"/>
+            </w:tcBorders>
+          </w:tcPr>
+          <w:p>
+            <w:hyperlink r:id="rId71" w:history="1">
+              <w:r>
+                <w:rPr>
+                  <w:rStyle w:val="Hyperlink"/>
+                </w:rPr>
+                <w:t>deferred child before mount</w:t>
               </w:r>
             </w:hyperlink>
             <w:r>
               <w:t xml:space="preserve">, </w:t>
             </w:r>
-            <w:hyperlink r:id="rId20" w:history="1">
-              <w:r>
-                <w:rPr>
-                  <w:rStyle w:val="Hyperlink"/>
-                </w:rPr>
-                <w:t>positive after submit</w:t>
+            <w:hyperlink r:id="rId72" w:history="1">
+              <w:r>
+                <w:rPr>
+                  <w:rStyle w:val="Hyperlink"/>
+                </w:rPr>
+                <w:t>deferred child after mount</w:t>
               </w:r>
             </w:hyperlink>
             <w:r>
               <w:t xml:space="preserve">, </w:t>
             </w:r>
-            <w:hyperlink r:id="rId21" w:history="1">
-              <w:r>
-                <w:rPr>
-                  <w:rStyle w:val="Hyperlink"/>
-                </w:rPr>
-                <w:t>late parent after moun</w:t>
-              </w:r>
-            </w:hyperlink>
-            <w:r>
-              <w:t>t</w:t>
-            </w:r>
-            <w:r>
-              <w:t xml:space="preserve">, </w:t>
-            </w:r>
-            <w:hyperlink r:id="rId22" w:history="1">
-              <w:r>
-                <w:rPr>
-                  <w:rStyle w:val="Hyperlink"/>
-                </w:rPr>
-                <w:t xml:space="preserve">late </w:t>
-              </w:r>
-              <w:r>
-                <w:rPr>
-                  <w:rStyle w:val="Hyperlink"/>
-                </w:rPr>
-                <w:lastRenderedPageBreak/>
-                <w:t>subscription warning</w:t>
-              </w:r>
-            </w:hyperlink>
-            <w:r>
-              <w:t xml:space="preserve">, </w:t>
-            </w:r>
-            <w:hyperlink r:id="rId23" w:history="1">
+            <w:hyperlink r:id="rId73" w:history="1">
               <w:r>
                 <w:rPr>
                   <w:rStyle w:val="Hyperlink"/>
@@ -953,1010 +3430,134 @@
                 <w:t>next request non-persistence</w:t>
               </w:r>
             </w:hyperlink>
-          </w:p>
-        </w:tc>
-      </w:tr>
-      <w:tr>
-        <w:tc>
-          <w:tcPr>
-            <w:tcW w:w="960" w:type="dxa"/>
-            <w:tcBorders>
-              <w:top w:val="single" w:sz="8" w:space="0" w:color="A3A3A3"/>
-              <w:left w:val="single" w:sz="8" w:space="0" w:color="A3A3A3"/>
-              <w:bottom w:val="single" w:sz="8" w:space="0" w:color="A3A3A3"/>
-              <w:right w:val="single" w:sz="8" w:space="0" w:color="A3A3A3"/>
-            </w:tcBorders>
-            <w:tcMar>
-              <w:top w:w="80" w:type="dxa"/>
-              <w:left w:w="80" w:type="dxa"/>
-              <w:bottom w:w="80" w:type="dxa"/>
-              <w:right w:w="80" w:type="dxa"/>
-            </w:tcMar>
-            <w:hideMark/>
-          </w:tcPr>
-          <w:p>
-            <w:r>
-              <w:lastRenderedPageBreak/>
-              <w:t>05</w:t>
-            </w:r>
-          </w:p>
-        </w:tc>
-        <w:tc>
-          <w:tcPr>
-            <w:tcW w:w="4209" w:type="dxa"/>
-            <w:tcBorders>
-              <w:top w:val="single" w:sz="8" w:space="0" w:color="A3A3A3"/>
-              <w:left w:val="single" w:sz="8" w:space="0" w:color="A3A3A3"/>
-              <w:bottom w:val="single" w:sz="8" w:space="0" w:color="A3A3A3"/>
-              <w:right w:val="single" w:sz="8" w:space="0" w:color="A3A3A3"/>
-            </w:tcBorders>
-            <w:tcMar>
-              <w:top w:w="80" w:type="dxa"/>
-              <w:left w:w="80" w:type="dxa"/>
-              <w:bottom w:w="80" w:type="dxa"/>
-              <w:right w:w="80" w:type="dxa"/>
-            </w:tcMar>
-            <w:hideMark/>
-          </w:tcPr>
-          <w:p>
-            <w:r>
-              <w:t>Streaming off allows cookie storage to carry value across redirect</w:t>
-            </w:r>
-          </w:p>
-        </w:tc>
-        <w:tc>
-          <w:tcPr>
-            <w:tcW w:w="960" w:type="dxa"/>
-            <w:tcBorders>
-              <w:top w:val="single" w:sz="8" w:space="0" w:color="A3A3A3"/>
-              <w:left w:val="single" w:sz="8" w:space="0" w:color="A3A3A3"/>
-              <w:bottom w:val="single" w:sz="8" w:space="0" w:color="A3A3A3"/>
-              <w:right w:val="single" w:sz="8" w:space="0" w:color="A3A3A3"/>
-            </w:tcBorders>
-            <w:tcMar>
-              <w:top w:w="80" w:type="dxa"/>
-              <w:left w:w="80" w:type="dxa"/>
-              <w:bottom w:w="80" w:type="dxa"/>
-              <w:right w:w="80" w:type="dxa"/>
-            </w:tcMar>
-            <w:hideMark/>
-          </w:tcPr>
-          <w:p>
-            <w:r>
-              <w:t>Pass</w:t>
-            </w:r>
-          </w:p>
-        </w:tc>
-        <w:tc>
-          <w:tcPr>
-            <w:tcW w:w="4968" w:type="dxa"/>
-            <w:tcBorders>
-              <w:top w:val="single" w:sz="8" w:space="0" w:color="A3A3A3"/>
-              <w:left w:val="single" w:sz="8" w:space="0" w:color="A3A3A3"/>
-              <w:bottom w:val="single" w:sz="8" w:space="0" w:color="A3A3A3"/>
-              <w:right w:val="single" w:sz="8" w:space="0" w:color="A3A3A3"/>
-            </w:tcBorders>
-            <w:tcMar>
-              <w:top w:w="80" w:type="dxa"/>
-              <w:left w:w="80" w:type="dxa"/>
-              <w:bottom w:w="80" w:type="dxa"/>
-              <w:right w:w="80" w:type="dxa"/>
-            </w:tcMar>
-            <w:hideMark/>
-          </w:tcPr>
-          <w:p>
-            <w:hyperlink r:id="rId24" w:history="1">
-              <w:r>
-                <w:rPr>
-                  <w:rStyle w:val="Hyperlink"/>
-                </w:rPr>
-                <w:t>cookie mode config</w:t>
-              </w:r>
-            </w:hyperlink>
-            <w:r>
-              <w:t xml:space="preserve">, </w:t>
-            </w:r>
-            <w:hyperlink r:id="rId25" w:history="1">
-              <w:r>
-                <w:rPr>
-                  <w:rStyle w:val="Hyperlink"/>
-                </w:rPr>
-                <w:t>non-streaming input</w:t>
-              </w:r>
-            </w:hyperlink>
-            <w:r>
-              <w:t xml:space="preserve">, </w:t>
-            </w:r>
-            <w:hyperlink r:id="rId26" w:history="1">
-              <w:r>
-                <w:rPr>
-                  <w:rStyle w:val="Hyperlink"/>
-                </w:rPr>
-                <w:t>non-streaming reader first load</w:t>
-              </w:r>
-            </w:hyperlink>
-          </w:p>
-        </w:tc>
-      </w:tr>
-      <w:tr>
-        <w:tc>
-          <w:tcPr>
-            <w:tcW w:w="960" w:type="dxa"/>
-            <w:tcBorders>
-              <w:top w:val="single" w:sz="8" w:space="0" w:color="A3A3A3"/>
-              <w:left w:val="single" w:sz="8" w:space="0" w:color="A3A3A3"/>
-              <w:bottom w:val="single" w:sz="8" w:space="0" w:color="A3A3A3"/>
-              <w:right w:val="single" w:sz="8" w:space="0" w:color="A3A3A3"/>
-            </w:tcBorders>
-            <w:tcMar>
-              <w:top w:w="80" w:type="dxa"/>
-              <w:left w:w="80" w:type="dxa"/>
-              <w:bottom w:w="80" w:type="dxa"/>
-              <w:right w:w="80" w:type="dxa"/>
-            </w:tcMar>
-            <w:hideMark/>
-          </w:tcPr>
-          <w:p>
-            <w:r>
-              <w:t>06</w:t>
-            </w:r>
-          </w:p>
-        </w:tc>
-        <w:tc>
-          <w:tcPr>
-            <w:tcW w:w="4182" w:type="dxa"/>
-            <w:tcBorders>
-              <w:top w:val="single" w:sz="8" w:space="0" w:color="A3A3A3"/>
-              <w:left w:val="single" w:sz="8" w:space="0" w:color="A3A3A3"/>
-              <w:bottom w:val="single" w:sz="8" w:space="0" w:color="A3A3A3"/>
-              <w:right w:val="single" w:sz="8" w:space="0" w:color="A3A3A3"/>
-            </w:tcBorders>
-            <w:tcMar>
-              <w:top w:w="80" w:type="dxa"/>
-              <w:left w:w="80" w:type="dxa"/>
-              <w:bottom w:w="80" w:type="dxa"/>
-              <w:right w:w="80" w:type="dxa"/>
-            </w:tcMar>
-            <w:hideMark/>
-          </w:tcPr>
-          <w:p>
-            <w:r>
-              <w:t>Run streaming page under default cookie storage and inspect reader + console</w:t>
-            </w:r>
-          </w:p>
-        </w:tc>
-        <w:tc>
-          <w:tcPr>
-            <w:tcW w:w="960" w:type="dxa"/>
-            <w:tcBorders>
-              <w:top w:val="single" w:sz="8" w:space="0" w:color="A3A3A3"/>
-              <w:left w:val="single" w:sz="8" w:space="0" w:color="A3A3A3"/>
-              <w:bottom w:val="single" w:sz="8" w:space="0" w:color="A3A3A3"/>
-              <w:right w:val="single" w:sz="8" w:space="0" w:color="A3A3A3"/>
-            </w:tcBorders>
-            <w:tcMar>
-              <w:top w:w="80" w:type="dxa"/>
-              <w:left w:w="80" w:type="dxa"/>
-              <w:bottom w:w="80" w:type="dxa"/>
-              <w:right w:w="80" w:type="dxa"/>
-            </w:tcMar>
-            <w:hideMark/>
-          </w:tcPr>
-          <w:p>
-            <w:r>
-              <w:t>Pass</w:t>
-            </w:r>
-          </w:p>
-        </w:tc>
-        <w:tc>
-          <w:tcPr>
-            <w:tcW w:w="4968" w:type="dxa"/>
-            <w:tcBorders>
-              <w:top w:val="single" w:sz="8" w:space="0" w:color="A3A3A3"/>
-              <w:left w:val="single" w:sz="8" w:space="0" w:color="A3A3A3"/>
-              <w:bottom w:val="single" w:sz="8" w:space="0" w:color="A3A3A3"/>
-              <w:right w:val="single" w:sz="8" w:space="0" w:color="A3A3A3"/>
-            </w:tcBorders>
-            <w:tcMar>
-              <w:top w:w="80" w:type="dxa"/>
-              <w:left w:w="80" w:type="dxa"/>
-              <w:bottom w:w="80" w:type="dxa"/>
-              <w:right w:w="80" w:type="dxa"/>
-            </w:tcMar>
-            <w:hideMark/>
-          </w:tcPr>
-          <w:p>
-            <w:hyperlink r:id="rId27" w:history="1">
-              <w:r>
-                <w:rPr>
-                  <w:rStyle w:val="Hyperlink"/>
-                </w:rPr>
-                <w:t>streaming page loaded</w:t>
-              </w:r>
-            </w:hyperlink>
-            <w:r>
-              <w:t xml:space="preserve">, </w:t>
-            </w:r>
-            <w:hyperlink r:id="rId28" w:history="1">
-              <w:r>
-                <w:rPr>
-                  <w:rStyle w:val="Hyperlink"/>
-                </w:rPr>
-                <w:t>redirect to reader</w:t>
-              </w:r>
-            </w:hyperlink>
-            <w:r>
-              <w:t xml:space="preserve">, </w:t>
-            </w:r>
-            <w:hyperlink r:id="rId29" w:history="1">
-              <w:r>
-                <w:rPr>
-                  <w:rStyle w:val="Hyperlink"/>
-                </w:rPr>
-                <w:t>runtime warning</w:t>
-              </w:r>
-            </w:hyperlink>
-          </w:p>
-        </w:tc>
-      </w:tr>
-      <w:tr>
-        <w:tc>
-          <w:tcPr>
-            <w:tcW w:w="960" w:type="dxa"/>
-            <w:tcBorders>
-              <w:top w:val="single" w:sz="8" w:space="0" w:color="A3A3A3"/>
-              <w:left w:val="single" w:sz="8" w:space="0" w:color="A3A3A3"/>
-              <w:bottom w:val="single" w:sz="8" w:space="0" w:color="A3A3A3"/>
-              <w:right w:val="single" w:sz="8" w:space="0" w:color="A3A3A3"/>
-            </w:tcBorders>
-            <w:tcMar>
-              <w:top w:w="80" w:type="dxa"/>
-              <w:left w:w="80" w:type="dxa"/>
-              <w:bottom w:w="80" w:type="dxa"/>
-              <w:right w:w="80" w:type="dxa"/>
-            </w:tcMar>
-            <w:hideMark/>
-          </w:tcPr>
-          <w:p>
-            <w:r>
-              <w:t>07</w:t>
-            </w:r>
-          </w:p>
-        </w:tc>
-        <w:tc>
-          <w:tcPr>
-            <w:tcW w:w="4182" w:type="dxa"/>
-            <w:tcBorders>
-              <w:top w:val="single" w:sz="8" w:space="0" w:color="A3A3A3"/>
-              <w:left w:val="single" w:sz="8" w:space="0" w:color="A3A3A3"/>
-              <w:bottom w:val="single" w:sz="8" w:space="0" w:color="A3A3A3"/>
-              <w:right w:val="single" w:sz="8" w:space="0" w:color="A3A3A3"/>
-            </w:tcBorders>
-            <w:tcMar>
-              <w:top w:w="80" w:type="dxa"/>
-              <w:left w:w="80" w:type="dxa"/>
-              <w:bottom w:w="80" w:type="dxa"/>
-              <w:right w:w="80" w:type="dxa"/>
-            </w:tcMar>
-            <w:hideMark/>
-          </w:tcPr>
-          <w:p>
-            <w:r>
-              <w:t>Follow warning guidance and switch to session storage</w:t>
-            </w:r>
-          </w:p>
-        </w:tc>
-        <w:tc>
-          <w:tcPr>
-            <w:tcW w:w="960" w:type="dxa"/>
-            <w:tcBorders>
-              <w:top w:val="single" w:sz="8" w:space="0" w:color="A3A3A3"/>
-              <w:left w:val="single" w:sz="8" w:space="0" w:color="A3A3A3"/>
-              <w:bottom w:val="single" w:sz="8" w:space="0" w:color="A3A3A3"/>
-              <w:right w:val="single" w:sz="8" w:space="0" w:color="A3A3A3"/>
-            </w:tcBorders>
-            <w:tcMar>
-              <w:top w:w="80" w:type="dxa"/>
-              <w:left w:w="80" w:type="dxa"/>
-              <w:bottom w:w="80" w:type="dxa"/>
-              <w:right w:w="80" w:type="dxa"/>
-            </w:tcMar>
-            <w:hideMark/>
-          </w:tcPr>
-          <w:p>
-            <w:r>
-              <w:t>Pass</w:t>
-            </w:r>
-          </w:p>
-        </w:tc>
-        <w:tc>
-          <w:tcPr>
-            <w:tcW w:w="4807" w:type="dxa"/>
-            <w:tcBorders>
-              <w:top w:val="single" w:sz="8" w:space="0" w:color="A3A3A3"/>
-              <w:left w:val="single" w:sz="8" w:space="0" w:color="A3A3A3"/>
-              <w:bottom w:val="single" w:sz="8" w:space="0" w:color="A3A3A3"/>
-              <w:right w:val="single" w:sz="8" w:space="0" w:color="A3A3A3"/>
-            </w:tcBorders>
-            <w:tcMar>
-              <w:top w:w="80" w:type="dxa"/>
-              <w:left w:w="80" w:type="dxa"/>
-              <w:bottom w:w="80" w:type="dxa"/>
-              <w:right w:w="80" w:type="dxa"/>
-            </w:tcMar>
-            <w:hideMark/>
-          </w:tcPr>
-          <w:p>
-            <w:hyperlink r:id="rId30" w:history="1">
-              <w:r>
-                <w:rPr>
-                  <w:rStyle w:val="Hyperlink"/>
-                </w:rPr>
-                <w:t>session mode request</w:t>
-              </w:r>
-            </w:hyperlink>
-            <w:r>
-              <w:t xml:space="preserve">, </w:t>
-            </w:r>
-            <w:hyperlink r:id="rId31" w:history="1">
-              <w:r>
-                <w:rPr>
-                  <w:rStyle w:val="Hyperlink"/>
-                </w:rPr>
-                <w:t>reader first load</w:t>
-              </w:r>
-            </w:hyperlink>
-          </w:p>
-        </w:tc>
-      </w:tr>
-      <w:tr>
-        <w:tc>
-          <w:tcPr>
-            <w:tcW w:w="960" w:type="dxa"/>
-            <w:tcBorders>
-              <w:top w:val="single" w:sz="8" w:space="0" w:color="A3A3A3"/>
-              <w:left w:val="single" w:sz="8" w:space="0" w:color="A3A3A3"/>
-              <w:bottom w:val="single" w:sz="8" w:space="0" w:color="A3A3A3"/>
-              <w:right w:val="single" w:sz="8" w:space="0" w:color="A3A3A3"/>
-            </w:tcBorders>
-            <w:tcMar>
-              <w:top w:w="80" w:type="dxa"/>
-              <w:left w:w="80" w:type="dxa"/>
-              <w:bottom w:w="80" w:type="dxa"/>
-              <w:right w:w="80" w:type="dxa"/>
-            </w:tcMar>
-            <w:hideMark/>
-          </w:tcPr>
-          <w:p>
-            <w:r>
-              <w:t>08</w:t>
-            </w:r>
-          </w:p>
-        </w:tc>
-        <w:tc>
-          <w:tcPr>
-            <w:tcW w:w="4182" w:type="dxa"/>
-            <w:tcBorders>
-              <w:top w:val="single" w:sz="8" w:space="0" w:color="A3A3A3"/>
-              <w:left w:val="single" w:sz="8" w:space="0" w:color="A3A3A3"/>
-              <w:bottom w:val="single" w:sz="8" w:space="0" w:color="A3A3A3"/>
-              <w:right w:val="single" w:sz="8" w:space="0" w:color="A3A3A3"/>
-            </w:tcBorders>
-            <w:tcMar>
-              <w:top w:w="80" w:type="dxa"/>
-              <w:left w:w="80" w:type="dxa"/>
-              <w:bottom w:w="80" w:type="dxa"/>
-              <w:right w:w="80" w:type="dxa"/>
-            </w:tcMar>
-            <w:hideMark/>
-          </w:tcPr>
-          <w:p>
-            <w:r>
-              <w:t>Verify session cookie issued in initial response headers for session-backed flow</w:t>
-            </w:r>
-          </w:p>
-        </w:tc>
-        <w:tc>
-          <w:tcPr>
-            <w:tcW w:w="960" w:type="dxa"/>
-            <w:tcBorders>
-              <w:top w:val="single" w:sz="8" w:space="0" w:color="A3A3A3"/>
-              <w:left w:val="single" w:sz="8" w:space="0" w:color="A3A3A3"/>
-              <w:bottom w:val="single" w:sz="8" w:space="0" w:color="A3A3A3"/>
-              <w:right w:val="single" w:sz="8" w:space="0" w:color="A3A3A3"/>
-            </w:tcBorders>
-            <w:tcMar>
-              <w:top w:w="80" w:type="dxa"/>
-              <w:left w:w="80" w:type="dxa"/>
-              <w:bottom w:w="80" w:type="dxa"/>
-              <w:right w:w="80" w:type="dxa"/>
-            </w:tcMar>
-            <w:hideMark/>
-          </w:tcPr>
-          <w:p>
-            <w:r>
-              <w:t>Pass</w:t>
-            </w:r>
-          </w:p>
-        </w:tc>
-        <w:tc>
-          <w:tcPr>
-            <w:tcW w:w="4807" w:type="dxa"/>
-            <w:tcBorders>
-              <w:top w:val="single" w:sz="8" w:space="0" w:color="A3A3A3"/>
-              <w:left w:val="single" w:sz="8" w:space="0" w:color="A3A3A3"/>
-              <w:bottom w:val="single" w:sz="8" w:space="0" w:color="A3A3A3"/>
-              <w:right w:val="single" w:sz="8" w:space="0" w:color="A3A3A3"/>
-            </w:tcBorders>
-            <w:tcMar>
-              <w:top w:w="80" w:type="dxa"/>
-              <w:left w:w="80" w:type="dxa"/>
-              <w:bottom w:w="80" w:type="dxa"/>
-              <w:right w:w="80" w:type="dxa"/>
-            </w:tcMar>
-            <w:hideMark/>
-          </w:tcPr>
-          <w:p>
-            <w:hyperlink r:id="rId32" w:history="1">
-              <w:proofErr w:type="gramStart"/>
-              <w:r>
-                <w:rPr>
-                  <w:rStyle w:val="Hyperlink"/>
-                </w:rPr>
-                <w:t>session Set</w:t>
-              </w:r>
-              <w:proofErr w:type="gramEnd"/>
-              <w:r>
-                <w:rPr>
-                  <w:rStyle w:val="Hyperlink"/>
-                </w:rPr>
-                <w:t>-Cookie header</w:t>
-              </w:r>
-            </w:hyperlink>
-          </w:p>
-        </w:tc>
-      </w:tr>
-      <w:tr>
-        <w:tc>
-          <w:tcPr>
-            <w:tcW w:w="960" w:type="dxa"/>
-            <w:tcBorders>
-              <w:top w:val="single" w:sz="8" w:space="0" w:color="A3A3A3"/>
-              <w:left w:val="single" w:sz="8" w:space="0" w:color="A3A3A3"/>
-              <w:bottom w:val="single" w:sz="8" w:space="0" w:color="A3A3A3"/>
-              <w:right w:val="single" w:sz="8" w:space="0" w:color="A3A3A3"/>
-            </w:tcBorders>
-            <w:tcMar>
-              <w:top w:w="80" w:type="dxa"/>
-              <w:left w:w="80" w:type="dxa"/>
-              <w:bottom w:w="80" w:type="dxa"/>
-              <w:right w:w="80" w:type="dxa"/>
-            </w:tcMar>
-            <w:hideMark/>
-          </w:tcPr>
-          <w:p>
-            <w:r>
-              <w:t>09</w:t>
-            </w:r>
-          </w:p>
-        </w:tc>
-        <w:tc>
-          <w:tcPr>
-            <w:tcW w:w="4182" w:type="dxa"/>
-            <w:tcBorders>
-              <w:top w:val="single" w:sz="8" w:space="0" w:color="A3A3A3"/>
-              <w:left w:val="single" w:sz="8" w:space="0" w:color="A3A3A3"/>
-              <w:bottom w:val="single" w:sz="8" w:space="0" w:color="A3A3A3"/>
-              <w:right w:val="single" w:sz="8" w:space="0" w:color="A3A3A3"/>
-            </w:tcBorders>
-            <w:tcMar>
-              <w:top w:w="80" w:type="dxa"/>
-              <w:left w:w="80" w:type="dxa"/>
-              <w:bottom w:w="80" w:type="dxa"/>
-              <w:right w:w="80" w:type="dxa"/>
-            </w:tcMar>
-            <w:hideMark/>
-          </w:tcPr>
-          <w:p>
-            <w:r>
-              <w:t>Compare pre-await write vs post-await write under cookie storage</w:t>
-            </w:r>
-          </w:p>
-        </w:tc>
-        <w:tc>
-          <w:tcPr>
-            <w:tcW w:w="960" w:type="dxa"/>
-            <w:tcBorders>
-              <w:top w:val="single" w:sz="8" w:space="0" w:color="A3A3A3"/>
-              <w:left w:val="single" w:sz="8" w:space="0" w:color="A3A3A3"/>
-              <w:bottom w:val="single" w:sz="8" w:space="0" w:color="A3A3A3"/>
-              <w:right w:val="single" w:sz="8" w:space="0" w:color="A3A3A3"/>
-            </w:tcBorders>
-            <w:tcMar>
-              <w:top w:w="80" w:type="dxa"/>
-              <w:left w:w="80" w:type="dxa"/>
-              <w:bottom w:w="80" w:type="dxa"/>
-              <w:right w:w="80" w:type="dxa"/>
-            </w:tcMar>
-            <w:hideMark/>
-          </w:tcPr>
-          <w:p>
-            <w:r>
-              <w:t>Pass</w:t>
-            </w:r>
-          </w:p>
-        </w:tc>
-        <w:tc>
-          <w:tcPr>
-            <w:tcW w:w="4968" w:type="dxa"/>
-            <w:tcBorders>
-              <w:top w:val="single" w:sz="8" w:space="0" w:color="A3A3A3"/>
-              <w:left w:val="single" w:sz="8" w:space="0" w:color="A3A3A3"/>
-              <w:bottom w:val="single" w:sz="8" w:space="0" w:color="A3A3A3"/>
-              <w:right w:val="single" w:sz="8" w:space="0" w:color="A3A3A3"/>
-            </w:tcBorders>
-            <w:tcMar>
-              <w:top w:w="80" w:type="dxa"/>
-              <w:left w:w="80" w:type="dxa"/>
-              <w:bottom w:w="80" w:type="dxa"/>
-              <w:right w:w="80" w:type="dxa"/>
-            </w:tcMar>
-            <w:hideMark/>
-          </w:tcPr>
-          <w:p>
-            <w:hyperlink r:id="rId33" w:history="1">
-              <w:r>
-                <w:rPr>
-                  <w:rStyle w:val="Hyperlink"/>
-                </w:rPr>
-                <w:t>post-await request</w:t>
-              </w:r>
-            </w:hyperlink>
-            <w:r>
-              <w:t xml:space="preserve">, </w:t>
-            </w:r>
-            <w:hyperlink r:id="rId34" w:history="1">
-              <w:r>
-                <w:rPr>
-                  <w:rStyle w:val="Hyperlink"/>
-                </w:rPr>
-                <w:t>post-await reader</w:t>
-              </w:r>
-            </w:hyperlink>
-            <w:r>
-              <w:t xml:space="preserve">, </w:t>
-            </w:r>
-            <w:hyperlink r:id="rId35" w:history="1">
-              <w:r>
-                <w:rPr>
-                  <w:rStyle w:val="Hyperlink"/>
-                </w:rPr>
-                <w:t>pre-await request</w:t>
-              </w:r>
-            </w:hyperlink>
-            <w:r>
-              <w:t xml:space="preserve">, </w:t>
-            </w:r>
-            <w:hyperlink r:id="rId36" w:history="1">
-              <w:r>
-                <w:rPr>
-                  <w:rStyle w:val="Hyperlink"/>
-                </w:rPr>
-                <w:t>pre-await reader</w:t>
-              </w:r>
-            </w:hyperlink>
-          </w:p>
-        </w:tc>
-      </w:tr>
-      <w:tr>
-        <w:tc>
-          <w:tcPr>
-            <w:tcW w:w="960" w:type="dxa"/>
-            <w:tcBorders>
-              <w:top w:val="single" w:sz="8" w:space="0" w:color="A3A3A3"/>
-              <w:left w:val="single" w:sz="8" w:space="0" w:color="A3A3A3"/>
-              <w:bottom w:val="single" w:sz="8" w:space="0" w:color="A3A3A3"/>
-              <w:right w:val="single" w:sz="8" w:space="0" w:color="A3A3A3"/>
-            </w:tcBorders>
-            <w:tcMar>
-              <w:top w:w="80" w:type="dxa"/>
-              <w:left w:w="80" w:type="dxa"/>
-              <w:bottom w:w="80" w:type="dxa"/>
-              <w:right w:w="80" w:type="dxa"/>
-            </w:tcMar>
-            <w:hideMark/>
-          </w:tcPr>
-          <w:p>
-            <w:r>
-              <w:t>10</w:t>
-            </w:r>
-          </w:p>
-        </w:tc>
-        <w:tc>
-          <w:tcPr>
-            <w:tcW w:w="4200" w:type="dxa"/>
-            <w:tcBorders>
-              <w:top w:val="single" w:sz="8" w:space="0" w:color="A3A3A3"/>
-              <w:left w:val="single" w:sz="8" w:space="0" w:color="A3A3A3"/>
-              <w:bottom w:val="single" w:sz="8" w:space="0" w:color="A3A3A3"/>
-              <w:right w:val="single" w:sz="8" w:space="0" w:color="A3A3A3"/>
-            </w:tcBorders>
-            <w:tcMar>
-              <w:top w:w="80" w:type="dxa"/>
-              <w:left w:w="80" w:type="dxa"/>
-              <w:bottom w:w="80" w:type="dxa"/>
-              <w:right w:w="80" w:type="dxa"/>
-            </w:tcMar>
-            <w:hideMark/>
-          </w:tcPr>
-          <w:p>
-            <w:r>
-              <w:t xml:space="preserve">Compare </w:t>
-            </w:r>
-            <w:r>
-              <w:t>early subscribed</w:t>
-            </w:r>
-            <w:r>
-              <w:t xml:space="preserve"> session property vs deferred child subscription</w:t>
-            </w:r>
-          </w:p>
-        </w:tc>
-        <w:tc>
-          <w:tcPr>
-            <w:tcW w:w="960" w:type="dxa"/>
-            <w:tcBorders>
-              <w:top w:val="single" w:sz="8" w:space="0" w:color="A3A3A3"/>
-              <w:left w:val="single" w:sz="8" w:space="0" w:color="A3A3A3"/>
-              <w:bottom w:val="single" w:sz="8" w:space="0" w:color="A3A3A3"/>
-              <w:right w:val="single" w:sz="8" w:space="0" w:color="A3A3A3"/>
-            </w:tcBorders>
-            <w:tcMar>
-              <w:top w:w="80" w:type="dxa"/>
-              <w:left w:w="80" w:type="dxa"/>
-              <w:bottom w:w="80" w:type="dxa"/>
-              <w:right w:w="80" w:type="dxa"/>
-            </w:tcMar>
-            <w:hideMark/>
-          </w:tcPr>
-          <w:p>
-            <w:r>
-              <w:t>Pass</w:t>
-            </w:r>
-          </w:p>
-        </w:tc>
-        <w:tc>
-          <w:tcPr>
-            <w:tcW w:w="4997" w:type="dxa"/>
-            <w:tcBorders>
-              <w:top w:val="single" w:sz="8" w:space="0" w:color="A3A3A3"/>
-              <w:left w:val="single" w:sz="8" w:space="0" w:color="A3A3A3"/>
-              <w:bottom w:val="single" w:sz="8" w:space="0" w:color="A3A3A3"/>
-              <w:right w:val="single" w:sz="8" w:space="0" w:color="A3A3A3"/>
-            </w:tcBorders>
-            <w:tcMar>
-              <w:top w:w="80" w:type="dxa"/>
-              <w:left w:w="80" w:type="dxa"/>
-              <w:bottom w:w="80" w:type="dxa"/>
-              <w:right w:w="80" w:type="dxa"/>
-            </w:tcMar>
-            <w:hideMark/>
-          </w:tcPr>
-          <w:p>
-            <w:hyperlink r:id="rId37" w:history="1">
-              <w:r>
-                <w:rPr>
-                  <w:rStyle w:val="Hyperlink"/>
-                </w:rPr>
-                <w:t>early-subscribed before submit</w:t>
-              </w:r>
-            </w:hyperlink>
-            <w:r>
-              <w:t xml:space="preserve">, </w:t>
-            </w:r>
-            <w:hyperlink r:id="rId38" w:history="1">
-              <w:r>
-                <w:rPr>
-                  <w:rStyle w:val="Hyperlink"/>
-                </w:rPr>
-                <w:t>deferred child before mount</w:t>
-              </w:r>
-            </w:hyperlink>
-            <w:r>
-              <w:t xml:space="preserve">, </w:t>
-            </w:r>
-            <w:hyperlink r:id="rId39" w:history="1">
-              <w:r>
-                <w:rPr>
-                  <w:rStyle w:val="Hyperlink"/>
-                </w:rPr>
-                <w:t>deferred child after mount</w:t>
-              </w:r>
-            </w:hyperlink>
-            <w:r>
-              <w:t xml:space="preserve">, </w:t>
-            </w:r>
-            <w:hyperlink r:id="rId40" w:history="1">
-              <w:r>
-                <w:rPr>
-                  <w:rStyle w:val="Hyperlink"/>
-                </w:rPr>
-                <w:t>next request non-persistence</w:t>
-              </w:r>
-            </w:hyperlink>
-          </w:p>
-        </w:tc>
-      </w:tr>
-      <w:tr>
-        <w:tc>
-          <w:tcPr>
-            <w:tcW w:w="960" w:type="dxa"/>
-            <w:tcBorders>
-              <w:top w:val="single" w:sz="8" w:space="0" w:color="A3A3A3"/>
-              <w:left w:val="single" w:sz="8" w:space="0" w:color="A3A3A3"/>
-              <w:bottom w:val="single" w:sz="8" w:space="0" w:color="A3A3A3"/>
-              <w:right w:val="single" w:sz="8" w:space="0" w:color="A3A3A3"/>
-            </w:tcBorders>
-            <w:tcMar>
-              <w:top w:w="80" w:type="dxa"/>
-              <w:left w:w="80" w:type="dxa"/>
-              <w:bottom w:w="80" w:type="dxa"/>
-              <w:right w:w="80" w:type="dxa"/>
-            </w:tcMar>
-            <w:hideMark/>
-          </w:tcPr>
-          <w:p>
-            <w:r>
-              <w:t>11</w:t>
-            </w:r>
-          </w:p>
-        </w:tc>
-        <w:tc>
-          <w:tcPr>
-            <w:tcW w:w="4182" w:type="dxa"/>
-            <w:tcBorders>
-              <w:top w:val="single" w:sz="8" w:space="0" w:color="A3A3A3"/>
-              <w:left w:val="single" w:sz="8" w:space="0" w:color="A3A3A3"/>
-              <w:bottom w:val="single" w:sz="8" w:space="0" w:color="A3A3A3"/>
-              <w:right w:val="single" w:sz="8" w:space="0" w:color="A3A3A3"/>
-            </w:tcBorders>
-            <w:tcMar>
-              <w:top w:w="80" w:type="dxa"/>
-              <w:left w:w="80" w:type="dxa"/>
-              <w:bottom w:w="80" w:type="dxa"/>
-              <w:right w:w="80" w:type="dxa"/>
-            </w:tcMar>
-            <w:hideMark/>
-          </w:tcPr>
-          <w:p>
-            <w:r>
-              <w:t>Turn streaming off and compare both storage options</w:t>
-            </w:r>
-          </w:p>
-        </w:tc>
-        <w:tc>
-          <w:tcPr>
-            <w:tcW w:w="960" w:type="dxa"/>
-            <w:tcBorders>
-              <w:top w:val="single" w:sz="8" w:space="0" w:color="A3A3A3"/>
-              <w:left w:val="single" w:sz="8" w:space="0" w:color="A3A3A3"/>
-              <w:bottom w:val="single" w:sz="8" w:space="0" w:color="A3A3A3"/>
-              <w:right w:val="single" w:sz="8" w:space="0" w:color="A3A3A3"/>
-            </w:tcBorders>
-            <w:tcMar>
-              <w:top w:w="80" w:type="dxa"/>
-              <w:left w:w="80" w:type="dxa"/>
-              <w:bottom w:w="80" w:type="dxa"/>
-              <w:right w:w="80" w:type="dxa"/>
-            </w:tcMar>
-            <w:hideMark/>
-          </w:tcPr>
-          <w:p>
-            <w:r>
-              <w:t>Pass</w:t>
-            </w:r>
-          </w:p>
-        </w:tc>
-        <w:tc>
-          <w:tcPr>
-            <w:tcW w:w="4968" w:type="dxa"/>
-            <w:tcBorders>
-              <w:top w:val="single" w:sz="8" w:space="0" w:color="A3A3A3"/>
-              <w:left w:val="single" w:sz="8" w:space="0" w:color="A3A3A3"/>
-              <w:bottom w:val="single" w:sz="8" w:space="0" w:color="A3A3A3"/>
-              <w:right w:val="single" w:sz="8" w:space="0" w:color="A3A3A3"/>
-            </w:tcBorders>
-            <w:tcMar>
-              <w:top w:w="80" w:type="dxa"/>
-              <w:left w:w="80" w:type="dxa"/>
-              <w:bottom w:w="80" w:type="dxa"/>
-              <w:right w:w="80" w:type="dxa"/>
-            </w:tcMar>
-            <w:hideMark/>
-          </w:tcPr>
-          <w:p>
-            <w:hyperlink r:id="rId41" w:history="1">
-              <w:r>
-                <w:rPr>
-                  <w:rStyle w:val="Hyperlink"/>
-                </w:rPr>
-                <w:t>cookie non-streaming reader</w:t>
-              </w:r>
-            </w:hyperlink>
-            <w:r>
-              <w:t xml:space="preserve">, </w:t>
-            </w:r>
-            <w:hyperlink r:id="rId42" w:history="1">
-              <w:r>
-                <w:rPr>
-                  <w:rStyle w:val="Hyperlink"/>
-                </w:rPr>
-                <w:t>cookie second load</w:t>
-              </w:r>
-            </w:hyperlink>
-            <w:r>
-              <w:t xml:space="preserve">, </w:t>
-            </w:r>
-            <w:hyperlink r:id="rId43" w:history="1">
-              <w:r>
-                <w:rPr>
-                  <w:rStyle w:val="Hyperlink"/>
-                </w:rPr>
-                <w:t>session non-streaming reader</w:t>
-              </w:r>
-            </w:hyperlink>
-            <w:r>
-              <w:t xml:space="preserve">, </w:t>
-            </w:r>
-            <w:hyperlink r:id="rId44" w:history="1">
-              <w:r>
-                <w:rPr>
-                  <w:rStyle w:val="Hyperlink"/>
-                </w:rPr>
-                <w:t>session second load</w:t>
-              </w:r>
-            </w:hyperlink>
-          </w:p>
-        </w:tc>
-      </w:tr>
-      <w:tr>
-        <w:tc>
-          <w:tcPr>
-            <w:tcW w:w="960" w:type="dxa"/>
-            <w:tcBorders>
-              <w:top w:val="single" w:sz="8" w:space="0" w:color="A3A3A3"/>
-              <w:left w:val="single" w:sz="8" w:space="0" w:color="A3A3A3"/>
-              <w:bottom w:val="single" w:sz="8" w:space="0" w:color="A3A3A3"/>
-              <w:right w:val="single" w:sz="8" w:space="0" w:color="A3A3A3"/>
-            </w:tcBorders>
-            <w:tcMar>
-              <w:top w:w="80" w:type="dxa"/>
-              <w:left w:w="80" w:type="dxa"/>
-              <w:bottom w:w="80" w:type="dxa"/>
-              <w:right w:w="80" w:type="dxa"/>
-            </w:tcMar>
-            <w:hideMark/>
-          </w:tcPr>
-          <w:p>
-            <w:r>
-              <w:t>12</w:t>
-            </w:r>
-          </w:p>
-        </w:tc>
-        <w:tc>
-          <w:tcPr>
-            <w:tcW w:w="4182" w:type="dxa"/>
-            <w:tcBorders>
-              <w:top w:val="single" w:sz="8" w:space="0" w:color="A3A3A3"/>
-              <w:left w:val="single" w:sz="8" w:space="0" w:color="A3A3A3"/>
-              <w:bottom w:val="single" w:sz="8" w:space="0" w:color="A3A3A3"/>
-              <w:right w:val="single" w:sz="8" w:space="0" w:color="A3A3A3"/>
-            </w:tcBorders>
-            <w:tcMar>
-              <w:top w:w="80" w:type="dxa"/>
-              <w:left w:w="80" w:type="dxa"/>
-              <w:bottom w:w="80" w:type="dxa"/>
-              <w:right w:w="80" w:type="dxa"/>
-            </w:tcMar>
-            <w:hideMark/>
-          </w:tcPr>
-          <w:p>
-            <w:r>
-              <w:t xml:space="preserve">Record response </w:t>
-            </w:r>
-            <w:r>
-              <w:t>starts</w:t>
-            </w:r>
-            <w:r>
-              <w:t xml:space="preserve"> time, subscription time, and assignment time per variant</w:t>
-            </w:r>
-          </w:p>
-        </w:tc>
-        <w:tc>
-          <w:tcPr>
-            <w:tcW w:w="960" w:type="dxa"/>
-            <w:tcBorders>
-              <w:top w:val="single" w:sz="8" w:space="0" w:color="A3A3A3"/>
-              <w:left w:val="single" w:sz="8" w:space="0" w:color="A3A3A3"/>
-              <w:bottom w:val="single" w:sz="8" w:space="0" w:color="A3A3A3"/>
-              <w:right w:val="single" w:sz="8" w:space="0" w:color="A3A3A3"/>
-            </w:tcBorders>
-            <w:tcMar>
-              <w:top w:w="80" w:type="dxa"/>
-              <w:left w:w="80" w:type="dxa"/>
-              <w:bottom w:w="80" w:type="dxa"/>
-              <w:right w:w="80" w:type="dxa"/>
-            </w:tcMar>
-            <w:hideMark/>
-          </w:tcPr>
-          <w:p>
-            <w:r>
-              <w:t>Pass</w:t>
-            </w:r>
-          </w:p>
-        </w:tc>
-        <w:tc>
-          <w:tcPr>
-            <w:tcW w:w="4968" w:type="dxa"/>
-            <w:tcBorders>
-              <w:top w:val="single" w:sz="8" w:space="0" w:color="A3A3A3"/>
-              <w:left w:val="single" w:sz="8" w:space="0" w:color="A3A3A3"/>
-              <w:bottom w:val="single" w:sz="8" w:space="0" w:color="A3A3A3"/>
-              <w:right w:val="single" w:sz="8" w:space="0" w:color="A3A3A3"/>
-            </w:tcBorders>
-            <w:tcMar>
-              <w:top w:w="80" w:type="dxa"/>
-              <w:left w:w="80" w:type="dxa"/>
-              <w:bottom w:w="80" w:type="dxa"/>
-              <w:right w:w="80" w:type="dxa"/>
-            </w:tcMar>
-            <w:hideMark/>
-          </w:tcPr>
-          <w:p>
-            <w:hyperlink r:id="rId45" w:history="1">
-              <w:r>
-                <w:rPr>
-                  <w:rStyle w:val="Hyperlink"/>
-                </w:rPr>
-                <w:t>cookie post-await request timing</w:t>
-              </w:r>
-            </w:hyperlink>
-            <w:r>
-              <w:t xml:space="preserve">, </w:t>
-            </w:r>
-            <w:hyperlink r:id="rId46" w:history="1">
-              <w:r>
-                <w:rPr>
-                  <w:rStyle w:val="Hyperlink"/>
-                </w:rPr>
-                <w:t>cookie pre-await request timin</w:t>
-              </w:r>
-            </w:hyperlink>
-            <w:r>
-              <w:t xml:space="preserve">g, </w:t>
-            </w:r>
-            <w:hyperlink r:id="rId47" w:history="1">
-              <w:r>
-                <w:rPr>
-                  <w:rStyle w:val="Hyperlink"/>
-                </w:rPr>
-                <w:t>session request timing</w:t>
-              </w:r>
-            </w:hyperlink>
-            <w:r>
-              <w:t xml:space="preserve">, </w:t>
-            </w:r>
-            <w:hyperlink r:id="rId48" w:history="1">
-              <w:r>
-                <w:rPr>
-                  <w:rStyle w:val="Hyperlink"/>
-                </w:rPr>
-                <w:t>late-subscription warning timing</w:t>
+            <w:r>
+              <w:t>,</w:t>
+            </w:r>
+            <w:hyperlink r:id="rId74" w:history="1">
+              <w:r>
+                <w:rPr>
+                  <w:rStyle w:val="Hyperlink"/>
+                </w:rPr>
+                <w:t>session_early_vs_deferred_console_warning_late_subscription</w:t>
               </w:r>
             </w:hyperlink>
           </w:p>
         </w:tc>
       </w:tr>
     </w:tbl>
+    <w:p/>
+    <w:p>
+      <w:r>
+        <w:rPr>
+          <w:b/>
+          <w:bCs/>
+        </w:rPr>
+        <w:t>Documentation finding:</w:t>
+      </w:r>
+      <w:r>
+        <w:t xml:space="preserve"> The Microsoft Learn documentation describes </w:t>
+      </w:r>
+      <w:proofErr w:type="spellStart"/>
+      <w:r>
+        <w:t>TempData</w:t>
+      </w:r>
+      <w:proofErr w:type="spellEnd"/>
+      <w:r>
+        <w:t xml:space="preserve"> persistence during static SSR, the default cookie-based </w:t>
+      </w:r>
+      <w:proofErr w:type="spellStart"/>
+      <w:r>
+        <w:t>TempData</w:t>
+      </w:r>
+      <w:proofErr w:type="spellEnd"/>
+      <w:r>
+        <w:t xml:space="preserve"> provider, and session </w:t>
+      </w:r>
+      <w:r>
+        <w:lastRenderedPageBreak/>
+        <w:t xml:space="preserve">data persistence. However, the cited documentation doesn't explicitly describe the streaming-specific response-start condition where cookie-backed </w:t>
+      </w:r>
+      <w:proofErr w:type="spellStart"/>
+      <w:r>
+        <w:t>TempData</w:t>
+      </w:r>
+      <w:proofErr w:type="spellEnd"/>
+      <w:r>
+        <w:t xml:space="preserve"> can't </w:t>
+      </w:r>
+      <w:proofErr w:type="gramStart"/>
+      <w:r>
+        <w:t>persist</w:t>
+      </w:r>
+      <w:proofErr w:type="gramEnd"/>
+      <w:r>
+        <w:t xml:space="preserve"> changes after the HTTP response has already started. In this validation, that specific streaming timing restriction and the recommendation to use session-backed </w:t>
+      </w:r>
+      <w:proofErr w:type="spellStart"/>
+      <w:r>
+        <w:t>TempData</w:t>
+      </w:r>
+      <w:proofErr w:type="spellEnd"/>
+      <w:r>
+        <w:t xml:space="preserve"> were surfaced by the runtime warning</w:t>
+      </w:r>
+      <w:r>
+        <w:t>.</w:t>
+      </w:r>
+    </w:p>
+    <w:p>
+      <w:r>
+        <w:t xml:space="preserve">Documentation link: </w:t>
+      </w:r>
+      <w:hyperlink r:id="rId75" w:anchor="temporary-data-persistence" w:history="1">
+        <w:r>
+          <w:rPr>
+            <w:rStyle w:val="Hyperlink"/>
+          </w:rPr>
+          <w:t>ASP.NET Core Blazor server-side state management | Microsoft Learn</w:t>
+        </w:r>
+      </w:hyperlink>
+    </w:p>
+    <w:p>
+      <w:pPr>
+        <w:rPr>
+          <w:b/>
+          <w:bCs/>
+        </w:rPr>
+      </w:pPr>
+      <w:r>
+        <w:rPr>
+          <w:b/>
+          <w:bCs/>
+        </w:rPr>
+        <w:t>Test not covered scenario</w:t>
+      </w:r>
+    </w:p>
+    <w:p>
+      <w:r>
+        <w:t>No</w:t>
+      </w:r>
+    </w:p>
+    <w:p>
+      <w:pPr>
+        <w:rPr>
+          <w:b/>
+          <w:bCs/>
+        </w:rPr>
+      </w:pPr>
+      <w:r>
+        <w:rPr>
+          <w:b/>
+          <w:bCs/>
+        </w:rPr>
+        <w:t>Problems</w:t>
+      </w:r>
+    </w:p>
+    <w:p>
+      <w:r>
+        <w:t>None</w:t>
+      </w:r>
+    </w:p>
     <w:p/>
     <w:sectPr>
       <w:pgSz w:w="12240" w:h="15840"/>
@@ -3433,7 +5034,7 @@
   <w:style w:type="paragraph" w:default="1" w:styleId="Normal">
     <w:name w:val="Normal"/>
     <w:qFormat/>
-    <w:rsid w:val="0053519A"/>
+    <w:rsid w:val="006C1DF9"/>
   </w:style>
   <w:style w:type="paragraph" w:styleId="Heading1">
     <w:name w:val="heading 1"/>
@@ -3985,6 +5586,25 @@
       <w:u w:val="single"/>
     </w:rPr>
   </w:style>
+  <w:style w:type="table" w:styleId="TableGrid">
+    <w:name w:val="Table Grid"/>
+    <w:basedOn w:val="TableNormal"/>
+    <w:uiPriority w:val="39"/>
+    <w:rsid w:val="004706B4"/>
+    <w:pPr>
+      <w:spacing w:after="0" w:line="240" w:lineRule="auto"/>
+    </w:pPr>
+    <w:tblPr>
+      <w:tblBorders>
+        <w:top w:val="single" w:sz="4" w:space="0" w:color="auto"/>
+        <w:left w:val="single" w:sz="4" w:space="0" w:color="auto"/>
+        <w:bottom w:val="single" w:sz="4" w:space="0" w:color="auto"/>
+        <w:right w:val="single" w:sz="4" w:space="0" w:color="auto"/>
+        <w:insideH w:val="single" w:sz="4" w:space="0" w:color="auto"/>
+        <w:insideV w:val="single" w:sz="4" w:space="0" w:color="auto"/>
+      </w:tblBorders>
+    </w:tblPr>
+  </w:style>
 </w:styles>
 </file>
 

</xml_diff>

<commit_message>
Updated the test report
</commit_message>
<xml_diff>
--- a/Evidence/69135_TempData_Streaming_SessionStorage_Validation_Test_Report.docx
+++ b/Evidence/69135_TempData_Streaming_SessionStorage_Validation_Test_Report.docx
@@ -37,30 +37,8 @@
           <w:rPr>
             <w:rStyle w:val="Hyperlink"/>
           </w:rPr>
-          <w:t xml:space="preserve">[Validation] </w:t>
+          <w:t>[Validation] TempData on a streaming page, and switching to session storage · Issue #69135 · dotnet/aspnetcore</w:t>
         </w:r>
-        <w:proofErr w:type="spellStart"/>
-        <w:r>
-          <w:rPr>
-            <w:rStyle w:val="Hyperlink"/>
-          </w:rPr>
-          <w:t>TempData</w:t>
-        </w:r>
-        <w:proofErr w:type="spellEnd"/>
-        <w:r>
-          <w:rPr>
-            <w:rStyle w:val="Hyperlink"/>
-          </w:rPr>
-          <w:t xml:space="preserve"> on a streaming page, and switching to session storage · Issue #69135 · dotnet/</w:t>
-        </w:r>
-        <w:proofErr w:type="spellStart"/>
-        <w:r>
-          <w:rPr>
-            <w:rStyle w:val="Hyperlink"/>
-          </w:rPr>
-          <w:t>aspnetcore</w:t>
-        </w:r>
-        <w:proofErr w:type="spellEnd"/>
       </w:hyperlink>
     </w:p>
     <w:p>
@@ -301,8 +279,6 @@
             <w:hideMark/>
           </w:tcPr>
           <w:p>
-            <w:proofErr w:type="spellStart"/>
-            <w:proofErr w:type="gramStart"/>
             <w:r>
               <w:rPr>
                 <w:b/>
@@ -310,8 +286,6 @@
               </w:rPr>
               <w:t>S.No</w:t>
             </w:r>
-            <w:proofErr w:type="spellEnd"/>
-            <w:proofErr w:type="gramEnd"/>
           </w:p>
         </w:tc>
         <w:tc>
@@ -442,23 +416,7 @@
           </w:tcPr>
           <w:p>
             <w:r>
-              <w:t xml:space="preserve">Cookie-backed </w:t>
-            </w:r>
-            <w:proofErr w:type="spellStart"/>
-            <w:r>
-              <w:t>TempData</w:t>
-            </w:r>
-            <w:proofErr w:type="spellEnd"/>
-            <w:r>
-              <w:t xml:space="preserve"> written after streaming response starts </w:t>
-            </w:r>
-            <w:proofErr w:type="gramStart"/>
-            <w:r>
-              <w:t>isn't persisted</w:t>
-            </w:r>
-            <w:proofErr w:type="gramEnd"/>
-            <w:r>
-              <w:t>, and the runtime warning recommends session storage</w:t>
+              <w:t>Cookie-backed TempData written after streaming response starts isn't persisted, and the runtime warning recommends session storage</w:t>
             </w:r>
           </w:p>
         </w:tc>
@@ -519,19 +477,7 @@
                 <w:rPr>
                   <w:rStyle w:val="Hyperlink"/>
                 </w:rPr>
-                <w:t>console w</w:t>
-              </w:r>
-              <w:r>
-                <w:rPr>
-                  <w:rStyle w:val="Hyperlink"/>
-                </w:rPr>
-                <w:t>a</w:t>
-              </w:r>
-              <w:r>
-                <w:rPr>
-                  <w:rStyle w:val="Hyperlink"/>
-                </w:rPr>
-                <w:t>rning</w:t>
+                <w:t>console warning</w:t>
               </w:r>
             </w:hyperlink>
             <w:r>
@@ -542,19 +488,7 @@
                 <w:rPr>
                   <w:rStyle w:val="Hyperlink"/>
                 </w:rPr>
-                <w:t>post-await w</w:t>
-              </w:r>
-              <w:r>
-                <w:rPr>
-                  <w:rStyle w:val="Hyperlink"/>
-                </w:rPr>
-                <w:t>a</w:t>
-              </w:r>
-              <w:r>
-                <w:rPr>
-                  <w:rStyle w:val="Hyperlink"/>
-                </w:rPr>
-                <w:t>rning</w:t>
+                <w:t>post-await warning</w:t>
               </w:r>
             </w:hyperlink>
           </w:p>
@@ -603,23 +537,7 @@
           </w:tcPr>
           <w:p>
             <w:r>
-              <w:t xml:space="preserve">Cookie-backed </w:t>
-            </w:r>
-            <w:proofErr w:type="spellStart"/>
-            <w:r>
-              <w:t>TempData</w:t>
-            </w:r>
-            <w:proofErr w:type="spellEnd"/>
-            <w:r>
-              <w:t xml:space="preserve"> assigned before the artificial delay still </w:t>
-            </w:r>
-            <w:proofErr w:type="gramStart"/>
-            <w:r>
-              <w:t>isn't persisted</w:t>
-            </w:r>
-            <w:proofErr w:type="gramEnd"/>
-            <w:r>
-              <w:t xml:space="preserve"> when the response has already starte</w:t>
+              <w:t>Cookie-backed TempData assigned before the artificial delay still isn't persisted when the response has already starte</w:t>
             </w:r>
             <w:r>
               <w:t>d</w:t>
@@ -705,19 +623,7 @@
                 <w:rPr>
                   <w:rStyle w:val="Hyperlink"/>
                 </w:rPr>
-                <w:t>war</w:t>
-              </w:r>
-              <w:r>
-                <w:rPr>
-                  <w:rStyle w:val="Hyperlink"/>
-                </w:rPr>
-                <w:t>n</w:t>
-              </w:r>
-              <w:r>
-                <w:rPr>
-                  <w:rStyle w:val="Hyperlink"/>
-                </w:rPr>
-                <w:t>ing</w:t>
+                <w:t>warning</w:t>
               </w:r>
             </w:hyperlink>
           </w:p>
@@ -766,23 +672,7 @@
           </w:tcPr>
           <w:p>
             <w:r>
-              <w:t xml:space="preserve">Session-backed </w:t>
-            </w:r>
-            <w:proofErr w:type="spellStart"/>
-            <w:r>
-              <w:t>TempData</w:t>
-            </w:r>
-            <w:proofErr w:type="spellEnd"/>
-            <w:r>
-              <w:t xml:space="preserve"> with the session established before streaming persists a post-flush value to the next request and preserves one-time </w:t>
-            </w:r>
-            <w:proofErr w:type="spellStart"/>
-            <w:r>
-              <w:t>TempData</w:t>
-            </w:r>
-            <w:proofErr w:type="spellEnd"/>
-            <w:r>
-              <w:t xml:space="preserve"> behavior</w:t>
+              <w:t>Session-backed TempData with the session established before streaming persists a post-flush value to the next request and preserves one-time TempData behavior</w:t>
             </w:r>
           </w:p>
           <w:p/>
@@ -843,27 +733,23 @@
               <w:t xml:space="preserve"> </w:t>
             </w:r>
             <w:hyperlink r:id="rId16" w:history="1">
-              <w:proofErr w:type="spellStart"/>
               <w:r>
                 <w:rPr>
                   <w:rStyle w:val="Hyperlink"/>
                 </w:rPr>
                 <w:t>session_initial_request</w:t>
               </w:r>
-              <w:proofErr w:type="spellEnd"/>
             </w:hyperlink>
             <w:r>
               <w:t xml:space="preserve">, </w:t>
             </w:r>
             <w:hyperlink r:id="rId17" w:history="1">
-              <w:proofErr w:type="spellStart"/>
               <w:r>
                 <w:rPr>
                   <w:rStyle w:val="Hyperlink"/>
                 </w:rPr>
                 <w:t>session_initial_response</w:t>
               </w:r>
-              <w:proofErr w:type="spellEnd"/>
             </w:hyperlink>
             <w:r>
               <w:t xml:space="preserve">, </w:t>
@@ -873,19 +759,7 @@
                 <w:rPr>
                   <w:rStyle w:val="Hyperlink"/>
                 </w:rPr>
-                <w:t>request tim</w:t>
-              </w:r>
-              <w:r>
-                <w:rPr>
-                  <w:rStyle w:val="Hyperlink"/>
-                </w:rPr>
-                <w:t>e</w:t>
-              </w:r>
-              <w:r>
-                <w:rPr>
-                  <w:rStyle w:val="Hyperlink"/>
-                </w:rPr>
-                <w:t>stamp</w:t>
+                <w:t>request timestamp</w:t>
               </w:r>
             </w:hyperlink>
             <w:r>
@@ -896,19 +770,7 @@
                 <w:rPr>
                   <w:rStyle w:val="Hyperlink"/>
                 </w:rPr>
-                <w:t>reader fir</w:t>
-              </w:r>
-              <w:r>
-                <w:rPr>
-                  <w:rStyle w:val="Hyperlink"/>
-                </w:rPr>
-                <w:t>s</w:t>
-              </w:r>
-              <w:r>
-                <w:rPr>
-                  <w:rStyle w:val="Hyperlink"/>
-                </w:rPr>
-                <w:t>t load</w:t>
+                <w:t>reader first load</w:t>
               </w:r>
             </w:hyperlink>
             <w:r>
@@ -969,23 +831,7 @@
           </w:tcPr>
           <w:p>
             <w:r>
-              <w:t xml:space="preserve">Early session subscription before response </w:t>
-            </w:r>
-            <w:proofErr w:type="gramStart"/>
-            <w:r>
-              <w:t>start</w:t>
-            </w:r>
-            <w:proofErr w:type="gramEnd"/>
-            <w:r>
-              <w:t xml:space="preserve"> allows a post-flush value update to persist to a subsequent request, while deferred first subscription after response </w:t>
-            </w:r>
-            <w:proofErr w:type="gramStart"/>
-            <w:r>
-              <w:t>start</w:t>
-            </w:r>
-            <w:proofErr w:type="gramEnd"/>
-            <w:r>
-              <w:t xml:space="preserve"> warns and doesn't persist.</w:t>
+              <w:t>Early session subscription before response start allows a post-flush value update to persist to a subsequent request, while deferred first subscription after response start warns and doesn't persist.</w:t>
             </w:r>
           </w:p>
         </w:tc>
@@ -1089,14 +935,12 @@
               <w:t xml:space="preserve">, </w:t>
             </w:r>
             <w:hyperlink r:id="rId26" w:history="1">
-              <w:proofErr w:type="spellStart"/>
               <w:r>
                 <w:rPr>
                   <w:rStyle w:val="Hyperlink"/>
                 </w:rPr>
                 <w:t>updated_session_value_is_still_present_after_the_flush</w:t>
               </w:r>
-              <w:proofErr w:type="spellEnd"/>
             </w:hyperlink>
           </w:p>
         </w:tc>
@@ -1386,23 +1230,7 @@
           </w:tcPr>
           <w:p>
             <w:r>
-              <w:t xml:space="preserve">Follow the runtime warning guidance alone to switch from cookie-backed </w:t>
-            </w:r>
-            <w:proofErr w:type="spellStart"/>
-            <w:r>
-              <w:t>TempData</w:t>
-            </w:r>
-            <w:proofErr w:type="spellEnd"/>
-            <w:r>
-              <w:t xml:space="preserve"> to session-backed </w:t>
-            </w:r>
-            <w:proofErr w:type="spellStart"/>
-            <w:r>
-              <w:t>TempData</w:t>
-            </w:r>
-            <w:proofErr w:type="spellEnd"/>
-            <w:r>
-              <w:t xml:space="preserve"> and verify the remediation.</w:t>
+              <w:t>Follow the runtime warning guidance alone to switch from cookie-backed TempData to session-backed TempData and verify the remediation.</w:t>
             </w:r>
           </w:p>
         </w:tc>
@@ -1463,19 +1291,7 @@
                 <w:rPr>
                   <w:rStyle w:val="Hyperlink"/>
                 </w:rPr>
-                <w:t>session m</w:t>
-              </w:r>
-              <w:r>
-                <w:rPr>
-                  <w:rStyle w:val="Hyperlink"/>
-                </w:rPr>
-                <w:t>o</w:t>
-              </w:r>
-              <w:r>
-                <w:rPr>
-                  <w:rStyle w:val="Hyperlink"/>
-                </w:rPr>
-                <w:t>de request</w:t>
+                <w:t>session mode request</w:t>
               </w:r>
             </w:hyperlink>
             <w:r>
@@ -1486,19 +1302,7 @@
                 <w:rPr>
                   <w:rStyle w:val="Hyperlink"/>
                 </w:rPr>
-                <w:t>reade</w:t>
-              </w:r>
-              <w:r>
-                <w:rPr>
-                  <w:rStyle w:val="Hyperlink"/>
-                </w:rPr>
-                <w:t>r</w:t>
-              </w:r>
-              <w:r>
-                <w:rPr>
-                  <w:rStyle w:val="Hyperlink"/>
-                </w:rPr>
-                <w:t xml:space="preserve"> first load</w:t>
+                <w:t>reader first load</w:t>
               </w:r>
             </w:hyperlink>
             <w:r>
@@ -1604,27 +1408,23 @@
           </w:tcPr>
           <w:p>
             <w:hyperlink r:id="rId37" w:history="1">
-              <w:proofErr w:type="spellStart"/>
               <w:r>
                 <w:rPr>
                   <w:rStyle w:val="Hyperlink"/>
                 </w:rPr>
                 <w:t>session_initial_request</w:t>
               </w:r>
-              <w:proofErr w:type="spellEnd"/>
             </w:hyperlink>
             <w:r>
               <w:t xml:space="preserve">, </w:t>
             </w:r>
             <w:hyperlink r:id="rId38" w:history="1">
-              <w:proofErr w:type="spellStart"/>
               <w:r>
                 <w:rPr>
                   <w:rStyle w:val="Hyperlink"/>
                 </w:rPr>
                 <w:t>session_initial_response</w:t>
               </w:r>
-              <w:proofErr w:type="spellEnd"/>
             </w:hyperlink>
           </w:p>
         </w:tc>
@@ -1900,14 +1700,12 @@
               <w:t xml:space="preserve">, </w:t>
             </w:r>
             <w:hyperlink r:id="rId47" w:history="1">
-              <w:proofErr w:type="spellStart"/>
               <w:r>
                 <w:rPr>
                   <w:rStyle w:val="Hyperlink"/>
                 </w:rPr>
                 <w:t>updated_session_value_is_still_present_after_the_flush</w:t>
               </w:r>
-              <w:proofErr w:type="spellEnd"/>
             </w:hyperlink>
           </w:p>
         </w:tc>
@@ -2177,19 +1975,7 @@
                 <w:rPr>
                   <w:rStyle w:val="Hyperlink"/>
                 </w:rPr>
-                <w:t>late-subscription wa</w:t>
-              </w:r>
-              <w:r>
-                <w:rPr>
-                  <w:rStyle w:val="Hyperlink"/>
-                </w:rPr>
-                <w:t>r</w:t>
-              </w:r>
-              <w:r>
-                <w:rPr>
-                  <w:rStyle w:val="Hyperlink"/>
-                </w:rPr>
-                <w:t>ning timing</w:t>
+                <w:t>late-subscription warning timing</w:t>
               </w:r>
             </w:hyperlink>
             <w:r>
@@ -2207,14 +1993,12 @@
               <w:t xml:space="preserve">, </w:t>
             </w:r>
             <w:hyperlink r:id="rId57" w:history="1">
-              <w:proofErr w:type="spellStart"/>
               <w:r>
                 <w:rPr>
                   <w:rStyle w:val="Hyperlink"/>
                 </w:rPr>
                 <w:t>positive_before_submit</w:t>
               </w:r>
-              <w:proofErr w:type="spellEnd"/>
             </w:hyperlink>
             <w:r>
               <w:t>,</w:t>
@@ -2222,14 +2006,12 @@
           </w:p>
           <w:p>
             <w:hyperlink r:id="rId58" w:history="1">
-              <w:proofErr w:type="spellStart"/>
               <w:r>
                 <w:rPr>
                   <w:rStyle w:val="Hyperlink"/>
                 </w:rPr>
                 <w:t>updated_session_value_is_still_present_after_the_flush</w:t>
               </w:r>
-              <w:proofErr w:type="spellEnd"/>
             </w:hyperlink>
             <w:r>
               <w:t>,</w:t>
@@ -2269,7 +2051,7 @@
           <w:sz w:val="28"/>
           <w:szCs w:val="28"/>
         </w:rPr>
-        <w:t>Runtime Warning Evidence</w:t>
+        <w:t>Warning Guidance Assessment</w:t>
       </w:r>
     </w:p>
     <w:tbl>
@@ -2371,15 +2153,7 @@
           </w:tcPr>
           <w:p>
             <w:r>
-              <w:t xml:space="preserve">Cookie post-flush </w:t>
-            </w:r>
-            <w:proofErr w:type="spellStart"/>
-            <w:r>
-              <w:t>TempData</w:t>
-            </w:r>
-            <w:proofErr w:type="spellEnd"/>
-            <w:r>
-              <w:t xml:space="preserve"> failure</w:t>
+              <w:t>Cookie post-flush TempData failure</w:t>
             </w:r>
           </w:p>
         </w:tc>
@@ -2398,26 +2172,8 @@
             <w:tcW w:w="3022" w:type="dxa"/>
           </w:tcPr>
           <w:p>
-            <w:proofErr w:type="spellStart"/>
-            <w:proofErr w:type="gramStart"/>
-            <w:r>
-              <w:t>Microsoft.AspNetCore.Components.Endpoints</w:t>
-            </w:r>
-            <w:proofErr w:type="gramEnd"/>
-            <w:r>
-              <w:t>.</w:t>
-            </w:r>
-            <w:proofErr w:type="gramStart"/>
-            <w:r>
-              <w:t>TempDataService</w:t>
-            </w:r>
-            <w:proofErr w:type="spellEnd"/>
-            <w:r>
-              <w:t>[</w:t>
-            </w:r>
-            <w:proofErr w:type="gramEnd"/>
-            <w:r>
-              <w:t>1]</w:t>
+            <w:r>
+              <w:t>Microsoft.AspNetCore.Components.Endpoints.TempDataService[1]</w:t>
             </w:r>
           </w:p>
         </w:tc>
@@ -2426,45 +2182,8 @@
             <w:tcW w:w="3531" w:type="dxa"/>
           </w:tcPr>
           <w:p>
-            <w:proofErr w:type="spellStart"/>
-            <w:r>
-              <w:t>TempData</w:t>
-            </w:r>
-            <w:proofErr w:type="spellEnd"/>
-            <w:r>
-              <w:t xml:space="preserve"> values written during or after streaming SSR cannot be persisted by the cookie </w:t>
-            </w:r>
-            <w:proofErr w:type="spellStart"/>
-            <w:r>
-              <w:t>TempData</w:t>
-            </w:r>
-            <w:proofErr w:type="spellEnd"/>
-            <w:r>
-              <w:t xml:space="preserve"> provider because the response has already started. Switch to the session-storage </w:t>
-            </w:r>
-            <w:proofErr w:type="spellStart"/>
-            <w:r>
-              <w:t>TempData</w:t>
-            </w:r>
-            <w:proofErr w:type="spellEnd"/>
-            <w:r>
-              <w:t xml:space="preserve"> provider (</w:t>
-            </w:r>
-            <w:proofErr w:type="spellStart"/>
-            <w:r>
-              <w:t>RazorComponentsServiceOptions.TempDataProviderType</w:t>
-            </w:r>
-            <w:proofErr w:type="spellEnd"/>
-            <w:r>
-              <w:t xml:space="preserve"> = </w:t>
-            </w:r>
-            <w:proofErr w:type="spellStart"/>
-            <w:r>
-              <w:t>TempDataProviderType.SessionStorage</w:t>
-            </w:r>
-            <w:proofErr w:type="spellEnd"/>
-            <w:r>
-              <w:t>) to enable persistence in streaming SSR scenarios.</w:t>
+            <w:r>
+              <w:t>TempData values written during or after streaming SSR cannot be persisted by the cookie TempData provider because the response has already started. Switch to the session-storage TempData provider (RazorComponentsServiceOptions.TempDataProviderType = TempDataProviderType.SessionStorage) to enable persistence in streaming SSR scenarios.</w:t>
             </w:r>
           </w:p>
         </w:tc>
@@ -2491,15 +2210,7 @@
           </w:tcPr>
           <w:p>
             <w:r>
-              <w:t xml:space="preserve">Cookie pre-await </w:t>
-            </w:r>
-            <w:proofErr w:type="spellStart"/>
-            <w:r>
-              <w:t>TempData</w:t>
-            </w:r>
-            <w:proofErr w:type="spellEnd"/>
-            <w:r>
-              <w:t xml:space="preserve"> failure</w:t>
+              <w:t>Cookie pre-await TempData failure</w:t>
             </w:r>
           </w:p>
         </w:tc>
@@ -2518,26 +2229,8 @@
             <w:tcW w:w="3022" w:type="dxa"/>
           </w:tcPr>
           <w:p>
-            <w:proofErr w:type="spellStart"/>
-            <w:proofErr w:type="gramStart"/>
-            <w:r>
-              <w:t>Microsoft.AspNetCore.Components.Endpoints</w:t>
-            </w:r>
-            <w:proofErr w:type="gramEnd"/>
-            <w:r>
-              <w:t>.</w:t>
-            </w:r>
-            <w:proofErr w:type="gramStart"/>
-            <w:r>
-              <w:t>TempDataService</w:t>
-            </w:r>
-            <w:proofErr w:type="spellEnd"/>
-            <w:r>
-              <w:t>[</w:t>
-            </w:r>
-            <w:proofErr w:type="gramEnd"/>
-            <w:r>
-              <w:t>1]</w:t>
+            <w:r>
+              <w:t>Microsoft.AspNetCore.Components.Endpoints.TempDataService[1]</w:t>
             </w:r>
           </w:p>
         </w:tc>
@@ -2546,45 +2239,8 @@
             <w:tcW w:w="3531" w:type="dxa"/>
           </w:tcPr>
           <w:p>
-            <w:proofErr w:type="spellStart"/>
-            <w:r>
-              <w:t>TempData</w:t>
-            </w:r>
-            <w:proofErr w:type="spellEnd"/>
-            <w:r>
-              <w:t xml:space="preserve"> values written during or after streaming SSR cannot be persisted by the cookie </w:t>
-            </w:r>
-            <w:proofErr w:type="spellStart"/>
-            <w:r>
-              <w:t>TempData</w:t>
-            </w:r>
-            <w:proofErr w:type="spellEnd"/>
-            <w:r>
-              <w:t xml:space="preserve"> provider because the response has already started. Switch to the session-storage </w:t>
-            </w:r>
-            <w:proofErr w:type="spellStart"/>
-            <w:r>
-              <w:t>TempData</w:t>
-            </w:r>
-            <w:proofErr w:type="spellEnd"/>
-            <w:r>
-              <w:t xml:space="preserve"> provider (</w:t>
-            </w:r>
-            <w:proofErr w:type="spellStart"/>
-            <w:r>
-              <w:t>RazorComponentsServiceOptions.TempDataProviderType</w:t>
-            </w:r>
-            <w:proofErr w:type="spellEnd"/>
-            <w:r>
-              <w:t xml:space="preserve"> = </w:t>
-            </w:r>
-            <w:proofErr w:type="spellStart"/>
-            <w:r>
-              <w:t>TempDataProviderType.SessionStorage</w:t>
-            </w:r>
-            <w:proofErr w:type="spellEnd"/>
-            <w:r>
-              <w:t>) to enable persistence in streaming SSR scenarios.</w:t>
+            <w:r>
+              <w:t>TempData values written during or after streaming SSR cannot be persisted by the cookie TempData provider because the response has already started. Switch to the session-storage TempData provider (RazorComponentsServiceOptions.TempDataProviderType = TempDataProviderType.SessionStorage) to enable persistence in streaming SSR scenarios.</w:t>
             </w:r>
           </w:p>
         </w:tc>
@@ -2631,21 +2287,8 @@
             <w:tcW w:w="3022" w:type="dxa"/>
           </w:tcPr>
           <w:p>
-            <w:proofErr w:type="gramStart"/>
-            <w:r>
-              <w:t>Microsoft.AspNetCore.Components.Endpoints</w:t>
-            </w:r>
-            <w:proofErr w:type="gramEnd"/>
-            <w:r>
-              <w:t>.</w:t>
-            </w:r>
-            <w:proofErr w:type="gramStart"/>
-            <w:r>
-              <w:t>SessionEstablishmentHelper[</w:t>
-            </w:r>
-            <w:proofErr w:type="gramEnd"/>
-            <w:r>
-              <w:t>1]</w:t>
+            <w:r>
+              <w:t>Microsoft.AspNetCore.Components.Endpoints.SessionEstablishmentHelper[1]</w:t>
             </w:r>
           </w:p>
         </w:tc>
@@ -2655,39 +2298,7 @@
           </w:tcPr>
           <w:p>
             <w:r>
-              <w:t xml:space="preserve">Session state </w:t>
-            </w:r>
-            <w:proofErr w:type="gramStart"/>
-            <w:r>
-              <w:t>was not persisted</w:t>
-            </w:r>
-            <w:proofErr w:type="gramEnd"/>
-            <w:r>
-              <w:t xml:space="preserve"> </w:t>
-            </w:r>
-            <w:proofErr w:type="gramStart"/>
-            <w:r>
-              <w:t>to</w:t>
-            </w:r>
-            <w:proofErr w:type="gramEnd"/>
-            <w:r>
-              <w:t xml:space="preserve"> the next request. The response has already started, so the session cookie can no longer be issued. To avoid this, place at least one [</w:t>
-            </w:r>
-            <w:proofErr w:type="spellStart"/>
-            <w:r>
-              <w:t>SupplyParameterFromSession</w:t>
-            </w:r>
-            <w:proofErr w:type="spellEnd"/>
-            <w:r>
-              <w:t xml:space="preserve">] (or use </w:t>
-            </w:r>
-            <w:proofErr w:type="spellStart"/>
-            <w:r>
-              <w:t>Session.Set</w:t>
-            </w:r>
-            <w:proofErr w:type="spellEnd"/>
-            <w:r>
-              <w:t xml:space="preserve"> directly) before any await that triggers the first response flush.</w:t>
+              <w:t>Session state was not persisted to the next request. The response has already started, so the session cookie can no longer be issued. To avoid this, place at least one [SupplyParameterFromSession] (or use Session.Set directly) before any await that triggers the first response flush.</w:t>
             </w:r>
           </w:p>
           <w:p/>
@@ -2913,15 +2524,7 @@
           </w:tcPr>
           <w:p>
             <w:r>
-              <w:t xml:space="preserve">Streaming response starts → delay executes → </w:t>
-            </w:r>
-            <w:proofErr w:type="spellStart"/>
-            <w:r>
-              <w:t>TempData</w:t>
-            </w:r>
-            <w:proofErr w:type="spellEnd"/>
-            <w:r>
-              <w:t xml:space="preserve"> write occurs after the response has started</w:t>
+              <w:t>Streaming response starts → delay executes → TempData write occurs after the response has started</w:t>
             </w:r>
           </w:p>
         </w:tc>
@@ -2944,23 +2547,7 @@
           </w:tcPr>
           <w:p>
             <w:r>
-              <w:t xml:space="preserve">Cookie-backed </w:t>
-            </w:r>
-            <w:proofErr w:type="spellStart"/>
-            <w:r>
-              <w:t>TempData</w:t>
-            </w:r>
-            <w:proofErr w:type="spellEnd"/>
-            <w:r>
-              <w:t xml:space="preserve"> </w:t>
-            </w:r>
-            <w:proofErr w:type="gramStart"/>
-            <w:r>
-              <w:t>isn't persisted</w:t>
-            </w:r>
-            <w:proofErr w:type="gramEnd"/>
-            <w:r>
-              <w:t>; subsequent reader doesn't contain the value</w:t>
+              <w:t>Cookie-backed TempData isn't persisted; subsequent reader doesn't contain the value</w:t>
             </w:r>
           </w:p>
         </w:tc>
@@ -2987,14 +2574,12 @@
               <w:t xml:space="preserve">, </w:t>
             </w:r>
             <w:hyperlink r:id="rId64" w:history="1">
-              <w:proofErr w:type="spellStart"/>
               <w:r>
                 <w:rPr>
                   <w:rStyle w:val="Hyperlink"/>
                 </w:rPr>
                 <w:t>cookie_post_await_reader_first_load</w:t>
               </w:r>
-              <w:proofErr w:type="spellEnd"/>
             </w:hyperlink>
           </w:p>
         </w:tc>
@@ -3024,17 +2609,8 @@
                 <w:b/>
                 <w:bCs/>
               </w:rPr>
-              <w:t>Cookie pre-</w:t>
-            </w:r>
-            <w:proofErr w:type="gramStart"/>
-            <w:r>
-              <w:rPr>
-                <w:b/>
-                <w:bCs/>
-              </w:rPr>
-              <w:t>await</w:t>
-            </w:r>
-            <w:proofErr w:type="gramEnd"/>
+              <w:t>Cookie pre-await</w:t>
+            </w:r>
           </w:p>
         </w:tc>
         <w:tc>
@@ -3056,15 +2632,7 @@
           </w:tcPr>
           <w:p>
             <w:r>
-              <w:t xml:space="preserve">Streaming response has already started → </w:t>
-            </w:r>
-            <w:proofErr w:type="spellStart"/>
-            <w:r>
-              <w:t>TempData</w:t>
-            </w:r>
-            <w:proofErr w:type="spellEnd"/>
-            <w:r>
-              <w:t xml:space="preserve"> assignment occurs before the artificial delay → </w:t>
+              <w:t xml:space="preserve">Streaming response has already started → TempData assignment occurs before the artificial delay → </w:t>
             </w:r>
             <w:r>
               <w:lastRenderedPageBreak/>
@@ -3092,23 +2660,7 @@
           <w:p>
             <w:r>
               <w:lastRenderedPageBreak/>
-              <w:t xml:space="preserve">Cookie-backed </w:t>
-            </w:r>
-            <w:proofErr w:type="spellStart"/>
-            <w:r>
-              <w:t>TempData</w:t>
-            </w:r>
-            <w:proofErr w:type="spellEnd"/>
-            <w:r>
-              <w:t xml:space="preserve"> still </w:t>
-            </w:r>
-            <w:proofErr w:type="gramStart"/>
-            <w:r>
-              <w:t>isn't persisted</w:t>
-            </w:r>
-            <w:proofErr w:type="gramEnd"/>
-            <w:r>
-              <w:t xml:space="preserve"> because response start is the important boundary; subsequent reader doesn't contain the value</w:t>
+              <w:t>Cookie-backed TempData still isn't persisted because response start is the important boundary; subsequent reader doesn't contain the value</w:t>
             </w:r>
           </w:p>
         </w:tc>
@@ -3128,14 +2680,7 @@
                 <w:rPr>
                   <w:rStyle w:val="Hyperlink"/>
                 </w:rPr>
-                <w:t xml:space="preserve">cookie pre-await request </w:t>
-              </w:r>
-              <w:proofErr w:type="spellStart"/>
-              <w:r>
-                <w:rPr>
-                  <w:rStyle w:val="Hyperlink"/>
-                </w:rPr>
-                <w:t>timin</w:t>
+                <w:t>cookie pre-await request timin</w:t>
               </w:r>
             </w:hyperlink>
             <w:r>
@@ -3151,7 +2696,6 @@
                 </w:rPr>
                 <w:t>cookie_pre_await_reader_first_load</w:t>
               </w:r>
-              <w:proofErr w:type="spellEnd"/>
             </w:hyperlink>
           </w:p>
         </w:tc>
@@ -3204,15 +2748,7 @@
           </w:tcPr>
           <w:p>
             <w:r>
-              <w:t xml:space="preserve">Session is established/subscribed before response </w:t>
-            </w:r>
-            <w:proofErr w:type="gramStart"/>
-            <w:r>
-              <w:t>start →</w:t>
-            </w:r>
-            <w:proofErr w:type="gramEnd"/>
-            <w:r>
-              <w:t xml:space="preserve"> streaming response starts → session-backed value is updated after the delay/flush → request completes</w:t>
+              <w:t>Session is established/subscribed before response start → streaming response starts → session-backed value is updated after the delay/flush → request completes</w:t>
             </w:r>
           </w:p>
         </w:tc>
@@ -3277,14 +2813,12 @@
               <w:t xml:space="preserve">, </w:t>
             </w:r>
             <w:hyperlink r:id="rId69" w:history="1">
-              <w:proofErr w:type="spellStart"/>
               <w:r>
                 <w:rPr>
                   <w:rStyle w:val="Hyperlink"/>
                 </w:rPr>
                 <w:t>positive_before_submit</w:t>
               </w:r>
-              <w:proofErr w:type="spellEnd"/>
             </w:hyperlink>
             <w:r>
               <w:t>,</w:t>
@@ -3292,14 +2826,12 @@
           </w:p>
           <w:p>
             <w:hyperlink r:id="rId70" w:history="1">
-              <w:proofErr w:type="spellStart"/>
               <w:r>
                 <w:rPr>
                   <w:rStyle w:val="Hyperlink"/>
                 </w:rPr>
                 <w:t>updated_session_value_is_still_present_after_the_flush</w:t>
               </w:r>
-              <w:proofErr w:type="spellEnd"/>
             </w:hyperlink>
           </w:p>
         </w:tc>
@@ -3374,18 +2906,8 @@
             <w:hideMark/>
           </w:tcPr>
           <w:p>
-            <w:proofErr w:type="spellStart"/>
-            <w:proofErr w:type="gramStart"/>
-            <w:r>
-              <w:t>SessionEstablishmentHelper</w:t>
-            </w:r>
-            <w:proofErr w:type="spellEnd"/>
-            <w:r>
-              <w:t>[</w:t>
-            </w:r>
-            <w:proofErr w:type="gramEnd"/>
-            <w:r>
-              <w:t>1] warning is emitted; attempted value isn't available on the subsequent request</w:t>
+            <w:r>
+              <w:t>SessionEstablishmentHelper[1] warning is emitted; attempted value isn't available on the subsequent request</w:t>
             </w:r>
           </w:p>
         </w:tc>
@@ -3455,51 +2977,11 @@
         <w:t>Documentation finding:</w:t>
       </w:r>
       <w:r>
-        <w:t xml:space="preserve"> The Microsoft Learn documentation describes </w:t>
-      </w:r>
-      <w:proofErr w:type="spellStart"/>
-      <w:r>
-        <w:t>TempData</w:t>
-      </w:r>
-      <w:proofErr w:type="spellEnd"/>
-      <w:r>
-        <w:t xml:space="preserve"> persistence during static SSR, the default cookie-based </w:t>
-      </w:r>
-      <w:proofErr w:type="spellStart"/>
-      <w:r>
-        <w:t>TempData</w:t>
-      </w:r>
-      <w:proofErr w:type="spellEnd"/>
-      <w:r>
-        <w:t xml:space="preserve"> provider, and session </w:t>
+        <w:t xml:space="preserve"> The Microsoft Learn documentation describes TempData persistence during static SSR, the default cookie-based TempData provider, and session </w:t>
       </w:r>
       <w:r>
         <w:lastRenderedPageBreak/>
-        <w:t xml:space="preserve">data persistence. However, the cited documentation doesn't explicitly describe the streaming-specific response-start condition where cookie-backed </w:t>
-      </w:r>
-      <w:proofErr w:type="spellStart"/>
-      <w:r>
-        <w:t>TempData</w:t>
-      </w:r>
-      <w:proofErr w:type="spellEnd"/>
-      <w:r>
-        <w:t xml:space="preserve"> can't </w:t>
-      </w:r>
-      <w:proofErr w:type="gramStart"/>
-      <w:r>
-        <w:t>persist</w:t>
-      </w:r>
-      <w:proofErr w:type="gramEnd"/>
-      <w:r>
-        <w:t xml:space="preserve"> changes after the HTTP response has already started. In this validation, that specific streaming timing restriction and the recommendation to use session-backed </w:t>
-      </w:r>
-      <w:proofErr w:type="spellStart"/>
-      <w:r>
-        <w:t>TempData</w:t>
-      </w:r>
-      <w:proofErr w:type="spellEnd"/>
-      <w:r>
-        <w:t xml:space="preserve"> were surfaced by the runtime warning</w:t>
+        <w:t>data persistence. However, the cited documentation doesn't explicitly describe the streaming-specific response-start condition where cookie-backed TempData can't persist changes after the HTTP response has already started. In this validation, that specific streaming timing restriction and the recommendation to use session-backed TempData were surfaced by the runtime warning</w:t>
       </w:r>
       <w:r>
         <w:t>.</w:t>

</xml_diff>

<commit_message>
Addressed the review concerns
</commit_message>
<xml_diff>
--- a/Evidence/69135_TempData_Streaming_SessionStorage_Validation_Test_Report.docx
+++ b/Evidence/69135_TempData_Streaming_SessionStorage_Validation_Test_Report.docx
@@ -18,7 +18,27 @@
           <w:sz w:val="32"/>
           <w:szCs w:val="32"/>
         </w:rPr>
-        <w:t>[Validation] TempData on a streaming page, and switching to session storage</w:t>
+        <w:t xml:space="preserve">[Validation] </w:t>
+      </w:r>
+      <w:proofErr w:type="spellStart"/>
+      <w:r>
+        <w:rPr>
+          <w:b/>
+          <w:bCs/>
+          <w:sz w:val="32"/>
+          <w:szCs w:val="32"/>
+        </w:rPr>
+        <w:t>TempData</w:t>
+      </w:r>
+      <w:proofErr w:type="spellEnd"/>
+      <w:r>
+        <w:rPr>
+          <w:b/>
+          <w:bCs/>
+          <w:sz w:val="32"/>
+          <w:szCs w:val="32"/>
+        </w:rPr>
+        <w:t xml:space="preserve"> on a streaming page, and switching to session storage</w:t>
       </w:r>
     </w:p>
     <w:p>
@@ -37,8 +57,30 @@
           <w:rPr>
             <w:rStyle w:val="Hyperlink"/>
           </w:rPr>
-          <w:t>[Validation] TempData on a streaming page, and switching to session storage · Issue #69135 · dotnet/aspnetcore</w:t>
+          <w:t xml:space="preserve">[Validation] </w:t>
         </w:r>
+        <w:proofErr w:type="spellStart"/>
+        <w:r>
+          <w:rPr>
+            <w:rStyle w:val="Hyperlink"/>
+          </w:rPr>
+          <w:t>TempData</w:t>
+        </w:r>
+        <w:proofErr w:type="spellEnd"/>
+        <w:r>
+          <w:rPr>
+            <w:rStyle w:val="Hyperlink"/>
+          </w:rPr>
+          <w:t xml:space="preserve"> on a streaming page, and switching to session storage · Issue #69135 · dotnet/</w:t>
+        </w:r>
+        <w:proofErr w:type="spellStart"/>
+        <w:r>
+          <w:rPr>
+            <w:rStyle w:val="Hyperlink"/>
+          </w:rPr>
+          <w:t>aspnetcore</w:t>
+        </w:r>
+        <w:proofErr w:type="spellEnd"/>
       </w:hyperlink>
     </w:p>
     <w:p>
@@ -206,6 +248,27 @@
           <w:b/>
           <w:bCs/>
         </w:rPr>
+        <w:t>Commit:</w:t>
+      </w:r>
+      <w:r>
+        <w:t xml:space="preserve"> </w:t>
+      </w:r>
+      <w:r>
+        <w:t>d9370fb8bff4b85df6876ad6137f2d952e97a417</w:t>
+      </w:r>
+    </w:p>
+    <w:p>
+      <w:pPr>
+        <w:numPr>
+          <w:ilvl w:val="0"/>
+          <w:numId w:val="4"/>
+        </w:numPr>
+      </w:pPr>
+      <w:r>
+        <w:rPr>
+          <w:b/>
+          <w:bCs/>
+        </w:rPr>
         <w:t>Outcome:</w:t>
       </w:r>
       <w:r>
@@ -213,6 +276,12 @@
           <w:rFonts w:ascii="Arial" w:hAnsi="Arial" w:cs="Arial"/>
         </w:rPr>
         <w:t xml:space="preserve"> Works</w:t>
+      </w:r>
+      <w:r>
+        <w:rPr>
+          <w:rFonts w:ascii="Arial" w:hAnsi="Arial" w:cs="Arial"/>
+        </w:rPr>
+        <w:t xml:space="preserve"> with issue</w:t>
       </w:r>
     </w:p>
     <w:p/>
@@ -279,6 +348,8 @@
             <w:hideMark/>
           </w:tcPr>
           <w:p>
+            <w:proofErr w:type="spellStart"/>
+            <w:proofErr w:type="gramStart"/>
             <w:r>
               <w:rPr>
                 <w:b/>
@@ -286,6 +357,8 @@
               </w:rPr>
               <w:t>S.No</w:t>
             </w:r>
+            <w:proofErr w:type="spellEnd"/>
+            <w:proofErr w:type="gramEnd"/>
           </w:p>
         </w:tc>
         <w:tc>
@@ -416,7 +489,23 @@
           </w:tcPr>
           <w:p>
             <w:r>
-              <w:t>Cookie-backed TempData written after streaming response starts isn't persisted, and the runtime warning recommends session storage</w:t>
+              <w:t xml:space="preserve">Cookie-backed </w:t>
+            </w:r>
+            <w:proofErr w:type="spellStart"/>
+            <w:r>
+              <w:t>TempData</w:t>
+            </w:r>
+            <w:proofErr w:type="spellEnd"/>
+            <w:r>
+              <w:t xml:space="preserve"> written after streaming response starts </w:t>
+            </w:r>
+            <w:proofErr w:type="gramStart"/>
+            <w:r>
+              <w:t>isn't persisted</w:t>
+            </w:r>
+            <w:proofErr w:type="gramEnd"/>
+            <w:r>
+              <w:t>, and the runtime warning recommends session storage</w:t>
             </w:r>
           </w:p>
         </w:tc>
@@ -466,7 +555,19 @@
                 <w:rPr>
                   <w:rStyle w:val="Hyperlink"/>
                 </w:rPr>
-                <w:t>reader no message</w:t>
+                <w:t>reader n</w:t>
+              </w:r>
+              <w:r>
+                <w:rPr>
+                  <w:rStyle w:val="Hyperlink"/>
+                </w:rPr>
+                <w:t>o</w:t>
+              </w:r>
+              <w:r>
+                <w:rPr>
+                  <w:rStyle w:val="Hyperlink"/>
+                </w:rPr>
+                <w:t xml:space="preserve"> message</w:t>
               </w:r>
             </w:hyperlink>
             <w:r>
@@ -477,7 +578,19 @@
                 <w:rPr>
                   <w:rStyle w:val="Hyperlink"/>
                 </w:rPr>
-                <w:t>console warning</w:t>
+                <w:t>conso</w:t>
+              </w:r>
+              <w:r>
+                <w:rPr>
+                  <w:rStyle w:val="Hyperlink"/>
+                </w:rPr>
+                <w:t>l</w:t>
+              </w:r>
+              <w:r>
+                <w:rPr>
+                  <w:rStyle w:val="Hyperlink"/>
+                </w:rPr>
+                <w:t>e warning</w:t>
               </w:r>
             </w:hyperlink>
             <w:r>
@@ -488,7 +601,19 @@
                 <w:rPr>
                   <w:rStyle w:val="Hyperlink"/>
                 </w:rPr>
-                <w:t>post-await warning</w:t>
+                <w:t>post-await w</w:t>
+              </w:r>
+              <w:r>
+                <w:rPr>
+                  <w:rStyle w:val="Hyperlink"/>
+                </w:rPr>
+                <w:t>a</w:t>
+              </w:r>
+              <w:r>
+                <w:rPr>
+                  <w:rStyle w:val="Hyperlink"/>
+                </w:rPr>
+                <w:t>rning</w:t>
               </w:r>
             </w:hyperlink>
           </w:p>
@@ -537,7 +662,23 @@
           </w:tcPr>
           <w:p>
             <w:r>
-              <w:t>Cookie-backed TempData assigned before the artificial delay still isn't persisted when the response has already starte</w:t>
+              <w:t xml:space="preserve">Cookie-backed </w:t>
+            </w:r>
+            <w:proofErr w:type="spellStart"/>
+            <w:r>
+              <w:t>TempData</w:t>
+            </w:r>
+            <w:proofErr w:type="spellEnd"/>
+            <w:r>
+              <w:t xml:space="preserve"> assigned before the artificial delay still </w:t>
+            </w:r>
+            <w:proofErr w:type="gramStart"/>
+            <w:r>
+              <w:t>isn't persisted</w:t>
+            </w:r>
+            <w:proofErr w:type="gramEnd"/>
+            <w:r>
+              <w:t xml:space="preserve"> when the response has already starte</w:t>
             </w:r>
             <w:r>
               <w:t>d</w:t>
@@ -623,7 +764,19 @@
                 <w:rPr>
                   <w:rStyle w:val="Hyperlink"/>
                 </w:rPr>
-                <w:t>warning</w:t>
+                <w:t>w</w:t>
+              </w:r>
+              <w:r>
+                <w:rPr>
+                  <w:rStyle w:val="Hyperlink"/>
+                </w:rPr>
+                <w:t>a</w:t>
+              </w:r>
+              <w:r>
+                <w:rPr>
+                  <w:rStyle w:val="Hyperlink"/>
+                </w:rPr>
+                <w:t>rning</w:t>
               </w:r>
             </w:hyperlink>
           </w:p>
@@ -672,7 +825,27 @@
           </w:tcPr>
           <w:p>
             <w:r>
-              <w:t>Session-backed TempData with the session established before streaming persists a post-flush value to the next request and preserves one-time TempData behavior</w:t>
+              <w:t xml:space="preserve">Session-backed </w:t>
+            </w:r>
+            <w:proofErr w:type="spellStart"/>
+            <w:r>
+              <w:t>TempData</w:t>
+            </w:r>
+            <w:proofErr w:type="spellEnd"/>
+            <w:r>
+              <w:t xml:space="preserve"> with the session established before streaming persists a post-flush value to the next request and </w:t>
+            </w:r>
+            <w:r>
+              <w:lastRenderedPageBreak/>
+              <w:t xml:space="preserve">preserves one-time </w:t>
+            </w:r>
+            <w:proofErr w:type="spellStart"/>
+            <w:r>
+              <w:t>TempData</w:t>
+            </w:r>
+            <w:proofErr w:type="spellEnd"/>
+            <w:r>
+              <w:t xml:space="preserve"> behavior</w:t>
             </w:r>
           </w:p>
           <w:p/>
@@ -696,6 +869,7 @@
           </w:tcPr>
           <w:p>
             <w:r>
+              <w:lastRenderedPageBreak/>
               <w:t>Pass</w:t>
             </w:r>
           </w:p>
@@ -718,6 +892,9 @@
             <w:hideMark/>
           </w:tcPr>
           <w:p>
+            <w:pPr>
+              <w:jc w:val="both"/>
+            </w:pPr>
             <w:hyperlink r:id="rId15" w:history="1">
               <w:r>
                 <w:rPr>
@@ -733,23 +910,27 @@
               <w:t xml:space="preserve"> </w:t>
             </w:r>
             <w:hyperlink r:id="rId16" w:history="1">
+              <w:proofErr w:type="spellStart"/>
               <w:r>
                 <w:rPr>
                   <w:rStyle w:val="Hyperlink"/>
                 </w:rPr>
                 <w:t>session_initial_request</w:t>
               </w:r>
+              <w:proofErr w:type="spellEnd"/>
             </w:hyperlink>
             <w:r>
               <w:t xml:space="preserve">, </w:t>
             </w:r>
             <w:hyperlink r:id="rId17" w:history="1">
+              <w:proofErr w:type="spellStart"/>
               <w:r>
                 <w:rPr>
                   <w:rStyle w:val="Hyperlink"/>
                 </w:rPr>
                 <w:t>session_initial_response</w:t>
               </w:r>
+              <w:proofErr w:type="spellEnd"/>
             </w:hyperlink>
             <w:r>
               <w:t xml:space="preserve">, </w:t>
@@ -807,7 +988,6 @@
           </w:tcPr>
           <w:p>
             <w:r>
-              <w:lastRenderedPageBreak/>
               <w:t>04</w:t>
             </w:r>
           </w:p>
@@ -831,7 +1011,23 @@
           </w:tcPr>
           <w:p>
             <w:r>
-              <w:t>Early session subscription before response start allows a post-flush value update to persist to a subsequent request, while deferred first subscription after response start warns and doesn't persist.</w:t>
+              <w:t xml:space="preserve">Early session subscription before response </w:t>
+            </w:r>
+            <w:proofErr w:type="gramStart"/>
+            <w:r>
+              <w:t>start</w:t>
+            </w:r>
+            <w:proofErr w:type="gramEnd"/>
+            <w:r>
+              <w:t xml:space="preserve"> allows a post-flush value update to persist to a subsequent request, while deferred first subscription after response </w:t>
+            </w:r>
+            <w:proofErr w:type="gramStart"/>
+            <w:r>
+              <w:t>start</w:t>
+            </w:r>
+            <w:proofErr w:type="gramEnd"/>
+            <w:r>
+              <w:t xml:space="preserve"> warns and doesn't persist.</w:t>
             </w:r>
           </w:p>
         </w:tc>
@@ -935,12 +1131,14 @@
               <w:t xml:space="preserve">, </w:t>
             </w:r>
             <w:hyperlink r:id="rId26" w:history="1">
+              <w:proofErr w:type="spellStart"/>
               <w:r>
                 <w:rPr>
                   <w:rStyle w:val="Hyperlink"/>
                 </w:rPr>
                 <w:t>updated_session_value_is_still_present_after_the_flush</w:t>
               </w:r>
+              <w:proofErr w:type="spellEnd"/>
             </w:hyperlink>
           </w:p>
         </w:tc>
@@ -1230,7 +1428,23 @@
           </w:tcPr>
           <w:p>
             <w:r>
-              <w:t>Follow the runtime warning guidance alone to switch from cookie-backed TempData to session-backed TempData and verify the remediation.</w:t>
+              <w:t xml:space="preserve">Follow the runtime warning guidance alone to switch from cookie-backed </w:t>
+            </w:r>
+            <w:proofErr w:type="spellStart"/>
+            <w:r>
+              <w:t>TempData</w:t>
+            </w:r>
+            <w:proofErr w:type="spellEnd"/>
+            <w:r>
+              <w:t xml:space="preserve"> to session-backed </w:t>
+            </w:r>
+            <w:proofErr w:type="spellStart"/>
+            <w:r>
+              <w:t>TempData</w:t>
+            </w:r>
+            <w:proofErr w:type="spellEnd"/>
+            <w:r>
+              <w:t xml:space="preserve"> and verify the remediation.</w:t>
             </w:r>
           </w:p>
         </w:tc>
@@ -1408,23 +1622,27 @@
           </w:tcPr>
           <w:p>
             <w:hyperlink r:id="rId37" w:history="1">
+              <w:proofErr w:type="spellStart"/>
               <w:r>
                 <w:rPr>
                   <w:rStyle w:val="Hyperlink"/>
                 </w:rPr>
                 <w:t>session_initial_request</w:t>
               </w:r>
+              <w:proofErr w:type="spellEnd"/>
             </w:hyperlink>
             <w:r>
               <w:t xml:space="preserve">, </w:t>
             </w:r>
             <w:hyperlink r:id="rId38" w:history="1">
+              <w:proofErr w:type="spellStart"/>
               <w:r>
                 <w:rPr>
                   <w:rStyle w:val="Hyperlink"/>
                 </w:rPr>
                 <w:t>session_initial_response</w:t>
               </w:r>
+              <w:proofErr w:type="spellEnd"/>
             </w:hyperlink>
           </w:p>
         </w:tc>
@@ -1700,12 +1918,14 @@
               <w:t xml:space="preserve">, </w:t>
             </w:r>
             <w:hyperlink r:id="rId47" w:history="1">
+              <w:proofErr w:type="spellStart"/>
               <w:r>
                 <w:rPr>
                   <w:rStyle w:val="Hyperlink"/>
                 </w:rPr>
                 <w:t>updated_session_value_is_still_present_after_the_flush</w:t>
               </w:r>
+              <w:proofErr w:type="spellEnd"/>
             </w:hyperlink>
           </w:p>
         </w:tc>
@@ -1730,6 +1950,7 @@
           </w:tcPr>
           <w:p>
             <w:r>
+              <w:lastRenderedPageBreak/>
               <w:t>11</w:t>
             </w:r>
           </w:p>
@@ -1862,7 +2083,6 @@
           </w:tcPr>
           <w:p>
             <w:r>
-              <w:lastRenderedPageBreak/>
               <w:t>12</w:t>
             </w:r>
           </w:p>
@@ -1993,12 +2213,14 @@
               <w:t xml:space="preserve">, </w:t>
             </w:r>
             <w:hyperlink r:id="rId57" w:history="1">
+              <w:proofErr w:type="spellStart"/>
               <w:r>
                 <w:rPr>
                   <w:rStyle w:val="Hyperlink"/>
                 </w:rPr>
                 <w:t>positive_before_submit</w:t>
               </w:r>
+              <w:proofErr w:type="spellEnd"/>
             </w:hyperlink>
             <w:r>
               <w:t>,</w:t>
@@ -2006,12 +2228,14 @@
           </w:p>
           <w:p>
             <w:hyperlink r:id="rId58" w:history="1">
+              <w:proofErr w:type="spellStart"/>
               <w:r>
                 <w:rPr>
                   <w:rStyle w:val="Hyperlink"/>
                 </w:rPr>
                 <w:t>updated_session_value_is_still_present_after_the_flush</w:t>
               </w:r>
+              <w:proofErr w:type="spellEnd"/>
             </w:hyperlink>
             <w:r>
               <w:t>,</w:t>
@@ -2153,7 +2377,15 @@
           </w:tcPr>
           <w:p>
             <w:r>
-              <w:t>Cookie post-flush TempData failure</w:t>
+              <w:t xml:space="preserve">Cookie post-flush </w:t>
+            </w:r>
+            <w:proofErr w:type="spellStart"/>
+            <w:r>
+              <w:t>TempData</w:t>
+            </w:r>
+            <w:proofErr w:type="spellEnd"/>
+            <w:r>
+              <w:t xml:space="preserve"> failure</w:t>
             </w:r>
           </w:p>
         </w:tc>
@@ -2172,8 +2404,26 @@
             <w:tcW w:w="3022" w:type="dxa"/>
           </w:tcPr>
           <w:p>
-            <w:r>
-              <w:t>Microsoft.AspNetCore.Components.Endpoints.TempDataService[1]</w:t>
+            <w:proofErr w:type="spellStart"/>
+            <w:proofErr w:type="gramStart"/>
+            <w:r>
+              <w:t>Microsoft.AspNetCore.Components.Endpoints</w:t>
+            </w:r>
+            <w:proofErr w:type="gramEnd"/>
+            <w:r>
+              <w:t>.</w:t>
+            </w:r>
+            <w:proofErr w:type="gramStart"/>
+            <w:r>
+              <w:t>TempDataService</w:t>
+            </w:r>
+            <w:proofErr w:type="spellEnd"/>
+            <w:r>
+              <w:t>[</w:t>
+            </w:r>
+            <w:proofErr w:type="gramEnd"/>
+            <w:r>
+              <w:t>1]</w:t>
             </w:r>
           </w:p>
         </w:tc>
@@ -2182,8 +2432,45 @@
             <w:tcW w:w="3531" w:type="dxa"/>
           </w:tcPr>
           <w:p>
-            <w:r>
-              <w:t>TempData values written during or after streaming SSR cannot be persisted by the cookie TempData provider because the response has already started. Switch to the session-storage TempData provider (RazorComponentsServiceOptions.TempDataProviderType = TempDataProviderType.SessionStorage) to enable persistence in streaming SSR scenarios.</w:t>
+            <w:proofErr w:type="spellStart"/>
+            <w:r>
+              <w:t>TempData</w:t>
+            </w:r>
+            <w:proofErr w:type="spellEnd"/>
+            <w:r>
+              <w:t xml:space="preserve"> values written during or after streaming SSR cannot be persisted by the cookie </w:t>
+            </w:r>
+            <w:proofErr w:type="spellStart"/>
+            <w:r>
+              <w:t>TempData</w:t>
+            </w:r>
+            <w:proofErr w:type="spellEnd"/>
+            <w:r>
+              <w:t xml:space="preserve"> provider because the response has already started. Switch to the session-storage </w:t>
+            </w:r>
+            <w:proofErr w:type="spellStart"/>
+            <w:r>
+              <w:t>TempData</w:t>
+            </w:r>
+            <w:proofErr w:type="spellEnd"/>
+            <w:r>
+              <w:t xml:space="preserve"> provider (</w:t>
+            </w:r>
+            <w:proofErr w:type="spellStart"/>
+            <w:r>
+              <w:t>RazorComponentsServiceOptions.TempDataProviderType</w:t>
+            </w:r>
+            <w:proofErr w:type="spellEnd"/>
+            <w:r>
+              <w:t xml:space="preserve"> = </w:t>
+            </w:r>
+            <w:proofErr w:type="spellStart"/>
+            <w:r>
+              <w:t>TempDataProviderType.SessionStorage</w:t>
+            </w:r>
+            <w:proofErr w:type="spellEnd"/>
+            <w:r>
+              <w:t>) to enable persistence in streaming SSR scenarios.</w:t>
             </w:r>
           </w:p>
         </w:tc>
@@ -2210,7 +2497,15 @@
           </w:tcPr>
           <w:p>
             <w:r>
-              <w:t>Cookie pre-await TempData failure</w:t>
+              <w:t xml:space="preserve">Cookie pre-await </w:t>
+            </w:r>
+            <w:proofErr w:type="spellStart"/>
+            <w:r>
+              <w:t>TempData</w:t>
+            </w:r>
+            <w:proofErr w:type="spellEnd"/>
+            <w:r>
+              <w:t xml:space="preserve"> failure</w:t>
             </w:r>
           </w:p>
         </w:tc>
@@ -2229,8 +2524,26 @@
             <w:tcW w:w="3022" w:type="dxa"/>
           </w:tcPr>
           <w:p>
-            <w:r>
-              <w:t>Microsoft.AspNetCore.Components.Endpoints.TempDataService[1]</w:t>
+            <w:proofErr w:type="spellStart"/>
+            <w:proofErr w:type="gramStart"/>
+            <w:r>
+              <w:t>Microsoft.AspNetCore.Components.Endpoints</w:t>
+            </w:r>
+            <w:proofErr w:type="gramEnd"/>
+            <w:r>
+              <w:t>.</w:t>
+            </w:r>
+            <w:proofErr w:type="gramStart"/>
+            <w:r>
+              <w:t>TempDataService</w:t>
+            </w:r>
+            <w:proofErr w:type="spellEnd"/>
+            <w:r>
+              <w:t>[</w:t>
+            </w:r>
+            <w:proofErr w:type="gramEnd"/>
+            <w:r>
+              <w:t>1]</w:t>
             </w:r>
           </w:p>
         </w:tc>
@@ -2239,8 +2552,49 @@
             <w:tcW w:w="3531" w:type="dxa"/>
           </w:tcPr>
           <w:p>
-            <w:r>
-              <w:t>TempData values written during or after streaming SSR cannot be persisted by the cookie TempData provider because the response has already started. Switch to the session-storage TempData provider (RazorComponentsServiceOptions.TempDataProviderType = TempDataProviderType.SessionStorage) to enable persistence in streaming SSR scenarios.</w:t>
+            <w:proofErr w:type="spellStart"/>
+            <w:r>
+              <w:t>TempData</w:t>
+            </w:r>
+            <w:proofErr w:type="spellEnd"/>
+            <w:r>
+              <w:t xml:space="preserve"> values written during or after streaming SSR cannot be persisted by the cookie </w:t>
+            </w:r>
+            <w:proofErr w:type="spellStart"/>
+            <w:r>
+              <w:t>TempData</w:t>
+            </w:r>
+            <w:proofErr w:type="spellEnd"/>
+            <w:r>
+              <w:t xml:space="preserve"> provider because the response has already started. Switch to the session-storage </w:t>
+            </w:r>
+            <w:proofErr w:type="spellStart"/>
+            <w:r>
+              <w:t>TempData</w:t>
+            </w:r>
+            <w:proofErr w:type="spellEnd"/>
+            <w:r>
+              <w:t xml:space="preserve"> provider (</w:t>
+            </w:r>
+            <w:proofErr w:type="spellStart"/>
+            <w:r>
+              <w:t>RazorComponentsServiceOptions.TempDataProviderType</w:t>
+            </w:r>
+            <w:proofErr w:type="spellEnd"/>
+            <w:r>
+              <w:t xml:space="preserve"> = </w:t>
+            </w:r>
+            <w:proofErr w:type="spellStart"/>
+            <w:r>
+              <w:t>TempDataProviderType.Session</w:t>
+            </w:r>
+            <w:r>
+              <w:lastRenderedPageBreak/>
+              <w:t>Storage</w:t>
+            </w:r>
+            <w:proofErr w:type="spellEnd"/>
+            <w:r>
+              <w:t>) to enable persistence in streaming SSR scenarios.</w:t>
             </w:r>
           </w:p>
         </w:tc>
@@ -2267,7 +2621,6 @@
           </w:tcPr>
           <w:p>
             <w:r>
-              <w:lastRenderedPageBreak/>
               <w:t>Late session subscription failure</w:t>
             </w:r>
           </w:p>
@@ -2287,8 +2640,21 @@
             <w:tcW w:w="3022" w:type="dxa"/>
           </w:tcPr>
           <w:p>
-            <w:r>
-              <w:t>Microsoft.AspNetCore.Components.Endpoints.SessionEstablishmentHelper[1]</w:t>
+            <w:proofErr w:type="gramStart"/>
+            <w:r>
+              <w:t>Microsoft.AspNetCore.Components.Endpoints</w:t>
+            </w:r>
+            <w:proofErr w:type="gramEnd"/>
+            <w:r>
+              <w:t>.</w:t>
+            </w:r>
+            <w:proofErr w:type="gramStart"/>
+            <w:r>
+              <w:t>SessionEstablishmentHelper[</w:t>
+            </w:r>
+            <w:proofErr w:type="gramEnd"/>
+            <w:r>
+              <w:t>1]</w:t>
             </w:r>
           </w:p>
         </w:tc>
@@ -2298,7 +2664,39 @@
           </w:tcPr>
           <w:p>
             <w:r>
-              <w:t>Session state was not persisted to the next request. The response has already started, so the session cookie can no longer be issued. To avoid this, place at least one [SupplyParameterFromSession] (or use Session.Set directly) before any await that triggers the first response flush.</w:t>
+              <w:t xml:space="preserve">Session state </w:t>
+            </w:r>
+            <w:proofErr w:type="gramStart"/>
+            <w:r>
+              <w:t>was not persisted</w:t>
+            </w:r>
+            <w:proofErr w:type="gramEnd"/>
+            <w:r>
+              <w:t xml:space="preserve"> </w:t>
+            </w:r>
+            <w:proofErr w:type="gramStart"/>
+            <w:r>
+              <w:t>to</w:t>
+            </w:r>
+            <w:proofErr w:type="gramEnd"/>
+            <w:r>
+              <w:t xml:space="preserve"> the next request. The response has already started, so the session cookie can no longer be issued. To avoid this, place at least one [</w:t>
+            </w:r>
+            <w:proofErr w:type="spellStart"/>
+            <w:r>
+              <w:t>SupplyParameterFromSession</w:t>
+            </w:r>
+            <w:proofErr w:type="spellEnd"/>
+            <w:r>
+              <w:t xml:space="preserve">] (or use </w:t>
+            </w:r>
+            <w:proofErr w:type="spellStart"/>
+            <w:r>
+              <w:t>Session.Set</w:t>
+            </w:r>
+            <w:proofErr w:type="spellEnd"/>
+            <w:r>
+              <w:t xml:space="preserve"> directly) before any await that triggers the first response flush.</w:t>
             </w:r>
           </w:p>
           <w:p/>
@@ -2313,7 +2711,31 @@
                 <w:rPr>
                   <w:rStyle w:val="Hyperlink"/>
                 </w:rPr>
-                <w:t>late-subscription warning timing</w:t>
+                <w:t>late-subscription war</w:t>
+              </w:r>
+              <w:r>
+                <w:rPr>
+                  <w:rStyle w:val="Hyperlink"/>
+                </w:rPr>
+                <w:t>n</w:t>
+              </w:r>
+              <w:r>
+                <w:rPr>
+                  <w:rStyle w:val="Hyperlink"/>
+                </w:rPr>
+                <w:t>i</w:t>
+              </w:r>
+              <w:r>
+                <w:rPr>
+                  <w:rStyle w:val="Hyperlink"/>
+                </w:rPr>
+                <w:t>n</w:t>
+              </w:r>
+              <w:r>
+                <w:rPr>
+                  <w:rStyle w:val="Hyperlink"/>
+                </w:rPr>
+                <w:t>g timing</w:t>
               </w:r>
             </w:hyperlink>
           </w:p>
@@ -2524,7 +2946,15 @@
           </w:tcPr>
           <w:p>
             <w:r>
-              <w:t>Streaming response starts → delay executes → TempData write occurs after the response has started</w:t>
+              <w:t xml:space="preserve">Streaming response starts → delay executes → </w:t>
+            </w:r>
+            <w:proofErr w:type="spellStart"/>
+            <w:r>
+              <w:t>TempData</w:t>
+            </w:r>
+            <w:proofErr w:type="spellEnd"/>
+            <w:r>
+              <w:t xml:space="preserve"> write occurs after the response has started</w:t>
             </w:r>
           </w:p>
         </w:tc>
@@ -2547,7 +2977,23 @@
           </w:tcPr>
           <w:p>
             <w:r>
-              <w:t>Cookie-backed TempData isn't persisted; subsequent reader doesn't contain the value</w:t>
+              <w:t xml:space="preserve">Cookie-backed </w:t>
+            </w:r>
+            <w:proofErr w:type="spellStart"/>
+            <w:r>
+              <w:t>TempData</w:t>
+            </w:r>
+            <w:proofErr w:type="spellEnd"/>
+            <w:r>
+              <w:t xml:space="preserve"> </w:t>
+            </w:r>
+            <w:proofErr w:type="gramStart"/>
+            <w:r>
+              <w:t>isn't persisted</w:t>
+            </w:r>
+            <w:proofErr w:type="gramEnd"/>
+            <w:r>
+              <w:t>; subsequent reader doesn't contain the value</w:t>
             </w:r>
           </w:p>
         </w:tc>
@@ -2574,12 +3020,14 @@
               <w:t xml:space="preserve">, </w:t>
             </w:r>
             <w:hyperlink r:id="rId64" w:history="1">
+              <w:proofErr w:type="spellStart"/>
               <w:r>
                 <w:rPr>
                   <w:rStyle w:val="Hyperlink"/>
                 </w:rPr>
                 <w:t>cookie_post_await_reader_first_load</w:t>
               </w:r>
+              <w:proofErr w:type="spellEnd"/>
             </w:hyperlink>
           </w:p>
         </w:tc>
@@ -2609,8 +3057,17 @@
                 <w:b/>
                 <w:bCs/>
               </w:rPr>
-              <w:t>Cookie pre-await</w:t>
-            </w:r>
+              <w:t>Cookie pre-</w:t>
+            </w:r>
+            <w:proofErr w:type="gramStart"/>
+            <w:r>
+              <w:rPr>
+                <w:b/>
+                <w:bCs/>
+              </w:rPr>
+              <w:t>await</w:t>
+            </w:r>
+            <w:proofErr w:type="gramEnd"/>
           </w:p>
         </w:tc>
         <w:tc>
@@ -2632,11 +3089,19 @@
           </w:tcPr>
           <w:p>
             <w:r>
-              <w:t xml:space="preserve">Streaming response has already started → TempData assignment occurs before the artificial delay → </w:t>
+              <w:t xml:space="preserve">Streaming response has already started → </w:t>
+            </w:r>
+            <w:proofErr w:type="spellStart"/>
+            <w:r>
+              <w:t>TempData</w:t>
+            </w:r>
+            <w:proofErr w:type="spellEnd"/>
+            <w:r>
+              <w:t xml:space="preserve"> assignment occurs before the artificial </w:t>
             </w:r>
             <w:r>
               <w:lastRenderedPageBreak/>
-              <w:t>delayed work executes</w:t>
+              <w:t>delay → delayed work executes</w:t>
             </w:r>
           </w:p>
         </w:tc>
@@ -2660,7 +3125,27 @@
           <w:p>
             <w:r>
               <w:lastRenderedPageBreak/>
-              <w:t>Cookie-backed TempData still isn't persisted because response start is the important boundary; subsequent reader doesn't contain the value</w:t>
+              <w:t xml:space="preserve">Cookie-backed </w:t>
+            </w:r>
+            <w:proofErr w:type="spellStart"/>
+            <w:r>
+              <w:t>TempData</w:t>
+            </w:r>
+            <w:proofErr w:type="spellEnd"/>
+            <w:r>
+              <w:t xml:space="preserve"> still </w:t>
+            </w:r>
+            <w:proofErr w:type="gramStart"/>
+            <w:r>
+              <w:t>isn't persisted</w:t>
+            </w:r>
+            <w:proofErr w:type="gramEnd"/>
+            <w:r>
+              <w:t xml:space="preserve"> because response start is the important boundary; subsequent reader </w:t>
+            </w:r>
+            <w:r>
+              <w:lastRenderedPageBreak/>
+              <w:t>doesn't contain the value</w:t>
             </w:r>
           </w:p>
         </w:tc>
@@ -2680,7 +3165,14 @@
                 <w:rPr>
                   <w:rStyle w:val="Hyperlink"/>
                 </w:rPr>
-                <w:t>cookie pre-await request timin</w:t>
+                <w:t xml:space="preserve">cookie pre-await request </w:t>
+              </w:r>
+              <w:proofErr w:type="spellStart"/>
+              <w:r>
+                <w:rPr>
+                  <w:rStyle w:val="Hyperlink"/>
+                </w:rPr>
+                <w:t>timin</w:t>
               </w:r>
             </w:hyperlink>
             <w:r>
@@ -2696,6 +3188,7 @@
                 </w:rPr>
                 <w:t>cookie_pre_await_reader_first_load</w:t>
               </w:r>
+              <w:proofErr w:type="spellEnd"/>
             </w:hyperlink>
           </w:p>
         </w:tc>
@@ -2748,7 +3241,15 @@
           </w:tcPr>
           <w:p>
             <w:r>
-              <w:t>Session is established/subscribed before response start → streaming response starts → session-backed value is updated after the delay/flush → request completes</w:t>
+              <w:t xml:space="preserve">Session is established/subscribed before response </w:t>
+            </w:r>
+            <w:proofErr w:type="gramStart"/>
+            <w:r>
+              <w:t>start →</w:t>
+            </w:r>
+            <w:proofErr w:type="gramEnd"/>
+            <w:r>
+              <w:t xml:space="preserve"> streaming response starts → session-backed value is updated after the delay/flush → request completes</w:t>
             </w:r>
           </w:p>
         </w:tc>
@@ -2813,12 +3314,14 @@
               <w:t xml:space="preserve">, </w:t>
             </w:r>
             <w:hyperlink r:id="rId69" w:history="1">
+              <w:proofErr w:type="spellStart"/>
               <w:r>
                 <w:rPr>
                   <w:rStyle w:val="Hyperlink"/>
                 </w:rPr>
                 <w:t>positive_before_submit</w:t>
               </w:r>
+              <w:proofErr w:type="spellEnd"/>
             </w:hyperlink>
             <w:r>
               <w:t>,</w:t>
@@ -2826,12 +3329,14 @@
           </w:p>
           <w:p>
             <w:hyperlink r:id="rId70" w:history="1">
+              <w:proofErr w:type="spellStart"/>
               <w:r>
                 <w:rPr>
                   <w:rStyle w:val="Hyperlink"/>
                 </w:rPr>
                 <w:t>updated_session_value_is_still_present_after_the_flush</w:t>
               </w:r>
+              <w:proofErr w:type="spellEnd"/>
             </w:hyperlink>
           </w:p>
         </w:tc>
@@ -2906,8 +3411,18 @@
             <w:hideMark/>
           </w:tcPr>
           <w:p>
-            <w:r>
-              <w:t>SessionEstablishmentHelper[1] warning is emitted; attempted value isn't available on the subsequent request</w:t>
+            <w:proofErr w:type="spellStart"/>
+            <w:proofErr w:type="gramStart"/>
+            <w:r>
+              <w:t>SessionEstablishmentHelper</w:t>
+            </w:r>
+            <w:proofErr w:type="spellEnd"/>
+            <w:r>
+              <w:t>[</w:t>
+            </w:r>
+            <w:proofErr w:type="gramEnd"/>
+            <w:r>
+              <w:t>1] warning is emitted; attempted value isn't available on the subsequent request</w:t>
             </w:r>
           </w:p>
         </w:tc>
@@ -2974,14 +3489,51 @@
           <w:b/>
           <w:bCs/>
         </w:rPr>
+        <w:lastRenderedPageBreak/>
         <w:t>Documentation finding:</w:t>
       </w:r>
       <w:r>
-        <w:t xml:space="preserve"> The Microsoft Learn documentation describes TempData persistence during static SSR, the default cookie-based TempData provider, and session </w:t>
-      </w:r>
-      <w:r>
-        <w:lastRenderedPageBreak/>
-        <w:t>data persistence. However, the cited documentation doesn't explicitly describe the streaming-specific response-start condition where cookie-backed TempData can't persist changes after the HTTP response has already started. In this validation, that specific streaming timing restriction and the recommendation to use session-backed TempData were surfaced by the runtime warning</w:t>
+        <w:t xml:space="preserve"> The Microsoft Learn documentation describes </w:t>
+      </w:r>
+      <w:proofErr w:type="spellStart"/>
+      <w:r>
+        <w:t>TempData</w:t>
+      </w:r>
+      <w:proofErr w:type="spellEnd"/>
+      <w:r>
+        <w:t xml:space="preserve"> persistence during static SSR, the default cookie-based </w:t>
+      </w:r>
+      <w:proofErr w:type="spellStart"/>
+      <w:r>
+        <w:t>TempData</w:t>
+      </w:r>
+      <w:proofErr w:type="spellEnd"/>
+      <w:r>
+        <w:t xml:space="preserve"> provider, and session data persistence. However, the cited documentation doesn't explicitly describe the streaming-specific response-start condition where cookie-backed </w:t>
+      </w:r>
+      <w:proofErr w:type="spellStart"/>
+      <w:r>
+        <w:t>TempData</w:t>
+      </w:r>
+      <w:proofErr w:type="spellEnd"/>
+      <w:r>
+        <w:t xml:space="preserve"> can't </w:t>
+      </w:r>
+      <w:proofErr w:type="gramStart"/>
+      <w:r>
+        <w:t>persist</w:t>
+      </w:r>
+      <w:proofErr w:type="gramEnd"/>
+      <w:r>
+        <w:t xml:space="preserve"> changes after the HTTP response has already started. In this validation, that specific streaming timing restriction and the recommendation to use session-backed </w:t>
+      </w:r>
+      <w:proofErr w:type="spellStart"/>
+      <w:r>
+        <w:t>TempData</w:t>
+      </w:r>
+      <w:proofErr w:type="spellEnd"/>
+      <w:r>
+        <w:t xml:space="preserve"> were surfaced by the runtime warning</w:t>
       </w:r>
       <w:r>
         <w:t>.</w:t>
@@ -3032,14 +3584,467 @@
           <w:b/>
           <w:bCs/>
         </w:rPr>
-        <w:t>Problems</w:t>
+        <w:t>Problems / Additional Observation</w:t>
       </w:r>
     </w:p>
     <w:p>
       <w:r>
-        <w:t>None</w:t>
+        <w:t>During the deferred-session negative scenario, the expected late session-establishment warning was emitted after the response had already started.</w:t>
       </w:r>
     </w:p>
+    <w:p>
+      <w:r>
+        <w:t xml:space="preserve">The same run additionally produced an </w:t>
+      </w:r>
+      <w:proofErr w:type="spellStart"/>
+      <w:r>
+        <w:t>InvalidOperationException</w:t>
+      </w:r>
+      <w:proofErr w:type="spellEnd"/>
+      <w:r>
+        <w:t xml:space="preserve"> indicating that the session couldn't be established after the response had started. Associated exception middleware/Kestrel logging was also captured.</w:t>
+      </w:r>
+    </w:p>
+    <w:p>
+      <w:r>
+        <w:t>The exception is reported separately from the expected session-establishment warning and requires confirmation from the feature owner regarding whether this represents the intended failure behavior.</w:t>
+      </w:r>
+    </w:p>
+    <w:p>
+      <w:pPr>
+        <w:rPr>
+          <w:b/>
+          <w:bCs/>
+        </w:rPr>
+      </w:pPr>
+      <w:r>
+        <w:t>R</w:t>
+      </w:r>
+      <w:r>
+        <w:rPr>
+          <w:b/>
+          <w:bCs/>
+        </w:rPr>
+        <w:t>eplication steps:</w:t>
+      </w:r>
+    </w:p>
+    <w:p>
+      <w:pPr>
+        <w:pStyle w:val="ListParagraph"/>
+        <w:numPr>
+          <w:ilvl w:val="0"/>
+          <w:numId w:val="4"/>
+        </w:numPr>
+      </w:pPr>
+      <w:r>
+        <w:t xml:space="preserve">Enable </w:t>
+      </w:r>
+      <w:r>
+        <w:rPr>
+          <w:b/>
+          <w:bCs/>
+        </w:rPr>
+        <w:t>Session-backed storage</w:t>
+      </w:r>
+      <w:r>
+        <w:t xml:space="preserve"> and run the application. </w:t>
+      </w:r>
+    </w:p>
+    <w:p>
+      <w:pPr>
+        <w:pStyle w:val="ListParagraph"/>
+        <w:numPr>
+          <w:ilvl w:val="0"/>
+          <w:numId w:val="4"/>
+        </w:numPr>
+      </w:pPr>
+      <w:r>
+        <w:t xml:space="preserve">Navigate to the </w:t>
+      </w:r>
+      <w:r>
+        <w:rPr>
+          <w:b/>
+          <w:bCs/>
+        </w:rPr>
+        <w:t>session-late-parent</w:t>
+      </w:r>
+      <w:r>
+        <w:t xml:space="preserve"> validation page. </w:t>
+      </w:r>
+    </w:p>
+    <w:p>
+      <w:pPr>
+        <w:pStyle w:val="ListParagraph"/>
+        <w:numPr>
+          <w:ilvl w:val="0"/>
+          <w:numId w:val="4"/>
+        </w:numPr>
+      </w:pPr>
+      <w:r>
+        <w:t xml:space="preserve">Before starting the test, clear all application cookies and verify that the initial request contains </w:t>
+      </w:r>
+      <w:r>
+        <w:rPr>
+          <w:b/>
+          <w:bCs/>
+        </w:rPr>
+        <w:t>no existing session cookie</w:t>
+      </w:r>
+      <w:r>
+        <w:t xml:space="preserve">. </w:t>
+      </w:r>
+    </w:p>
+    <w:p>
+      <w:pPr>
+        <w:pStyle w:val="ListParagraph"/>
+        <w:numPr>
+          <w:ilvl w:val="0"/>
+          <w:numId w:val="4"/>
+        </w:numPr>
+      </w:pPr>
+      <w:r>
+        <w:t xml:space="preserve">Load the deferred-session parent and allow the response to begin streaming. </w:t>
+      </w:r>
+    </w:p>
+    <w:p>
+      <w:pPr>
+        <w:pStyle w:val="ListParagraph"/>
+        <w:numPr>
+          <w:ilvl w:val="0"/>
+          <w:numId w:val="4"/>
+        </w:numPr>
+      </w:pPr>
+      <w:r>
+        <w:t xml:space="preserve">Verify through server-side instrumentation that </w:t>
+      </w:r>
+      <w:proofErr w:type="spellStart"/>
+      <w:r>
+        <w:rPr>
+          <w:b/>
+          <w:bCs/>
+        </w:rPr>
+        <w:t>HttpResponse.HasStarted</w:t>
+      </w:r>
+      <w:proofErr w:type="spellEnd"/>
+      <w:r>
+        <w:rPr>
+          <w:b/>
+          <w:bCs/>
+        </w:rPr>
+        <w:t>=True</w:t>
+      </w:r>
+      <w:r>
+        <w:t xml:space="preserve"> before the deferred child becomes active. </w:t>
+      </w:r>
+    </w:p>
+    <w:p>
+      <w:pPr>
+        <w:pStyle w:val="ListParagraph"/>
+        <w:numPr>
+          <w:ilvl w:val="0"/>
+          <w:numId w:val="4"/>
+        </w:numPr>
+      </w:pPr>
+      <w:r>
+        <w:t xml:space="preserve">After the configured delay, verify that the late-mounted child attempts to assign the distinctive session value </w:t>
+      </w:r>
+      <w:r>
+        <w:rPr>
+          <w:b/>
+          <w:bCs/>
+        </w:rPr>
+        <w:t>69135</w:t>
+      </w:r>
+      <w:r>
+        <w:t xml:space="preserve">. </w:t>
+      </w:r>
+    </w:p>
+    <w:p>
+      <w:pPr>
+        <w:pStyle w:val="ListParagraph"/>
+        <w:numPr>
+          <w:ilvl w:val="0"/>
+          <w:numId w:val="4"/>
+        </w:numPr>
+      </w:pPr>
+      <w:r>
+        <w:t xml:space="preserve">Verify that the expected </w:t>
+      </w:r>
+      <w:proofErr w:type="spellStart"/>
+      <w:proofErr w:type="gramStart"/>
+      <w:r>
+        <w:rPr>
+          <w:b/>
+          <w:bCs/>
+        </w:rPr>
+        <w:t>SessionEstablishmentHelper</w:t>
+      </w:r>
+      <w:proofErr w:type="spellEnd"/>
+      <w:r>
+        <w:rPr>
+          <w:b/>
+          <w:bCs/>
+        </w:rPr>
+        <w:t>[</w:t>
+      </w:r>
+      <w:proofErr w:type="gramEnd"/>
+      <w:r>
+        <w:rPr>
+          <w:b/>
+          <w:bCs/>
+        </w:rPr>
+        <w:t>1]</w:t>
+      </w:r>
+      <w:r>
+        <w:t xml:space="preserve"> warning is emitted because the session cannot be established after the response has already started. </w:t>
+      </w:r>
+    </w:p>
+    <w:p>
+      <w:pPr>
+        <w:pStyle w:val="ListParagraph"/>
+        <w:numPr>
+          <w:ilvl w:val="0"/>
+          <w:numId w:val="4"/>
+        </w:numPr>
+      </w:pPr>
+      <w:r>
+        <w:t xml:space="preserve">Observe whether the same request additionally produces an </w:t>
+      </w:r>
+      <w:proofErr w:type="spellStart"/>
+      <w:r>
+        <w:rPr>
+          <w:b/>
+          <w:bCs/>
+        </w:rPr>
+        <w:t>InvalidOperationException</w:t>
+      </w:r>
+      <w:proofErr w:type="spellEnd"/>
+      <w:r>
+        <w:t xml:space="preserve"> indicating that the session cannot be established after </w:t>
+      </w:r>
+      <w:r>
+        <w:lastRenderedPageBreak/>
+        <w:t xml:space="preserve">the response has started. Capture any associated Developer Exception Middleware and Kestrel logging separately. </w:t>
+      </w:r>
+    </w:p>
+    <w:p>
+      <w:pPr>
+        <w:pStyle w:val="ListParagraph"/>
+        <w:numPr>
+          <w:ilvl w:val="0"/>
+          <w:numId w:val="4"/>
+        </w:numPr>
+      </w:pPr>
+      <w:r>
+        <w:t xml:space="preserve">Verify that </w:t>
+      </w:r>
+      <w:r>
+        <w:rPr>
+          <w:b/>
+          <w:bCs/>
+        </w:rPr>
+        <w:t>LateSessionValue-69135 is not present</w:t>
+      </w:r>
+      <w:r>
+        <w:t xml:space="preserve"> on the follow-up request, confirming that the attempted late session value </w:t>
+      </w:r>
+      <w:proofErr w:type="gramStart"/>
+      <w:r>
+        <w:t>was not persisted</w:t>
+      </w:r>
+      <w:proofErr w:type="gramEnd"/>
+      <w:r>
+        <w:t>.</w:t>
+      </w:r>
+    </w:p>
+    <w:p>
+      <w:pPr>
+        <w:spacing w:before="100" w:beforeAutospacing="1" w:after="100" w:afterAutospacing="1" w:line="300" w:lineRule="atLeast"/>
+        <w:ind w:left="360"/>
+        <w:outlineLvl w:val="2"/>
+        <w:rPr>
+          <w:rFonts w:ascii="Segoe UI" w:eastAsia="Times New Roman" w:hAnsi="Segoe UI" w:cs="Segoe UI"/>
+          <w:b/>
+          <w:bCs/>
+          <w:kern w:val="0"/>
+          <w:sz w:val="27"/>
+          <w:szCs w:val="27"/>
+          <w14:ligatures w14:val="none"/>
+        </w:rPr>
+      </w:pPr>
+      <w:r>
+        <w:rPr>
+          <w:rFonts w:ascii="Segoe UI" w:eastAsia="Times New Roman" w:hAnsi="Segoe UI" w:cs="Segoe UI"/>
+          <w:b/>
+          <w:bCs/>
+          <w:kern w:val="0"/>
+          <w:sz w:val="27"/>
+          <w:szCs w:val="27"/>
+          <w14:ligatures w14:val="none"/>
+        </w:rPr>
+        <w:t>Expected Result</w:t>
+      </w:r>
+    </w:p>
+    <w:p>
+      <w:pPr>
+        <w:pStyle w:val="ListParagraph"/>
+        <w:numPr>
+          <w:ilvl w:val="0"/>
+          <w:numId w:val="4"/>
+        </w:numPr>
+        <w:spacing w:before="100" w:beforeAutospacing="1" w:after="100" w:afterAutospacing="1" w:line="300" w:lineRule="atLeast"/>
+        <w:rPr>
+          <w:rFonts w:eastAsia="Times New Roman" w:cs="Segoe UI"/>
+          <w:kern w:val="0"/>
+          <w14:ligatures w14:val="none"/>
+        </w:rPr>
+      </w:pPr>
+      <w:r>
+        <w:rPr>
+          <w:rFonts w:eastAsia="Times New Roman" w:cs="Segoe UI"/>
+          <w:kern w:val="0"/>
+          <w14:ligatures w14:val="none"/>
+        </w:rPr>
+        <w:t xml:space="preserve">The deferred child attempts to write </w:t>
+      </w:r>
+      <w:r>
+        <w:rPr>
+          <w:rFonts w:eastAsia="Times New Roman" w:cs="Courier New"/>
+          <w:kern w:val="0"/>
+          <w14:ligatures w14:val="none"/>
+        </w:rPr>
+        <w:t>LateSessionValue-69135</w:t>
+      </w:r>
+      <w:r>
+        <w:rPr>
+          <w:rFonts w:eastAsia="Times New Roman" w:cs="Segoe UI"/>
+          <w:kern w:val="0"/>
+          <w14:ligatures w14:val="none"/>
+        </w:rPr>
+        <w:t xml:space="preserve"> only after the streaming response has already started. Because no session cookie was established beforehand, the late session establishment produces the expected </w:t>
+      </w:r>
+      <w:proofErr w:type="spellStart"/>
+      <w:proofErr w:type="gramStart"/>
+      <w:r>
+        <w:rPr>
+          <w:rFonts w:eastAsia="Times New Roman" w:cs="Courier New"/>
+          <w:kern w:val="0"/>
+          <w14:ligatures w14:val="none"/>
+        </w:rPr>
+        <w:t>SessionEstablishmentHelper</w:t>
+      </w:r>
+      <w:proofErr w:type="spellEnd"/>
+      <w:r>
+        <w:rPr>
+          <w:rFonts w:eastAsia="Times New Roman" w:cs="Courier New"/>
+          <w:kern w:val="0"/>
+          <w14:ligatures w14:val="none"/>
+        </w:rPr>
+        <w:t>[</w:t>
+      </w:r>
+      <w:proofErr w:type="gramEnd"/>
+      <w:r>
+        <w:rPr>
+          <w:rFonts w:eastAsia="Times New Roman" w:cs="Courier New"/>
+          <w:kern w:val="0"/>
+          <w14:ligatures w14:val="none"/>
+        </w:rPr>
+        <w:t>1]</w:t>
+      </w:r>
+      <w:r>
+        <w:rPr>
+          <w:rFonts w:eastAsia="Times New Roman" w:cs="Segoe UI"/>
+          <w:kern w:val="0"/>
+          <w14:ligatures w14:val="none"/>
+        </w:rPr>
+        <w:t xml:space="preserve"> warning, and the attempted value is not available on the subsequent reader request.</w:t>
+      </w:r>
+    </w:p>
+    <w:p>
+      <w:pPr>
+        <w:pStyle w:val="ListParagraph"/>
+        <w:numPr>
+          <w:ilvl w:val="0"/>
+          <w:numId w:val="4"/>
+        </w:numPr>
+        <w:spacing w:before="100" w:beforeAutospacing="1" w:after="100" w:afterAutospacing="1" w:line="300" w:lineRule="atLeast"/>
+        <w:rPr>
+          <w:rFonts w:eastAsia="Times New Roman" w:cs="Segoe UI"/>
+          <w:kern w:val="0"/>
+          <w14:ligatures w14:val="none"/>
+        </w:rPr>
+      </w:pPr>
+      <w:r>
+        <w:rPr>
+          <w:rFonts w:eastAsia="Times New Roman" w:cs="Segoe UI"/>
+          <w:kern w:val="0"/>
+          <w14:ligatures w14:val="none"/>
+        </w:rPr>
+        <w:t xml:space="preserve">If an </w:t>
+      </w:r>
+      <w:proofErr w:type="spellStart"/>
+      <w:r>
+        <w:rPr>
+          <w:rFonts w:eastAsia="Times New Roman" w:cs="Courier New"/>
+          <w:kern w:val="0"/>
+          <w14:ligatures w14:val="none"/>
+        </w:rPr>
+        <w:t>InvalidOperationException</w:t>
+      </w:r>
+      <w:proofErr w:type="spellEnd"/>
+      <w:r>
+        <w:rPr>
+          <w:rFonts w:eastAsia="Times New Roman" w:cs="Segoe UI"/>
+          <w:kern w:val="0"/>
+          <w14:ligatures w14:val="none"/>
+        </w:rPr>
+        <w:t xml:space="preserve"> is also produced, record the exception separately as an additional runtime observation rather than treating the scenario as having no problems.</w:t>
+      </w:r>
+    </w:p>
+    <w:p>
+      <w:pPr>
+        <w:spacing w:before="100" w:beforeAutospacing="1" w:after="100" w:afterAutospacing="1" w:line="300" w:lineRule="atLeast"/>
+        <w:rPr>
+          <w:rFonts w:eastAsia="Times New Roman" w:cs="Segoe UI"/>
+          <w:b/>
+          <w:bCs/>
+          <w:kern w:val="0"/>
+          <w14:ligatures w14:val="none"/>
+        </w:rPr>
+      </w:pPr>
+      <w:r>
+        <w:rPr>
+          <w:rFonts w:eastAsia="Times New Roman" w:cs="Segoe UI"/>
+          <w:b/>
+          <w:bCs/>
+          <w:kern w:val="0"/>
+          <w14:ligatures w14:val="none"/>
+        </w:rPr>
+        <w:t>Evidence</w:t>
+      </w:r>
+    </w:p>
+    <w:p>
+      <w:pPr>
+        <w:spacing w:before="100" w:beforeAutospacing="1" w:after="100" w:afterAutospacing="1" w:line="300" w:lineRule="atLeast"/>
+        <w:rPr>
+          <w:rFonts w:eastAsia="Times New Roman" w:cs="Segoe UI"/>
+          <w:kern w:val="0"/>
+          <w14:ligatures w14:val="none"/>
+        </w:rPr>
+      </w:pPr>
+      <w:hyperlink r:id="rId76" w:history="1">
+        <w:r>
+          <w:rPr>
+            <w:rStyle w:val="Hyperlink"/>
+            <w:rFonts w:eastAsia="Times New Roman" w:cs="Segoe UI"/>
+            <w:kern w:val="0"/>
+            <w14:ligatures w14:val="none"/>
+          </w:rPr>
+          <w:t>Warning and Exception</w:t>
+        </w:r>
+      </w:hyperlink>
+    </w:p>
+    <w:p/>
     <w:p/>
     <w:sectPr>
       <w:pgSz w:w="12240" w:h="15840"/>
@@ -3795,6 +4800,119 @@
     </w:lvl>
   </w:abstractNum>
   <w:abstractNum w:abstractNumId="5" w15:restartNumberingAfterBreak="0">
+    <w:nsid w:val="3CB414B1"/>
+    <w:multiLevelType w:val="hybridMultilevel"/>
+    <w:tmpl w:val="DF00BECC"/>
+    <w:lvl w:ilvl="0" w:tplc="04090001">
+      <w:start w:val="1"/>
+      <w:numFmt w:val="bullet"/>
+      <w:lvlText w:val=""/>
+      <w:lvlJc w:val="left"/>
+      <w:pPr>
+        <w:ind w:left="720" w:hanging="360"/>
+      </w:pPr>
+      <w:rPr>
+        <w:rFonts w:ascii="Symbol" w:hAnsi="Symbol" w:hint="default"/>
+      </w:rPr>
+    </w:lvl>
+    <w:lvl w:ilvl="1" w:tplc="04090003" w:tentative="1">
+      <w:start w:val="1"/>
+      <w:numFmt w:val="bullet"/>
+      <w:lvlText w:val="o"/>
+      <w:lvlJc w:val="left"/>
+      <w:pPr>
+        <w:ind w:left="1440" w:hanging="360"/>
+      </w:pPr>
+      <w:rPr>
+        <w:rFonts w:ascii="Courier New" w:hAnsi="Courier New" w:cs="Courier New" w:hint="default"/>
+      </w:rPr>
+    </w:lvl>
+    <w:lvl w:ilvl="2" w:tplc="04090005" w:tentative="1">
+      <w:start w:val="1"/>
+      <w:numFmt w:val="bullet"/>
+      <w:lvlText w:val=""/>
+      <w:lvlJc w:val="left"/>
+      <w:pPr>
+        <w:ind w:left="2160" w:hanging="360"/>
+      </w:pPr>
+      <w:rPr>
+        <w:rFonts w:ascii="Wingdings" w:hAnsi="Wingdings" w:hint="default"/>
+      </w:rPr>
+    </w:lvl>
+    <w:lvl w:ilvl="3" w:tplc="04090001" w:tentative="1">
+      <w:start w:val="1"/>
+      <w:numFmt w:val="bullet"/>
+      <w:lvlText w:val=""/>
+      <w:lvlJc w:val="left"/>
+      <w:pPr>
+        <w:ind w:left="2880" w:hanging="360"/>
+      </w:pPr>
+      <w:rPr>
+        <w:rFonts w:ascii="Symbol" w:hAnsi="Symbol" w:hint="default"/>
+      </w:rPr>
+    </w:lvl>
+    <w:lvl w:ilvl="4" w:tplc="04090003" w:tentative="1">
+      <w:start w:val="1"/>
+      <w:numFmt w:val="bullet"/>
+      <w:lvlText w:val="o"/>
+      <w:lvlJc w:val="left"/>
+      <w:pPr>
+        <w:ind w:left="3600" w:hanging="360"/>
+      </w:pPr>
+      <w:rPr>
+        <w:rFonts w:ascii="Courier New" w:hAnsi="Courier New" w:cs="Courier New" w:hint="default"/>
+      </w:rPr>
+    </w:lvl>
+    <w:lvl w:ilvl="5" w:tplc="04090005" w:tentative="1">
+      <w:start w:val="1"/>
+      <w:numFmt w:val="bullet"/>
+      <w:lvlText w:val=""/>
+      <w:lvlJc w:val="left"/>
+      <w:pPr>
+        <w:ind w:left="4320" w:hanging="360"/>
+      </w:pPr>
+      <w:rPr>
+        <w:rFonts w:ascii="Wingdings" w:hAnsi="Wingdings" w:hint="default"/>
+      </w:rPr>
+    </w:lvl>
+    <w:lvl w:ilvl="6" w:tplc="04090001" w:tentative="1">
+      <w:start w:val="1"/>
+      <w:numFmt w:val="bullet"/>
+      <w:lvlText w:val=""/>
+      <w:lvlJc w:val="left"/>
+      <w:pPr>
+        <w:ind w:left="5040" w:hanging="360"/>
+      </w:pPr>
+      <w:rPr>
+        <w:rFonts w:ascii="Symbol" w:hAnsi="Symbol" w:hint="default"/>
+      </w:rPr>
+    </w:lvl>
+    <w:lvl w:ilvl="7" w:tplc="04090003" w:tentative="1">
+      <w:start w:val="1"/>
+      <w:numFmt w:val="bullet"/>
+      <w:lvlText w:val="o"/>
+      <w:lvlJc w:val="left"/>
+      <w:pPr>
+        <w:ind w:left="5760" w:hanging="360"/>
+      </w:pPr>
+      <w:rPr>
+        <w:rFonts w:ascii="Courier New" w:hAnsi="Courier New" w:cs="Courier New" w:hint="default"/>
+      </w:rPr>
+    </w:lvl>
+    <w:lvl w:ilvl="8" w:tplc="04090005" w:tentative="1">
+      <w:start w:val="1"/>
+      <w:numFmt w:val="bullet"/>
+      <w:lvlText w:val=""/>
+      <w:lvlJc w:val="left"/>
+      <w:pPr>
+        <w:ind w:left="6480" w:hanging="360"/>
+      </w:pPr>
+      <w:rPr>
+        <w:rFonts w:ascii="Wingdings" w:hAnsi="Wingdings" w:hint="default"/>
+      </w:rPr>
+    </w:lvl>
+  </w:abstractNum>
+  <w:abstractNum w:abstractNumId="6" w15:restartNumberingAfterBreak="0">
     <w:nsid w:val="573E2804"/>
     <w:multiLevelType w:val="multilevel"/>
     <w:tmpl w:val="C47A023C"/>
@@ -3943,7 +5061,120 @@
       </w:rPr>
     </w:lvl>
   </w:abstractNum>
-  <w:abstractNum w:abstractNumId="6" w15:restartNumberingAfterBreak="0">
+  <w:abstractNum w:abstractNumId="7" w15:restartNumberingAfterBreak="0">
+    <w:nsid w:val="64165BFD"/>
+    <w:multiLevelType w:val="hybridMultilevel"/>
+    <w:tmpl w:val="8050FC6A"/>
+    <w:lvl w:ilvl="0" w:tplc="04090001">
+      <w:start w:val="1"/>
+      <w:numFmt w:val="bullet"/>
+      <w:lvlText w:val=""/>
+      <w:lvlJc w:val="left"/>
+      <w:pPr>
+        <w:ind w:left="720" w:hanging="360"/>
+      </w:pPr>
+      <w:rPr>
+        <w:rFonts w:ascii="Symbol" w:hAnsi="Symbol" w:hint="default"/>
+      </w:rPr>
+    </w:lvl>
+    <w:lvl w:ilvl="1" w:tplc="04090003" w:tentative="1">
+      <w:start w:val="1"/>
+      <w:numFmt w:val="bullet"/>
+      <w:lvlText w:val="o"/>
+      <w:lvlJc w:val="left"/>
+      <w:pPr>
+        <w:ind w:left="1440" w:hanging="360"/>
+      </w:pPr>
+      <w:rPr>
+        <w:rFonts w:ascii="Courier New" w:hAnsi="Courier New" w:cs="Courier New" w:hint="default"/>
+      </w:rPr>
+    </w:lvl>
+    <w:lvl w:ilvl="2" w:tplc="04090005" w:tentative="1">
+      <w:start w:val="1"/>
+      <w:numFmt w:val="bullet"/>
+      <w:lvlText w:val=""/>
+      <w:lvlJc w:val="left"/>
+      <w:pPr>
+        <w:ind w:left="2160" w:hanging="360"/>
+      </w:pPr>
+      <w:rPr>
+        <w:rFonts w:ascii="Wingdings" w:hAnsi="Wingdings" w:hint="default"/>
+      </w:rPr>
+    </w:lvl>
+    <w:lvl w:ilvl="3" w:tplc="04090001" w:tentative="1">
+      <w:start w:val="1"/>
+      <w:numFmt w:val="bullet"/>
+      <w:lvlText w:val=""/>
+      <w:lvlJc w:val="left"/>
+      <w:pPr>
+        <w:ind w:left="2880" w:hanging="360"/>
+      </w:pPr>
+      <w:rPr>
+        <w:rFonts w:ascii="Symbol" w:hAnsi="Symbol" w:hint="default"/>
+      </w:rPr>
+    </w:lvl>
+    <w:lvl w:ilvl="4" w:tplc="04090003" w:tentative="1">
+      <w:start w:val="1"/>
+      <w:numFmt w:val="bullet"/>
+      <w:lvlText w:val="o"/>
+      <w:lvlJc w:val="left"/>
+      <w:pPr>
+        <w:ind w:left="3600" w:hanging="360"/>
+      </w:pPr>
+      <w:rPr>
+        <w:rFonts w:ascii="Courier New" w:hAnsi="Courier New" w:cs="Courier New" w:hint="default"/>
+      </w:rPr>
+    </w:lvl>
+    <w:lvl w:ilvl="5" w:tplc="04090005" w:tentative="1">
+      <w:start w:val="1"/>
+      <w:numFmt w:val="bullet"/>
+      <w:lvlText w:val=""/>
+      <w:lvlJc w:val="left"/>
+      <w:pPr>
+        <w:ind w:left="4320" w:hanging="360"/>
+      </w:pPr>
+      <w:rPr>
+        <w:rFonts w:ascii="Wingdings" w:hAnsi="Wingdings" w:hint="default"/>
+      </w:rPr>
+    </w:lvl>
+    <w:lvl w:ilvl="6" w:tplc="04090001" w:tentative="1">
+      <w:start w:val="1"/>
+      <w:numFmt w:val="bullet"/>
+      <w:lvlText w:val=""/>
+      <w:lvlJc w:val="left"/>
+      <w:pPr>
+        <w:ind w:left="5040" w:hanging="360"/>
+      </w:pPr>
+      <w:rPr>
+        <w:rFonts w:ascii="Symbol" w:hAnsi="Symbol" w:hint="default"/>
+      </w:rPr>
+    </w:lvl>
+    <w:lvl w:ilvl="7" w:tplc="04090003" w:tentative="1">
+      <w:start w:val="1"/>
+      <w:numFmt w:val="bullet"/>
+      <w:lvlText w:val="o"/>
+      <w:lvlJc w:val="left"/>
+      <w:pPr>
+        <w:ind w:left="5760" w:hanging="360"/>
+      </w:pPr>
+      <w:rPr>
+        <w:rFonts w:ascii="Courier New" w:hAnsi="Courier New" w:cs="Courier New" w:hint="default"/>
+      </w:rPr>
+    </w:lvl>
+    <w:lvl w:ilvl="8" w:tplc="04090005" w:tentative="1">
+      <w:start w:val="1"/>
+      <w:numFmt w:val="bullet"/>
+      <w:lvlText w:val=""/>
+      <w:lvlJc w:val="left"/>
+      <w:pPr>
+        <w:ind w:left="6480" w:hanging="360"/>
+      </w:pPr>
+      <w:rPr>
+        <w:rFonts w:ascii="Wingdings" w:hAnsi="Wingdings" w:hint="default"/>
+      </w:rPr>
+    </w:lvl>
+  </w:abstractNum>
+  <w:abstractNum w:abstractNumId="8" w15:restartNumberingAfterBreak="0">
     <w:nsid w:val="65071647"/>
     <w:multiLevelType w:val="multilevel"/>
     <w:tmpl w:val="A8A0A0EE"/>
@@ -4096,13 +5327,13 @@
     <w:abstractNumId w:val="0"/>
   </w:num>
   <w:num w:numId="2" w16cid:durableId="714309166">
-    <w:abstractNumId w:val="6"/>
+    <w:abstractNumId w:val="8"/>
   </w:num>
   <w:num w:numId="3" w16cid:durableId="257063299">
     <w:abstractNumId w:val="2"/>
   </w:num>
   <w:num w:numId="4" w16cid:durableId="380788550">
-    <w:abstractNumId w:val="5"/>
+    <w:abstractNumId w:val="6"/>
   </w:num>
   <w:num w:numId="5" w16cid:durableId="768697088">
     <w:abstractNumId w:val="3"/>
@@ -4112,6 +5343,12 @@
   </w:num>
   <w:num w:numId="7" w16cid:durableId="1562868998">
     <w:abstractNumId w:val="4"/>
+  </w:num>
+  <w:num w:numId="8" w16cid:durableId="144324840">
+    <w:abstractNumId w:val="7"/>
+  </w:num>
+  <w:num w:numId="9" w16cid:durableId="1385519491">
+    <w:abstractNumId w:val="5"/>
   </w:num>
 </w:numbering>
 </file>
@@ -4568,7 +5805,6 @@
     <w:next w:val="Normal"/>
     <w:link w:val="Heading3Char"/>
     <w:uiPriority w:val="9"/>
-    <w:semiHidden/>
     <w:unhideWhenUsed/>
     <w:qFormat/>
     <w:rsid w:val="0053519A"/>
@@ -4775,7 +6011,6 @@
     <w:basedOn w:val="DefaultParagraphFont"/>
     <w:link w:val="Heading3"/>
     <w:uiPriority w:val="9"/>
-    <w:semiHidden/>
     <w:rsid w:val="0053519A"/>
     <w:rPr>
       <w:rFonts w:eastAsiaTheme="majorEastAsia" w:cstheme="majorBidi"/>
@@ -5086,6 +6321,35 @@
         <w:insideV w:val="single" w:sz="4" w:space="0" w:color="auto"/>
       </w:tblBorders>
     </w:tblPr>
+  </w:style>
+  <w:style w:type="paragraph" w:styleId="NormalWeb">
+    <w:name w:val="Normal (Web)"/>
+    <w:basedOn w:val="Normal"/>
+    <w:uiPriority w:val="99"/>
+    <w:semiHidden/>
+    <w:unhideWhenUsed/>
+    <w:rsid w:val="000930BD"/>
+    <w:pPr>
+      <w:spacing w:before="100" w:beforeAutospacing="1" w:after="100" w:afterAutospacing="1" w:line="240" w:lineRule="auto"/>
+    </w:pPr>
+    <w:rPr>
+      <w:rFonts w:ascii="Times New Roman" w:eastAsia="Times New Roman" w:hAnsi="Times New Roman" w:cs="Times New Roman"/>
+      <w:kern w:val="0"/>
+      <w14:ligatures w14:val="none"/>
+    </w:rPr>
+  </w:style>
+  <w:style w:type="character" w:styleId="HTMLCode">
+    <w:name w:val="HTML Code"/>
+    <w:basedOn w:val="DefaultParagraphFont"/>
+    <w:uiPriority w:val="99"/>
+    <w:semiHidden/>
+    <w:unhideWhenUsed/>
+    <w:rsid w:val="000930BD"/>
+    <w:rPr>
+      <w:rFonts w:ascii="Courier New" w:eastAsia="Times New Roman" w:hAnsi="Courier New" w:cs="Courier New"/>
+      <w:sz w:val="20"/>
+      <w:szCs w:val="20"/>
+    </w:rPr>
   </w:style>
 </w:styles>
 </file>

</xml_diff>